<commit_message>
feat: Strategie Beastly v3 — Funnel-Logik + Social Media Tiefe (2026-06-24)
</commit_message>
<xml_diff>
--- a/beastly-investments/strategies/2026-06-24_strategy_beastly-investments.docx
+++ b/beastly-investments/strategies/2026-06-24_strategy_beastly-investments.docx
@@ -183,7 +183,7 @@
           <w:color w:val="333333"/>
           <w:sz w:val="21"/>
         </w:rPr>
-        <w:t>5.  Der Kommunikationsfunnel</w:t>
+        <w:t>5.  Der Kommunikationsfunnel — Logikdiagramm</w:t>
       </w:r>
     </w:p>
     <w:p>
@@ -215,7 +215,135 @@
           <w:color w:val="333333"/>
           <w:sz w:val="21"/>
         </w:rPr>
-        <w:t>7.  Persönliche Einschätzung — Hohe Kommunikationskomplexität</w:t>
+        <w:t xml:space="preserve">    6.1  Logo und Branding</w:t>
+      </w:r>
+    </w:p>
+    <w:p>
+      <w:pPr>
+        <w:pStyle w:val="ListBullet"/>
+        <w:spacing w:after="60"/>
+      </w:pPr>
+      <w:r>
+        <w:rPr>
+          <w:rFonts w:ascii="Calibri" w:hAnsi="Calibri"/>
+          <w:b w:val="0"/>
+          <w:i w:val="0"/>
+          <w:color w:val="333333"/>
+          <w:sz w:val="21"/>
+        </w:rPr>
+        <w:t xml:space="preserve">    6.2  Webseite</w:t>
+      </w:r>
+    </w:p>
+    <w:p>
+      <w:pPr>
+        <w:pStyle w:val="ListBullet"/>
+        <w:spacing w:after="60"/>
+      </w:pPr>
+      <w:r>
+        <w:rPr>
+          <w:rFonts w:ascii="Calibri" w:hAnsi="Calibri"/>
+          <w:b w:val="0"/>
+          <w:i w:val="0"/>
+          <w:color w:val="333333"/>
+          <w:sz w:val="21"/>
+        </w:rPr>
+        <w:t xml:space="preserve">    6.3  Personal Branding — Viktor Ackermann</w:t>
+      </w:r>
+    </w:p>
+    <w:p>
+      <w:pPr>
+        <w:pStyle w:val="ListBullet"/>
+        <w:spacing w:after="60"/>
+      </w:pPr>
+      <w:r>
+        <w:rPr>
+          <w:rFonts w:ascii="Calibri" w:hAnsi="Calibri"/>
+          <w:b w:val="0"/>
+          <w:i w:val="0"/>
+          <w:color w:val="333333"/>
+          <w:sz w:val="21"/>
+        </w:rPr>
+        <w:t xml:space="preserve">    6.4  Kanalstrategie Social Media</w:t>
+      </w:r>
+    </w:p>
+    <w:p>
+      <w:pPr>
+        <w:pStyle w:val="ListBullet"/>
+        <w:spacing w:after="60"/>
+      </w:pPr>
+      <w:r>
+        <w:rPr>
+          <w:rFonts w:ascii="Calibri" w:hAnsi="Calibri"/>
+          <w:b w:val="0"/>
+          <w:i w:val="0"/>
+          <w:color w:val="333333"/>
+          <w:sz w:val="21"/>
+        </w:rPr>
+        <w:t xml:space="preserve">    6.5  Repräsentationsmaterial — Pitch Deck</w:t>
+      </w:r>
+    </w:p>
+    <w:p>
+      <w:pPr>
+        <w:pStyle w:val="ListBullet"/>
+        <w:spacing w:after="60"/>
+      </w:pPr>
+      <w:r>
+        <w:rPr>
+          <w:rFonts w:ascii="Calibri" w:hAnsi="Calibri"/>
+          <w:b w:val="0"/>
+          <w:i w:val="0"/>
+          <w:color w:val="333333"/>
+          <w:sz w:val="21"/>
+        </w:rPr>
+        <w:t xml:space="preserve">    6.6  Partnerschaften — FourGive</w:t>
+      </w:r>
+    </w:p>
+    <w:p>
+      <w:pPr>
+        <w:pStyle w:val="ListBullet"/>
+        <w:spacing w:after="60"/>
+      </w:pPr>
+      <w:r>
+        <w:rPr>
+          <w:rFonts w:ascii="Calibri" w:hAnsi="Calibri"/>
+          <w:b w:val="0"/>
+          <w:i w:val="0"/>
+          <w:color w:val="333333"/>
+          <w:sz w:val="21"/>
+        </w:rPr>
+        <w:t xml:space="preserve">    6.7  Events</w:t>
+      </w:r>
+    </w:p>
+    <w:p>
+      <w:pPr>
+        <w:pStyle w:val="ListBullet"/>
+        <w:spacing w:after="60"/>
+      </w:pPr>
+      <w:r>
+        <w:rPr>
+          <w:rFonts w:ascii="Calibri" w:hAnsi="Calibri"/>
+          <w:b w:val="0"/>
+          <w:i w:val="0"/>
+          <w:color w:val="333333"/>
+          <w:sz w:val="21"/>
+        </w:rPr>
+        <w:t xml:space="preserve">    6.8  Social Media Ads</w:t>
+      </w:r>
+    </w:p>
+    <w:p>
+      <w:pPr>
+        <w:pStyle w:val="ListBullet"/>
+        <w:spacing w:after="60"/>
+      </w:pPr>
+      <w:r>
+        <w:rPr>
+          <w:rFonts w:ascii="Calibri" w:hAnsi="Calibri"/>
+          <w:b w:val="0"/>
+          <w:i w:val="0"/>
+          <w:color w:val="333333"/>
+          <w:sz w:val="21"/>
+        </w:rPr>
+        <w:t>7.  Persönliche Einschätzung</w:t>
       </w:r>
     </w:p>
     <w:p>
@@ -306,37 +434,7 @@
           <w:color w:val="333333"/>
           <w:sz w:val="21"/>
         </w:rPr>
-        <w:t>Beastly Investments ist das erste Investmentprodukt der Chipiron AG, eines Non-Profit Asset Managers im Aufbau. Gründer Viktor und Lydia Ackermann haben die FourGive Tierklinik in Marsa Alam/Ägypten aufgebaut — dort entstand die direkte Konfrontation mit Tierleid, und daraus die Überzeugung, dass Finanzlogik und Tierschutz sich nicht ausschliessen. Das Produkt ist einzigartig: ein KI-gesteuertes Animal Cruelty Free Portfolio, das börsennotierte Unternehmen nach tierschützenden Kriterien bewertet.</w:t>
-      </w:r>
-    </w:p>
-    <w:p>
-      <w:pPr>
-        <w:spacing w:after="140"/>
-      </w:pPr>
-      <w:r>
-        <w:rPr>
-          <w:rFonts w:ascii="Calibri" w:hAnsi="Calibri"/>
-          <w:b w:val="0"/>
-          <w:i w:val="0"/>
-          <w:color w:val="333333"/>
-          <w:sz w:val="21"/>
-        </w:rPr>
-        <w:t>Die Substanz ist stark. Was fehlt, ist die kommunikative Übersetzung dieser Substanz in eine Marke, die Menschen emotional abholt, Vertrauen aufbaut und Investoren rational überzeugt.</w:t>
-      </w:r>
-    </w:p>
-    <w:p>
-      <w:pPr>
-        <w:spacing w:before="240" w:after="80"/>
-      </w:pPr>
-      <w:r>
-        <w:rPr>
-          <w:rFonts w:ascii="Calibri" w:hAnsi="Calibri"/>
-          <w:b/>
-          <w:i w:val="0"/>
-          <w:color w:val="1A1033"/>
-          <w:sz w:val="24"/>
-        </w:rPr>
-        <w:t>Die drei Ebenen — und warum das komplex ist</w:t>
+        <w:t>Beastly Investments ist das erste Investmentprodukt der Chipiron AG, eines Non-Profit Asset Managers im Aufbau. Gründer Viktor und Lydia Ackermann haben die FourGive Tierklinik in Marsa Alam/Ägypten aufgebaut — dort entstand die direkte Konfrontation mit Tierleid, und daraus die Überzeugung, dass Finanzlogik und Tierschutz sich nicht ausschliessen.</w:t>
       </w:r>
     </w:p>
     <w:p>
@@ -367,7 +465,7 @@
           <w:color w:val="333333"/>
           <w:sz w:val="21"/>
         </w:rPr>
-        <w:t xml:space="preserve">Beastly invested  </w:t>
+        <w:t xml:space="preserve">Beastly  </w:t>
       </w:r>
       <w:r>
         <w:rPr>
@@ -403,7 +501,7 @@
           <w:color w:val="333333"/>
           <w:sz w:val="21"/>
         </w:rPr>
-        <w:t>als vertrauensbildender Träger und Asset Manager</w:t>
+        <w:t>als vertrauensbildender Träger und Asset Manager im Hintergrund</w:t>
       </w:r>
     </w:p>
     <w:p>
@@ -434,21 +532,6 @@
     </w:p>
     <w:p>
       <w:pPr>
-        <w:spacing w:after="140"/>
-      </w:pPr>
-      <w:r>
-        <w:rPr>
-          <w:rFonts w:ascii="Calibri" w:hAnsi="Calibri"/>
-          <w:b w:val="0"/>
-          <w:i w:val="0"/>
-          <w:color w:val="333333"/>
-          <w:sz w:val="21"/>
-        </w:rPr>
-        <w:t>Die grösste kommunikative Herausforderung liegt darin, Vertrauen aufzubauen, ohne zu überladen: transparent sein, ohne alles offenzulegen; Wirkung zeigen, ohne falsche Versprechen zu machen; Emotion wecken, ohne aktivistisch zu wirken.</w:t>
-      </w:r>
-    </w:p>
-    <w:p>
-      <w:pPr>
         <w:spacing w:before="240" w:after="80"/>
       </w:pPr>
       <w:r>
@@ -460,21 +543,6 @@
           <w:sz w:val="24"/>
         </w:rPr>
         <w:t>Ausgangsdiskrepanzen aus dem Workshop</w:t>
-      </w:r>
-    </w:p>
-    <w:p>
-      <w:pPr>
-        <w:spacing w:after="140"/>
-      </w:pPr>
-      <w:r>
-        <w:rPr>
-          <w:rFonts w:ascii="Calibri" w:hAnsi="Calibri"/>
-          <w:b w:val="0"/>
-          <w:i w:val="0"/>
-          <w:color w:val="333333"/>
-          <w:sz w:val="21"/>
-        </w:rPr>
-        <w:t>Im Workshop wurden folgende strategische Spannungsfelder sichtbar, die die Kommunikationsstrategie direkt beeinflussen:</w:t>
       </w:r>
     </w:p>
     <w:tbl>
@@ -505,7 +573,7 @@
                 <w:b/>
                 <w:i w:val="0"/>
                 <w:color w:val="A176F4"/>
-                <w:sz w:val="18"/>
+                <w:sz w:val="17"/>
               </w:rPr>
               <w:t xml:space="preserve">DISKREPANZ 1  </w:t>
             </w:r>
@@ -556,7 +624,7 @@
                 <w:b/>
                 <w:i w:val="0"/>
                 <w:color w:val="A176F4"/>
-                <w:sz w:val="18"/>
+                <w:sz w:val="17"/>
               </w:rPr>
               <w:t xml:space="preserve">DISKREPANZ 2  </w:t>
             </w:r>
@@ -568,7 +636,7 @@
                 <w:color w:val="FFFFFF"/>
                 <w:sz w:val="20"/>
               </w:rPr>
-              <w:t>«Non-Profit» ist stark, aber gefährlich missverständlich. Menschen denken sofort an Spende, Charity oder Renditeverzicht.</w:t>
+              <w:t>«Non-Profit» ist gefährlich missverständlich. Menschen denken sofort an Spende, Charity oder Renditeverzicht — das exakte Gegenteil des gewünschten Eindrucks.</w:t>
             </w:r>
           </w:p>
         </w:tc>
@@ -607,7 +675,7 @@
                 <w:b/>
                 <w:i w:val="0"/>
                 <w:color w:val="A176F4"/>
-                <w:sz w:val="18"/>
+                <w:sz w:val="17"/>
               </w:rPr>
               <w:t xml:space="preserve">DISKREPANZ 3  </w:t>
             </w:r>
@@ -619,7 +687,7 @@
                 <w:color w:val="FFFFFF"/>
                 <w:sz w:val="20"/>
               </w:rPr>
-              <w:t>Haltung ohne Aktivismus: Sie wollen nicht aktivistisch wirken — aber die Idee hat Sprengkraft. Diese Linie muss kommunikativ präzise gezogen werden.</w:t>
+              <w:t>Haltung ohne Aktivismus: Sie wollen nicht aktivistisch wirken, brauchen aber trotzdem eine klare Haltung. Eine feine, aber entscheidende Linie.</w:t>
             </w:r>
           </w:p>
         </w:tc>
@@ -658,7 +726,7 @@
                 <w:b/>
                 <w:i w:val="0"/>
                 <w:color w:val="A176F4"/>
-                <w:sz w:val="18"/>
+                <w:sz w:val="17"/>
               </w:rPr>
               <w:t xml:space="preserve">DISKREPANZ 4  </w:t>
             </w:r>
@@ -709,7 +777,7 @@
                 <w:b/>
                 <w:i w:val="0"/>
                 <w:color w:val="A176F4"/>
-                <w:sz w:val="18"/>
+                <w:sz w:val="17"/>
               </w:rPr>
               <w:t xml:space="preserve">DISKREPANZ 5  </w:t>
             </w:r>
@@ -721,7 +789,7 @@
                 <w:color w:val="FFFFFF"/>
                 <w:sz w:val="20"/>
               </w:rPr>
-              <w:t>Die Kommunikationsambition ist deutlich grösser als die aktuelle interne Kapazität. Die Marketingverantwortliche arbeitet 40% — für Branding, Website, LinkedIn, Events, PR, Sales-Materialien, Storytelling.</w:t>
+              <w:t>Kommunikationsambition deutlich grösser als interne Kapazität. Die Marketingverantwortliche arbeitet 40% — zu wenig für Branding, Website, LinkedIn, Events, PR, Sales-Materialien und Storytelling.</w:t>
             </w:r>
           </w:p>
         </w:tc>
@@ -757,21 +825,6 @@
     </w:p>
     <w:p>
       <w:pPr>
-        <w:spacing w:after="140"/>
-      </w:pPr>
-      <w:r>
-        <w:rPr>
-          <w:rFonts w:ascii="Calibri" w:hAnsi="Calibri"/>
-          <w:b w:val="0"/>
-          <w:i w:val="0"/>
-          <w:color w:val="333333"/>
-          <w:sz w:val="21"/>
-        </w:rPr>
-        <w:t>Aus den Diskrepanzen leiten sich drei strategische Positionierungsentscheide ab, die alle weiteren Massnahmen prägen:</w:t>
-      </w:r>
-    </w:p>
-    <w:p>
-      <w:pPr>
         <w:spacing w:before="240" w:after="80"/>
       </w:pPr>
       <w:r>
@@ -797,7 +850,7 @@
           <w:color w:val="333333"/>
           <w:sz w:val="21"/>
         </w:rPr>
-        <w:t>Beastly war immer der emotionale Ausgangspunkt, die Idee. Chipiron entstand, weil kein passender Asset Manager die Philosophie verstanden hätte. Das bedeutet: Chipiron ist strukturelle Notwendigkeit und Glaubwürdigkeitsträger — aber nicht die emotionale Bühne. In der Kommunikation führt Beastly eigenständig, Chipiron erscheint optisch am Rande (Logo, Kleingedrucktes). Diese Entscheidung ist keine Kosmetik, sondern eine fundamentale Markenarchitektur-Frage.</w:t>
+        <w:t>Beastly war immer der emotionale Ausgangspunkt. Chipiron entstand, weil kein passender Asset Manager die Philosophie verstand. Das bedeutet: Chipiron ist strukturelle Notwendigkeit und Glaubwürdigkeitsträger — nicht die emotionale Bühne. Beastly führt eigenständig, Chipiron erscheint optisch am Rande. Diese Entscheidung ist keine Kosmetik, sondern fundamentale Markenarchitektur.</w:t>
       </w:r>
     </w:p>
     <w:p>
@@ -827,7 +880,7 @@
           <w:color w:val="333333"/>
           <w:sz w:val="21"/>
         </w:rPr>
-        <w:t>«Non-Profit Asset Manager» als einfache Selbstbeschreibung ist kommunikativ gefährlich — weil Menschen sofort an Charity, Spende oder Renditeverzicht denken. Das exakte Gegenteil dessen, was Beastly vermitteln will. Die Lösung ist nicht, den Begriff zu meiden, sondern ihn zu erklären:</w:t>
+        <w:t>«Non-Profit Asset Manager» als einfache Selbstbeschreibung ist kommunikativ gefährlich. Die Lösung ist nicht, den Begriff zu meiden, sondern ihn zu erklären:</w:t>
       </w:r>
     </w:p>
     <w:tbl>
@@ -870,7 +923,7 @@
                 <w:b w:val="0"/>
                 <w:i w:val="0"/>
                 <w:color w:val="555555"/>
-                <w:sz w:val="19"/>
+                <w:sz w:val="18"/>
               </w:rPr>
               <w:t>— Kernversprechen Beastly Investments</w:t>
             </w:r>
@@ -885,6 +938,21 @@
     </w:p>
     <w:p>
       <w:pPr>
+        <w:spacing w:before="240" w:after="80"/>
+      </w:pPr>
+      <w:r>
+        <w:rPr>
+          <w:rFonts w:ascii="Calibri" w:hAnsi="Calibri"/>
+          <w:b/>
+          <w:i w:val="0"/>
+          <w:color w:val="1A1033"/>
+          <w:sz w:val="24"/>
+        </w:rPr>
+        <w:t>2.3  Haltung ohne Aktivismus</w:t>
+      </w:r>
+    </w:p>
+    <w:p>
+      <w:pPr>
         <w:spacing w:after="140"/>
       </w:pPr>
       <w:r>
@@ -895,52 +963,7 @@
           <w:color w:val="333333"/>
           <w:sz w:val="21"/>
         </w:rPr>
-        <w:t>Dieser Satz ist wahrscheinlich der wichtigste Satz der gesamten Kommunikation. Er ersetzt das missverständliche «Non-Profit» durch eine klare, dreiteilige Wahrheit.</w:t>
-      </w:r>
-    </w:p>
-    <w:p>
-      <w:pPr>
-        <w:spacing w:before="240" w:after="80"/>
-      </w:pPr>
-      <w:r>
-        <w:rPr>
-          <w:rFonts w:ascii="Calibri" w:hAnsi="Calibri"/>
-          <w:b/>
-          <w:i w:val="0"/>
-          <w:color w:val="1A1033"/>
-          <w:sz w:val="24"/>
-        </w:rPr>
-        <w:t>2.3  Haltung ohne Aktivismus — die feine Linie</w:t>
-      </w:r>
-    </w:p>
-    <w:p>
-      <w:pPr>
-        <w:spacing w:after="140"/>
-      </w:pPr>
-      <w:r>
-        <w:rPr>
-          <w:rFonts w:ascii="Calibri" w:hAnsi="Calibri"/>
-          <w:b w:val="0"/>
-          <w:i w:val="0"/>
-          <w:color w:val="333333"/>
-          <w:sz w:val="21"/>
-        </w:rPr>
-        <w:t>Beastly ist objektiv eine Provokation für den Finanzmarkt: Tierschutz im ESG-Bereich fehlt praktisch. Das Produkt ist eine Nische, die niemand erwartet. Gleichzeitig grenzen sich Viktor und Lydia klar ab von Greenpeace, PETA, Erziehung, Aktivismus. Diese Linie muss in jeder Botschaft gehalten werden: Wenn man zu brav kommuniziert, verliert Beastly die Kraft. Wenn man zu stark moralisiert, widerspricht es dem Selbstbild.</w:t>
-      </w:r>
-    </w:p>
-    <w:p>
-      <w:pPr>
-        <w:spacing w:after="140"/>
-      </w:pPr>
-      <w:r>
-        <w:rPr>
-          <w:rFonts w:ascii="Calibri" w:hAnsi="Calibri"/>
-          <w:b w:val="0"/>
-          <w:i w:val="0"/>
-          <w:color w:val="333333"/>
-          <w:sz w:val="21"/>
-        </w:rPr>
-        <w:t>Die Kommunikationsrichtung ist daher:</w:t>
+        <w:t>Das Produkt ist objektiv eine Provokation für den Finanzmarkt: Tierschutz fehlt im ESG-Bereich praktisch. Gleichzeitig grenzen sich Viktor und Lydia klar ab von Aktivismus. Zu brav = Kraft verloren. Zu moralisch = widerspricht dem Selbstbild.</w:t>
       </w:r>
     </w:p>
     <w:p>
@@ -1028,21 +1051,6 @@
           <w:sz w:val="32"/>
         </w:rPr>
         <w:t>3.  Die Zielgruppen</w:t>
-      </w:r>
-    </w:p>
-    <w:p>
-      <w:pPr>
-        <w:spacing w:after="140"/>
-      </w:pPr>
-      <w:r>
-        <w:rPr>
-          <w:rFonts w:ascii="Calibri" w:hAnsi="Calibri"/>
-          <w:b w:val="0"/>
-          <w:i w:val="0"/>
-          <w:color w:val="333333"/>
-          <w:sz w:val="21"/>
-        </w:rPr>
-        <w:t>Die ursprüngliche Annahme — Retail-Investoren sind emotional getrieben, professionelle Investoren sind rational getrieben — ist zu einfach und stimmt nicht. Viktor selbst hat das im Workshop korrigiert: Auch grosse Investoren kommen nur, wenn sie eine echte Affinität zum Tierwohl haben. Performance ist wichtig, aber die Grundmotivation ist bei beiden Gruppen nicht grundsätzlich verschieden.</w:t>
       </w:r>
     </w:p>
     <w:tbl>
@@ -1085,7 +1093,7 @@
                 <w:b w:val="0"/>
                 <w:i w:val="0"/>
                 <w:color w:val="555555"/>
-                <w:sz w:val="19"/>
+                <w:sz w:val="18"/>
               </w:rPr>
               <w:t>— Gedanken aus dem Workshop</w:t>
             </w:r>
@@ -1097,21 +1105,6 @@
       <w:pPr>
         <w:spacing w:after="80"/>
       </w:pPr>
-    </w:p>
-    <w:p>
-      <w:pPr>
-        <w:spacing w:after="140"/>
-      </w:pPr>
-      <w:r>
-        <w:rPr>
-          <w:rFonts w:ascii="Calibri" w:hAnsi="Calibri"/>
-          <w:b w:val="0"/>
-          <w:i w:val="0"/>
-          <w:color w:val="333333"/>
-          <w:sz w:val="21"/>
-        </w:rPr>
-        <w:t>Die echte Unterscheidung liegt in der Entscheidungslogik:</w:t>
-      </w:r>
     </w:p>
     <w:p>
       <w:pPr>
@@ -1157,7 +1150,7 @@
           <w:color w:val="333333"/>
           <w:sz w:val="21"/>
         </w:rPr>
-        <w:t>Vertrauen über Menschen und Geschichten</w:t>
+        <w:t>Motivation: Tierwohl, positive Wirkung, Identifikation</w:t>
       </w:r>
     </w:p>
     <w:p>
@@ -1173,7 +1166,7 @@
           <w:color w:val="333333"/>
           <w:sz w:val="21"/>
         </w:rPr>
-        <w:t>Motivation: Tierwohl, positive Wirkung, Identifikation</w:t>
+        <w:t>Vertrauen über Menschen und Geschichten</w:t>
       </w:r>
     </w:p>
     <w:p>
@@ -1204,7 +1197,7 @@
           <w:color w:val="333333"/>
           <w:sz w:val="21"/>
         </w:rPr>
-        <w:t>Gleiche emotionale Grundmotivation — aber stärkere Prüfung von Struktur, Risiko, Track Record, Governance, Reporting</w:t>
+        <w:t>Gleiche emotionale Grundmotivation — aber stärkere Prüfung nötig</w:t>
       </w:r>
     </w:p>
     <w:p>
@@ -1220,7 +1213,7 @@
           <w:color w:val="333333"/>
           <w:sz w:val="21"/>
         </w:rPr>
-        <w:t>Brauchen zusätzlich: regulatorische Sicherheit, Performance-Logik, Chipiron als glaubwürdigen Asset Manager</w:t>
+        <w:t>Brauchen: Struktur, Risiko, Track Record, Governance, regulatorische Sicherheit, Reporting</w:t>
       </w:r>
     </w:p>
     <w:p>
@@ -1251,23 +1244,7 @@
           <w:color w:val="333333"/>
           <w:sz w:val="21"/>
         </w:rPr>
-        <w:t>Für beide gilt dieselbe Entscheidungslogik — nur in unterschiedlicher Tiefe:</w:t>
-      </w:r>
-    </w:p>
-    <w:p>
-      <w:pPr>
-        <w:pStyle w:val="ListBullet"/>
-        <w:spacing w:after="60"/>
-      </w:pPr>
-      <w:r>
-        <w:rPr>
-          <w:rFonts w:ascii="Calibri" w:hAnsi="Calibri"/>
-          <w:b w:val="0"/>
-          <w:i w:val="0"/>
-          <w:color w:val="333333"/>
-          <w:sz w:val="21"/>
-        </w:rPr>
-        <w:t>Emotion → Vertrauen → Performance → Investmententscheidung</w:t>
+        <w:t>Für beide gilt dieselbe Entscheidungslogik: Emotion → Vertrauen → Performance → Investmententscheidung.</w:t>
       </w:r>
     </w:p>
     <w:p>
@@ -1295,21 +1272,6 @@
     </w:p>
     <w:p>
       <w:pPr>
-        <w:spacing w:after="140"/>
-      </w:pPr>
-      <w:r>
-        <w:rPr>
-          <w:rFonts w:ascii="Calibri" w:hAnsi="Calibri"/>
-          <w:b w:val="0"/>
-          <w:i w:val="0"/>
-          <w:color w:val="333333"/>
-          <w:sz w:val="21"/>
-        </w:rPr>
-        <w:t>Hinter jeder strategischen Entscheidung in diesem Konzept steht ein klares Warum. Diese Begründungsebene ist entscheidend, um Massnahmen nicht nur auszuführen, sondern zu verstehen und laufend zu justieren.</w:t>
-      </w:r>
-    </w:p>
-    <w:p>
-      <w:pPr>
         <w:spacing w:before="240" w:after="80"/>
       </w:pPr>
       <w:r>
@@ -1335,7 +1297,7 @@
           <w:color w:val="333333"/>
           <w:sz w:val="21"/>
         </w:rPr>
-        <w:t>«Vertrauen entsteht über Menschen, Bilder, Momente und Nahbarkeit.» Geld + Tierschutz + neuartiges Produkt ist eine aussergewöhnlich hohe Vertrauenshürde. Ohne Viktor und Lydia als menschliche Träger wird Beastly zu abstrakt — ein Fonds ohne Gesicht, eine Idee ohne Verwurzelung. Sie müssen nicht zu Influencern werden. Aber sie müssen als glaubwürdige Träger sichtbar sein.</w:t>
+        <w:t>«Vertrauen entsteht über Menschen, Bilder, Momente und Nahbarkeit.» Geld + Tierschutz + neuartiges Produkt ist eine aussergewöhnlich hohe Vertrauenshürde. Ohne Viktor und Lydia als menschliche Träger wird Beastly zu abstrakt — ein Fonds ohne Gesicht, eine Idee ohne Verwurzelung.</w:t>
       </w:r>
     </w:p>
     <w:p>
@@ -1365,7 +1327,7 @@
           <w:color w:val="333333"/>
           <w:sz w:val="21"/>
         </w:rPr>
-        <w:t>Beastly hat etwas, das kein anderer Asset Manager hat: gecappte Löhne, kein Bonus-System, öffentlich ausgewiesene Vergütungen, und sämtliche Gewinne fliessen in Tierschutzprojekte. Diese Fakten sind kommunikativ Gold — aber nur, wenn sie direkt sichtbar sind, nicht im Kleingedruckten. Transparenz ist hier kein ethisches Gebot, sondern ein Differenzierungshebel.</w:t>
+        <w:t>Beastly hat etwas, das kein anderer Asset Manager hat: gecappte Löhne, kein Bonus-System, öffentlich ausgewiesene Vergütungen, sämtliche Gewinne in Tierschutzprojekte. Diese Fakten sind kommunikativ Gold — aber nur wenn sie direkt sichtbar sind, nicht im Kleingedruckten. Transparenz ist hier kein ethisches Gebot, sondern ein Differenzierungshebel.</w:t>
       </w:r>
     </w:p>
     <w:p>
@@ -1381,21 +1343,6 @@
           <w:sz w:val="24"/>
         </w:rPr>
         <w:t>Warum dosieren statt alles auf einmal?</w:t>
-      </w:r>
-    </w:p>
-    <w:p>
-      <w:pPr>
-        <w:spacing w:after="140"/>
-      </w:pPr>
-      <w:r>
-        <w:rPr>
-          <w:rFonts w:ascii="Calibri" w:hAnsi="Calibri"/>
-          <w:b w:val="0"/>
-          <w:i w:val="0"/>
-          <w:color w:val="333333"/>
-          <w:sz w:val="21"/>
-        </w:rPr>
-        <w:t>Das Produkt ist komplex: AMC, Non-Profit-Logik, Management Fees, Tierschutzprojekte, Chipiron, Beastly, FourGive, KI-Screening, Retail und institutionelle Investoren. Wer das alles von Anfang an erklären will, verliert Menschen.</w:t>
       </w:r>
     </w:p>
     <w:tbl>
@@ -1438,7 +1385,7 @@
                 <w:b w:val="0"/>
                 <w:i w:val="0"/>
                 <w:color w:val="555555"/>
-                <w:sz w:val="19"/>
+                <w:sz w:val="18"/>
               </w:rPr>
               <w:t>— Gedanken aus dem Workshop</w:t>
             </w:r>
@@ -1463,7 +1410,7 @@
           <w:color w:val="333333"/>
           <w:sz w:val="21"/>
         </w:rPr>
-        <w:t>Deshalb folgt die gesamte Kommunikation einem klar gestuften Funnel-Prinzip: zuerst Aufmerksamkeit, dann Neugier, dann Vertrauen, dann Erklärung, dann erst Entscheidung. Keine Stufe wird übersprungen.</w:t>
+        <w:t>Das Produkt ist komplex: AMC, Non-Profit-Logik, Management Fees, Tierschutzprojekte, Chipiron, Beastly, FourGive, KI-Screening, Retail und institutionelle Investoren. Wer das alles von Anfang an erklären will, verliert Menschen. Deshalb folgt die Kommunikation einem gestuften Funnel-Prinzip.</w:t>
       </w:r>
     </w:p>
     <w:p>
@@ -1483,21 +1430,6 @@
     </w:p>
     <w:p>
       <w:pPr>
-        <w:spacing w:after="140"/>
-      </w:pPr>
-      <w:r>
-        <w:rPr>
-          <w:rFonts w:ascii="Calibri" w:hAnsi="Calibri"/>
-          <w:b w:val="0"/>
-          <w:i w:val="0"/>
-          <w:color w:val="333333"/>
-          <w:sz w:val="21"/>
-        </w:rPr>
-        <w:t>Die Spannung zwischen starken Tieren (Raubtier, Stärke, Durchsetzungskraft) und schützenswerten Tieren (Laborhase, Beagle, Tiere aus der Klinik) ist keine Inkonsistenz — sie ist ein kommunikatives System:</w:t>
-      </w:r>
-    </w:p>
-    <w:p>
-      <w:pPr>
         <w:pStyle w:val="ListBullet"/>
         <w:spacing w:after="60"/>
       </w:pPr>
@@ -1509,7 +1441,7 @@
           <w:color w:val="333333"/>
           <w:sz w:val="21"/>
         </w:rPr>
-        <w:t xml:space="preserve">Starke Tiere / Raubtier-Codes →  </w:t>
+        <w:t xml:space="preserve">Starke Tiere / Raubtier-Codes  →  </w:t>
       </w:r>
       <w:r>
         <w:rPr>
@@ -1535,7 +1467,7 @@
           <w:color w:val="333333"/>
           <w:sz w:val="21"/>
         </w:rPr>
-        <w:t xml:space="preserve">Schützenswerte Tiere / reale Geschichten →  </w:t>
+        <w:t xml:space="preserve">Schützenswerte Tiere / reale Geschichten  →  </w:t>
       </w:r>
       <w:r>
         <w:rPr>
@@ -1560,7 +1492,7 @@
           <w:color w:val="333333"/>
           <w:sz w:val="21"/>
         </w:rPr>
-        <w:t>Beide Welten werden immer zusammen kommuniziert — nie isoliert. Das verbindet die Investment- mit der Wirkungsebene und spricht beide Zielgruppen gleichzeitig an.</w:t>
+        <w:t>Beide Welten werden immer zusammen kommuniziert — nie isoliert. Das verbindet die Investment- mit der Wirkungsebene.</w:t>
       </w:r>
     </w:p>
     <w:p>
@@ -1570,6 +1502,11 @@
           <w:bottom w:val="single" w:sz="4" w:space="1" w:color="a176f4"/>
         </w:pBdr>
       </w:pPr>
+    </w:p>
+    <w:p>
+      <w:r>
+        <w:br w:type="page"/>
+      </w:r>
     </w:p>
     <w:p>
       <w:pPr>
@@ -1583,7 +1520,7 @@
           <w:color w:val="4B319B"/>
           <w:sz w:val="32"/>
         </w:rPr>
-        <w:t>5.  Der Kommunikationsfunnel</w:t>
+        <w:t>5.  Der Kommunikationsfunnel — Logikdiagramm</w:t>
       </w:r>
     </w:p>
     <w:p>
@@ -1598,12 +1535,12 @@
           <w:color w:val="333333"/>
           <w:sz w:val="21"/>
         </w:rPr>
-        <w:t>Der Funnel bildet ab, wie eine Person schrittweise von der ersten Berührung mit Beastly zur Investmententscheidung geführt wird. Jede Stufe hat andere Kanäle, andere Botschaften und ein anderes Ziel. Die Kommunikation dosiert — nicht alles auf einmal.</w:t>
+        <w:t>Das Diagramm zeigt, wie eine Person schrittweise von der ersten Berührung mit Beastly zur Investmententscheidung geführt wird. Jede Stufe hat aktive Kanäle, spezifische Berührungspunkte und eine Entscheidungssituation: Wer nicht weiter engagiert wird, bleibt in der Orbit der Kommunikation (Re-Engage). Wer weiter geht, tritt in die nächste Stufe ein.</w:t>
       </w:r>
     </w:p>
     <w:p>
       <w:pPr>
-        <w:spacing w:after="80"/>
+        <w:spacing w:after="120"/>
       </w:pPr>
     </w:p>
     <w:tbl>
@@ -1619,7 +1556,7 @@
       <w:tr>
         <w:tc>
           <w:tcPr>
-            <w:tcW w:type="dxa" w:w="720"/>
+            <w:tcW w:type="dxa" w:w="648"/>
             <w:shd w:val="clear" w:color="auto" w:fill="142233"/>
             <w:tcMar>
               <w:top w:w="80" w:type="dxa"/>
@@ -1636,8 +1573,9 @@
               <w:rPr>
                 <w:rFonts w:ascii="Calibri" w:hAnsi="Calibri"/>
                 <w:b/>
+                <w:i w:val="0"/>
                 <w:color w:val="FFFFFF"/>
-                <w:sz w:val="40"/>
+                <w:sz w:val="36"/>
               </w:rPr>
               <w:t>01</w:t>
             </w:r>
@@ -1655,17 +1593,160 @@
             </w:tcMar>
           </w:tcPr>
           <w:p>
-            <w:pPr>
-              <w:jc w:val="left"/>
-            </w:pPr>
             <w:r>
               <w:rPr>
                 <w:rFonts w:ascii="Calibri" w:hAnsi="Calibri"/>
                 <w:b/>
+                <w:i w:val="0"/>
                 <w:color w:val="FFFFFF"/>
-                <w:sz w:val="26"/>
+                <w:sz w:val="24"/>
               </w:rPr>
               <w:t>AUFMERKSAMKEIT</w:t>
+            </w:r>
+          </w:p>
+        </w:tc>
+      </w:tr>
+    </w:tbl>
+    <w:tbl>
+      <w:tblPr>
+        <w:tblStyle w:val="TableGrid"/>
+        <w:tblW w:type="auto" w:w="0"/>
+        <w:tblLook w:firstColumn="1" w:firstRow="1" w:lastColumn="0" w:lastRow="0" w:noHBand="0" w:noVBand="1" w:val="04A0"/>
+      </w:tblPr>
+      <w:tblGrid>
+        <w:gridCol w:w="4306"/>
+        <w:gridCol w:w="4306"/>
+      </w:tblGrid>
+      <w:tr>
+        <w:tc>
+          <w:tcPr>
+            <w:tcW w:type="dxa" w:w="4306"/>
+            <w:shd w:val="clear" w:color="auto" w:fill="F5F3FF"/>
+            <w:tcMar>
+              <w:top w:w="90" w:type="dxa"/>
+              <w:bottom w:w="90" w:type="dxa"/>
+              <w:left w:w="100" w:type="dxa"/>
+              <w:right w:w="100" w:type="dxa"/>
+            </w:tcMar>
+          </w:tcPr>
+          <w:p>
+            <w:r>
+              <w:rPr>
+                <w:rFonts w:ascii="Calibri" w:hAnsi="Calibri"/>
+                <w:b/>
+                <w:i w:val="0"/>
+                <w:color w:val="4B319B"/>
+                <w:sz w:val="16"/>
+              </w:rPr>
+              <w:t>AKTIVE KANÄLE</w:t>
+            </w:r>
+          </w:p>
+          <w:p>
+            <w:r>
+              <w:rPr>
+                <w:rFonts w:ascii="Calibri" w:hAnsi="Calibri"/>
+                <w:b w:val="0"/>
+                <w:i w:val="0"/>
+                <w:color w:val="333333"/>
+                <w:sz w:val="18"/>
+              </w:rPr>
+              <w:t>→  Viktor Ackermann LinkedIn (persönliches Profil)</w:t>
+            </w:r>
+          </w:p>
+          <w:p>
+            <w:r>
+              <w:rPr>
+                <w:rFonts w:ascii="Calibri" w:hAnsi="Calibri"/>
+                <w:b w:val="0"/>
+                <w:i w:val="0"/>
+                <w:color w:val="333333"/>
+                <w:sz w:val="18"/>
+              </w:rPr>
+              <w:t>→  Beastly Social Media — LinkedIn Markenkanal</w:t>
+            </w:r>
+          </w:p>
+          <w:p>
+            <w:r>
+              <w:rPr>
+                <w:rFonts w:ascii="Calibri" w:hAnsi="Calibri"/>
+                <w:b w:val="0"/>
+                <w:i w:val="0"/>
+                <w:color w:val="333333"/>
+                <w:sz w:val="18"/>
+              </w:rPr>
+              <w:t>→  Paid Awareness-Ads (LinkedIn / Meta)</w:t>
+            </w:r>
+          </w:p>
+        </w:tc>
+        <w:tc>
+          <w:tcPr>
+            <w:tcW w:type="dxa" w:w="4306"/>
+            <w:shd w:val="clear" w:color="auto" w:fill="F5F3FF"/>
+            <w:tcMar>
+              <w:top w:w="90" w:type="dxa"/>
+              <w:bottom w:w="90" w:type="dxa"/>
+              <w:left w:w="100" w:type="dxa"/>
+              <w:right w:w="100" w:type="dxa"/>
+            </w:tcMar>
+          </w:tcPr>
+          <w:p>
+            <w:r>
+              <w:rPr>
+                <w:rFonts w:ascii="Calibri" w:hAnsi="Calibri"/>
+                <w:b/>
+                <w:i w:val="0"/>
+                <w:color w:val="4B319B"/>
+                <w:sz w:val="16"/>
+              </w:rPr>
+              <w:t>BERÜHRUNGSPUNKTE</w:t>
+            </w:r>
+          </w:p>
+          <w:p>
+            <w:r>
+              <w:rPr>
+                <w:rFonts w:ascii="Calibri" w:hAnsi="Calibri"/>
+                <w:b w:val="0"/>
+                <w:i w:val="0"/>
+                <w:color w:val="333333"/>
+                <w:sz w:val="18"/>
+              </w:rPr>
+              <w:t>→  Beitrag oder Reel gesehen</w:t>
+            </w:r>
+          </w:p>
+          <w:p>
+            <w:r>
+              <w:rPr>
+                <w:rFonts w:ascii="Calibri" w:hAnsi="Calibri"/>
+                <w:b w:val="0"/>
+                <w:i w:val="0"/>
+                <w:color w:val="333333"/>
+                <w:sz w:val="18"/>
+              </w:rPr>
+              <w:t>→  Ad im Feed ausgespielt</w:t>
+            </w:r>
+          </w:p>
+          <w:p>
+            <w:r>
+              <w:rPr>
+                <w:rFonts w:ascii="Calibri" w:hAnsi="Calibri"/>
+                <w:b w:val="0"/>
+                <w:i w:val="0"/>
+                <w:color w:val="333333"/>
+                <w:sz w:val="18"/>
+              </w:rPr>
+              <w:t>→  Viktors Profil entdeckt</w:t>
+            </w:r>
+          </w:p>
+          <w:p>
+            <w:r>
+              <w:rPr>
+                <w:rFonts w:ascii="Calibri" w:hAnsi="Calibri"/>
+                <w:b w:val="0"/>
+                <w:i w:val="0"/>
+                <w:color w:val="333333"/>
+                <w:sz w:val="18"/>
+              </w:rPr>
+              <w:t>→  Beastly-Seite angeklickt</w:t>
             </w:r>
           </w:p>
         </w:tc>
@@ -1686,10 +1767,10 @@
         <w:tc>
           <w:tcPr>
             <w:tcW w:type="dxa" w:w="2871"/>
-            <w:shd w:val="clear" w:color="auto" w:fill="F7F3FF"/>
+            <w:shd w:val="clear" w:color="auto" w:fill="FEF3EE"/>
             <w:tcMar>
-              <w:top w:w="90" w:type="dxa"/>
-              <w:bottom w:w="90" w:type="dxa"/>
+              <w:top w:w="80" w:type="dxa"/>
+              <w:bottom w:w="80" w:type="dxa"/>
               <w:left w:w="100" w:type="dxa"/>
               <w:right w:w="100" w:type="dxa"/>
             </w:tcMar>
@@ -1699,34 +1780,70 @@
               <w:rPr>
                 <w:rFonts w:ascii="Calibri" w:hAnsi="Calibri"/>
                 <w:b/>
-                <w:color w:val="4B319B"/>
+                <w:i w:val="0"/>
+                <w:color w:val="BD5435"/>
                 <w:sz w:val="16"/>
               </w:rPr>
-              <w:t>KANÄLE</w:t>
+              <w:t>KEIN ENGAGEMENT</w:t>
+            </w:r>
+            <w:r>
+              <w:rPr>
+                <w:rFonts w:ascii="Calibri" w:hAnsi="Calibri"/>
+                <w:b w:val="0"/>
+                <w:i w:val="0"/>
+                <w:color w:val="333333"/>
+                <w:sz w:val="18"/>
+              </w:rPr>
+              <w:t xml:space="preserve">  →  </w:t>
             </w:r>
           </w:p>
           <w:p>
             <w:r>
               <w:rPr>
                 <w:rFonts w:ascii="Calibri" w:hAnsi="Calibri"/>
-                <w:color w:val="333333"/>
+                <w:b w:val="0"/>
+                <w:i w:val="0"/>
+                <w:color w:val="8B3A20"/>
                 <w:sz w:val="18"/>
               </w:rPr>
-              <w:t>→ Viktor Ackermann — LinkedIn (persönliches Profil)</w:t>
-              <w:br/>
-              <w:t>→ Beastly — Social Media Posting (Markenkanal)</w:t>
-              <w:br/>
-              <w:t>→ Paid Awareness-Ads — LinkedIn &amp; Meta</w:t>
+              <w:t>Bleibt im Orbit → nächster Post, nächste Ad, nächste Begegnung. Retargeting aktiv.</w:t>
+            </w:r>
+          </w:p>
+        </w:tc>
+        <w:tc>
+          <w:tcPr>
+            <w:tcW w:type="dxa" w:w="720"/>
+            <w:shd w:val="clear" w:color="auto" w:fill="FFFFFF"/>
+            <w:tcMar>
+              <w:top w:w="80" w:type="dxa"/>
+              <w:bottom w:w="80" w:type="dxa"/>
+              <w:left w:w="80" w:type="dxa"/>
+              <w:right w:w="80" w:type="dxa"/>
+            </w:tcMar>
+          </w:tcPr>
+          <w:p>
+            <w:pPr>
+              <w:jc w:val="center"/>
+            </w:pPr>
+            <w:r>
+              <w:rPr>
+                <w:rFonts w:ascii="Calibri" w:hAnsi="Calibri"/>
+                <w:b w:val="0"/>
+                <w:i w:val="0"/>
+                <w:color w:val="A176F4"/>
+                <w:sz w:val="32"/>
+              </w:rPr>
+              <w:t>▼</w:t>
             </w:r>
           </w:p>
         </w:tc>
         <w:tc>
           <w:tcPr>
             <w:tcW w:type="dxa" w:w="2871"/>
-            <w:shd w:val="clear" w:color="auto" w:fill="F7F3FF"/>
+            <w:shd w:val="clear" w:color="auto" w:fill="EDF7EE"/>
             <w:tcMar>
-              <w:top w:w="90" w:type="dxa"/>
-              <w:bottom w:w="90" w:type="dxa"/>
+              <w:top w:w="80" w:type="dxa"/>
+              <w:bottom w:w="80" w:type="dxa"/>
               <w:left w:w="100" w:type="dxa"/>
               <w:right w:w="100" w:type="dxa"/>
             </w:tcMar>
@@ -1736,56 +1853,33 @@
               <w:rPr>
                 <w:rFonts w:ascii="Calibri" w:hAnsi="Calibri"/>
                 <w:b/>
-                <w:color w:val="4B319B"/>
+                <w:i w:val="0"/>
+                <w:color w:val="1A5C38"/>
                 <w:sz w:val="16"/>
               </w:rPr>
-              <w:t>BOTSCHAFT</w:t>
+              <w:t>ENGAGEMENT</w:t>
+            </w:r>
+            <w:r>
+              <w:rPr>
+                <w:rFonts w:ascii="Calibri" w:hAnsi="Calibri"/>
+                <w:b w:val="0"/>
+                <w:i w:val="0"/>
+                <w:color w:val="333333"/>
+                <w:sz w:val="18"/>
+              </w:rPr>
+              <w:t xml:space="preserve">  →  </w:t>
             </w:r>
           </w:p>
           <w:p>
             <w:r>
               <w:rPr>
                 <w:rFonts w:ascii="Calibri" w:hAnsi="Calibri"/>
-                <w:color w:val="333333"/>
+                <w:b w:val="0"/>
+                <w:i w:val="0"/>
+                <w:color w:val="1A5C38"/>
                 <w:sz w:val="18"/>
               </w:rPr>
-              <w:t>«Tierschutz und Rendite schliessen sich nicht aus.»  /  «Gutes tun ohne Verzicht.»  /  «Der einzige Asset Manager, der seine Löhne zeigt.»</w:t>
-            </w:r>
-          </w:p>
-        </w:tc>
-        <w:tc>
-          <w:tcPr>
-            <w:tcW w:type="dxa" w:w="2871"/>
-            <w:shd w:val="clear" w:color="auto" w:fill="F7F3FF"/>
-            <w:tcMar>
-              <w:top w:w="90" w:type="dxa"/>
-              <w:bottom w:w="90" w:type="dxa"/>
-              <w:left w:w="100" w:type="dxa"/>
-              <w:right w:w="100" w:type="dxa"/>
-            </w:tcMar>
-          </w:tcPr>
-          <w:p>
-            <w:r>
-              <w:rPr>
-                <w:rFonts w:ascii="Calibri" w:hAnsi="Calibri"/>
-                <w:b/>
-                <w:color w:val="4B319B"/>
-                <w:sz w:val="16"/>
-              </w:rPr>
-              <w:t>ZUR NÄCHSTEN STUFE</w:t>
-            </w:r>
-          </w:p>
-          <w:p>
-            <w:r>
-              <w:rPr>
-                <w:rFonts w:ascii="Calibri" w:hAnsi="Calibri"/>
-                <w:color w:val="333333"/>
-                <w:sz w:val="18"/>
-              </w:rPr>
-              <w:t>Ziel: Erste Berührung. Hook erzeugen. Nicht erklären — neugierig machen.</w:t>
-              <w:br/>
-              <w:br/>
-              <w:t>Wer kommt weiter? Alle, die emotional berührt werden oder die Idee spannend finden.</w:t>
+              <w:t>Klickt, folgt, kommentiert, teilt → zeigt erstes aktives Interesse.</w:t>
             </w:r>
           </w:p>
         </w:tc>
@@ -1799,6 +1893,8 @@
       <w:r>
         <w:rPr>
           <w:rFonts w:ascii="Calibri" w:hAnsi="Calibri"/>
+          <w:b w:val="0"/>
+          <w:i w:val="0"/>
           <w:color w:val="A176F4"/>
           <w:sz w:val="28"/>
         </w:rPr>
@@ -1818,7 +1914,7 @@
       <w:tr>
         <w:tc>
           <w:tcPr>
-            <w:tcW w:type="dxa" w:w="720"/>
+            <w:tcW w:type="dxa" w:w="648"/>
             <w:shd w:val="clear" w:color="auto" w:fill="1e3350"/>
             <w:tcMar>
               <w:top w:w="80" w:type="dxa"/>
@@ -1835,8 +1931,9 @@
               <w:rPr>
                 <w:rFonts w:ascii="Calibri" w:hAnsi="Calibri"/>
                 <w:b/>
+                <w:i w:val="0"/>
                 <w:color w:val="FFFFFF"/>
-                <w:sz w:val="40"/>
+                <w:sz w:val="36"/>
               </w:rPr>
               <w:t>02</w:t>
             </w:r>
@@ -1854,17 +1951,160 @@
             </w:tcMar>
           </w:tcPr>
           <w:p>
-            <w:pPr>
-              <w:jc w:val="left"/>
-            </w:pPr>
             <w:r>
               <w:rPr>
                 <w:rFonts w:ascii="Calibri" w:hAnsi="Calibri"/>
                 <w:b/>
+                <w:i w:val="0"/>
                 <w:color w:val="FFFFFF"/>
-                <w:sz w:val="26"/>
+                <w:sz w:val="24"/>
               </w:rPr>
               <w:t>NEUGIER</w:t>
+            </w:r>
+          </w:p>
+        </w:tc>
+      </w:tr>
+    </w:tbl>
+    <w:tbl>
+      <w:tblPr>
+        <w:tblStyle w:val="TableGrid"/>
+        <w:tblW w:type="auto" w:w="0"/>
+        <w:tblLook w:firstColumn="1" w:firstRow="1" w:lastColumn="0" w:lastRow="0" w:noHBand="0" w:noVBand="1" w:val="04A0"/>
+      </w:tblPr>
+      <w:tblGrid>
+        <w:gridCol w:w="4306"/>
+        <w:gridCol w:w="4306"/>
+      </w:tblGrid>
+      <w:tr>
+        <w:tc>
+          <w:tcPr>
+            <w:tcW w:type="dxa" w:w="4306"/>
+            <w:shd w:val="clear" w:color="auto" w:fill="EEF4FF"/>
+            <w:tcMar>
+              <w:top w:w="90" w:type="dxa"/>
+              <w:bottom w:w="90" w:type="dxa"/>
+              <w:left w:w="100" w:type="dxa"/>
+              <w:right w:w="100" w:type="dxa"/>
+            </w:tcMar>
+          </w:tcPr>
+          <w:p>
+            <w:r>
+              <w:rPr>
+                <w:rFonts w:ascii="Calibri" w:hAnsi="Calibri"/>
+                <w:b/>
+                <w:i w:val="0"/>
+                <w:color w:val="4B319B"/>
+                <w:sz w:val="16"/>
+              </w:rPr>
+              <w:t>AKTIVE KANÄLE</w:t>
+            </w:r>
+          </w:p>
+          <w:p>
+            <w:r>
+              <w:rPr>
+                <w:rFonts w:ascii="Calibri" w:hAnsi="Calibri"/>
+                <w:b w:val="0"/>
+                <w:i w:val="0"/>
+                <w:color w:val="333333"/>
+                <w:sz w:val="18"/>
+              </w:rPr>
+              <w:t>→  Viktor LinkedIn — Story-Content, Gründerhintergrund</w:t>
+            </w:r>
+          </w:p>
+          <w:p>
+            <w:r>
+              <w:rPr>
+                <w:rFonts w:ascii="Calibri" w:hAnsi="Calibri"/>
+                <w:b w:val="0"/>
+                <w:i w:val="0"/>
+                <w:color w:val="333333"/>
+                <w:sz w:val="18"/>
+              </w:rPr>
+              <w:t>→  Beastly Social Media — Dual-Bildwelt, Werte-Posts</w:t>
+            </w:r>
+          </w:p>
+          <w:p>
+            <w:r>
+              <w:rPr>
+                <w:rFonts w:ascii="Calibri" w:hAnsi="Calibri"/>
+                <w:b w:val="0"/>
+                <w:i w:val="0"/>
+                <w:color w:val="333333"/>
+                <w:sz w:val="18"/>
+              </w:rPr>
+              <w:t>→  Website — Einstiegsseite (Gründerstory, Was ist Beastly?)</w:t>
+            </w:r>
+          </w:p>
+        </w:tc>
+        <w:tc>
+          <w:tcPr>
+            <w:tcW w:type="dxa" w:w="4306"/>
+            <w:shd w:val="clear" w:color="auto" w:fill="EEF4FF"/>
+            <w:tcMar>
+              <w:top w:w="90" w:type="dxa"/>
+              <w:bottom w:w="90" w:type="dxa"/>
+              <w:left w:w="100" w:type="dxa"/>
+              <w:right w:w="100" w:type="dxa"/>
+            </w:tcMar>
+          </w:tcPr>
+          <w:p>
+            <w:r>
+              <w:rPr>
+                <w:rFonts w:ascii="Calibri" w:hAnsi="Calibri"/>
+                <w:b/>
+                <w:i w:val="0"/>
+                <w:color w:val="4B319B"/>
+                <w:sz w:val="16"/>
+              </w:rPr>
+              <w:t>BERÜHRUNGSPUNKTE</w:t>
+            </w:r>
+          </w:p>
+          <w:p>
+            <w:r>
+              <w:rPr>
+                <w:rFonts w:ascii="Calibri" w:hAnsi="Calibri"/>
+                <w:b w:val="0"/>
+                <w:i w:val="0"/>
+                <w:color w:val="333333"/>
+                <w:sz w:val="18"/>
+              </w:rPr>
+              <w:t>→  Profilbesuch (Viktor oder Beastly)</w:t>
+            </w:r>
+          </w:p>
+          <w:p>
+            <w:r>
+              <w:rPr>
+                <w:rFonts w:ascii="Calibri" w:hAnsi="Calibri"/>
+                <w:b w:val="0"/>
+                <w:i w:val="0"/>
+                <w:color w:val="333333"/>
+                <w:sz w:val="18"/>
+              </w:rPr>
+              <w:t>→  Website aufgerufen</w:t>
+            </w:r>
+          </w:p>
+          <w:p>
+            <w:r>
+              <w:rPr>
+                <w:rFonts w:ascii="Calibri" w:hAnsi="Calibri"/>
+                <w:b w:val="0"/>
+                <w:i w:val="0"/>
+                <w:color w:val="333333"/>
+                <w:sz w:val="18"/>
+              </w:rPr>
+              <w:t>→  Gründerstory gelesen</w:t>
+            </w:r>
+          </w:p>
+          <w:p>
+            <w:r>
+              <w:rPr>
+                <w:rFonts w:ascii="Calibri" w:hAnsi="Calibri"/>
+                <w:b w:val="0"/>
+                <w:i w:val="0"/>
+                <w:color w:val="333333"/>
+                <w:sz w:val="18"/>
+              </w:rPr>
+              <w:t>→  Mehrere Beiträge konsumiert</w:t>
             </w:r>
           </w:p>
         </w:tc>
@@ -1885,10 +2125,10 @@
         <w:tc>
           <w:tcPr>
             <w:tcW w:type="dxa" w:w="2871"/>
-            <w:shd w:val="clear" w:color="auto" w:fill="F0F4FF"/>
+            <w:shd w:val="clear" w:color="auto" w:fill="FEF3EE"/>
             <w:tcMar>
-              <w:top w:w="90" w:type="dxa"/>
-              <w:bottom w:w="90" w:type="dxa"/>
+              <w:top w:w="80" w:type="dxa"/>
+              <w:bottom w:w="80" w:type="dxa"/>
               <w:left w:w="100" w:type="dxa"/>
               <w:right w:w="100" w:type="dxa"/>
             </w:tcMar>
@@ -1898,34 +2138,70 @@
               <w:rPr>
                 <w:rFonts w:ascii="Calibri" w:hAnsi="Calibri"/>
                 <w:b/>
-                <w:color w:val="4B319B"/>
+                <w:i w:val="0"/>
+                <w:color w:val="BD5435"/>
                 <w:sz w:val="16"/>
               </w:rPr>
-              <w:t>KANÄLE</w:t>
+              <w:t>KEIN ENGAGEMENT</w:t>
+            </w:r>
+            <w:r>
+              <w:rPr>
+                <w:rFonts w:ascii="Calibri" w:hAnsi="Calibri"/>
+                <w:b w:val="0"/>
+                <w:i w:val="0"/>
+                <w:color w:val="333333"/>
+                <w:sz w:val="18"/>
+              </w:rPr>
+              <w:t xml:space="preserve">  →  </w:t>
             </w:r>
           </w:p>
           <w:p>
             <w:r>
               <w:rPr>
                 <w:rFonts w:ascii="Calibri" w:hAnsi="Calibri"/>
-                <w:color w:val="333333"/>
+                <w:b w:val="0"/>
+                <w:i w:val="0"/>
+                <w:color w:val="8B3A20"/>
                 <w:sz w:val="18"/>
               </w:rPr>
-              <w:t>→ Viktor LinkedIn — Story-Content (FourGive-Hintergrund)</w:t>
-              <w:br/>
-              <w:t>→ Beastly Social Media — Dual-Bildwelt (Raubtier ↔ schützenswertes Tier)</w:t>
-              <w:br/>
-              <w:t>→ Website — Einstiegsseite (Gründerstory, Werte)</w:t>
+              <w:t>Verlässt ohne Vertiefung → bleibt im Feed-Orbit, nächste Begegnung beim nächsten Post.</w:t>
+            </w:r>
+          </w:p>
+        </w:tc>
+        <w:tc>
+          <w:tcPr>
+            <w:tcW w:type="dxa" w:w="720"/>
+            <w:shd w:val="clear" w:color="auto" w:fill="FFFFFF"/>
+            <w:tcMar>
+              <w:top w:w="80" w:type="dxa"/>
+              <w:bottom w:w="80" w:type="dxa"/>
+              <w:left w:w="80" w:type="dxa"/>
+              <w:right w:w="80" w:type="dxa"/>
+            </w:tcMar>
+          </w:tcPr>
+          <w:p>
+            <w:pPr>
+              <w:jc w:val="center"/>
+            </w:pPr>
+            <w:r>
+              <w:rPr>
+                <w:rFonts w:ascii="Calibri" w:hAnsi="Calibri"/>
+                <w:b w:val="0"/>
+                <w:i w:val="0"/>
+                <w:color w:val="A176F4"/>
+                <w:sz w:val="32"/>
+              </w:rPr>
+              <w:t>▼</w:t>
             </w:r>
           </w:p>
         </w:tc>
         <w:tc>
           <w:tcPr>
             <w:tcW w:type="dxa" w:w="2871"/>
-            <w:shd w:val="clear" w:color="auto" w:fill="F0F4FF"/>
+            <w:shd w:val="clear" w:color="auto" w:fill="EDF7EE"/>
             <w:tcMar>
-              <w:top w:w="90" w:type="dxa"/>
-              <w:bottom w:w="90" w:type="dxa"/>
+              <w:top w:w="80" w:type="dxa"/>
+              <w:bottom w:w="80" w:type="dxa"/>
               <w:left w:w="100" w:type="dxa"/>
               <w:right w:w="100" w:type="dxa"/>
             </w:tcMar>
@@ -1935,56 +2211,33 @@
               <w:rPr>
                 <w:rFonts w:ascii="Calibri" w:hAnsi="Calibri"/>
                 <w:b/>
-                <w:color w:val="4B319B"/>
+                <w:i w:val="0"/>
+                <w:color w:val="1A5C38"/>
                 <w:sz w:val="16"/>
               </w:rPr>
-              <w:t>BOTSCHAFT</w:t>
+              <w:t>ENGAGEMENT</w:t>
+            </w:r>
+            <w:r>
+              <w:rPr>
+                <w:rFonts w:ascii="Calibri" w:hAnsi="Calibri"/>
+                <w:b w:val="0"/>
+                <w:i w:val="0"/>
+                <w:color w:val="333333"/>
+                <w:sz w:val="18"/>
+              </w:rPr>
+              <w:t xml:space="preserve">  →  </w:t>
             </w:r>
           </w:p>
           <w:p>
             <w:r>
               <w:rPr>
                 <w:rFonts w:ascii="Calibri" w:hAnsi="Calibri"/>
-                <w:color w:val="333333"/>
+                <w:b w:val="0"/>
+                <w:i w:val="0"/>
+                <w:color w:val="1A5C38"/>
                 <w:sz w:val="18"/>
               </w:rPr>
-              <w:t>Die Geschichte hinter der Idee. Ägypten. Tierklinik. Die Erkenntnis. Warum Beastly existiert.</w:t>
-            </w:r>
-          </w:p>
-        </w:tc>
-        <w:tc>
-          <w:tcPr>
-            <w:tcW w:type="dxa" w:w="2871"/>
-            <w:shd w:val="clear" w:color="auto" w:fill="F0F4FF"/>
-            <w:tcMar>
-              <w:top w:w="90" w:type="dxa"/>
-              <w:bottom w:w="90" w:type="dxa"/>
-              <w:left w:w="100" w:type="dxa"/>
-              <w:right w:w="100" w:type="dxa"/>
-            </w:tcMar>
-          </w:tcPr>
-          <w:p>
-            <w:r>
-              <w:rPr>
-                <w:rFonts w:ascii="Calibri" w:hAnsi="Calibri"/>
-                <w:b/>
-                <w:color w:val="4B319B"/>
-                <w:sz w:val="16"/>
-              </w:rPr>
-              <w:t>ZUR NÄCHSTEN STUFE</w:t>
-            </w:r>
-          </w:p>
-          <w:p>
-            <w:r>
-              <w:rPr>
-                <w:rFonts w:ascii="Calibri" w:hAnsi="Calibri"/>
-                <w:color w:val="333333"/>
-                <w:sz w:val="18"/>
-              </w:rPr>
-              <w:t>Ziel: Aus Aufmerksamkeit wird Auseinandersetzung. Der Mensch sucht aktiv nach mehr.</w:t>
-              <w:br/>
-              <w:br/>
-              <w:t>Wer kommt weiter? Alle, die mehr wissen wollen und aktiv weiterklicken.</w:t>
+              <w:t>Sucht aktiv mehr → besucht Website, liest tiefer, folgt dem Profil.</w:t>
             </w:r>
           </w:p>
         </w:tc>
@@ -1998,6 +2251,8 @@
       <w:r>
         <w:rPr>
           <w:rFonts w:ascii="Calibri" w:hAnsi="Calibri"/>
+          <w:b w:val="0"/>
+          <w:i w:val="0"/>
           <w:color w:val="A176F4"/>
           <w:sz w:val="28"/>
         </w:rPr>
@@ -2017,7 +2272,7 @@
       <w:tr>
         <w:tc>
           <w:tcPr>
-            <w:tcW w:type="dxa" w:w="720"/>
+            <w:tcW w:type="dxa" w:w="648"/>
             <w:shd w:val="clear" w:color="auto" w:fill="27406A"/>
             <w:tcMar>
               <w:top w:w="80" w:type="dxa"/>
@@ -2034,8 +2289,9 @@
               <w:rPr>
                 <w:rFonts w:ascii="Calibri" w:hAnsi="Calibri"/>
                 <w:b/>
+                <w:i w:val="0"/>
                 <w:color w:val="FFFFFF"/>
-                <w:sz w:val="40"/>
+                <w:sz w:val="36"/>
               </w:rPr>
               <w:t>03</w:t>
             </w:r>
@@ -2053,17 +2309,160 @@
             </w:tcMar>
           </w:tcPr>
           <w:p>
-            <w:pPr>
-              <w:jc w:val="left"/>
-            </w:pPr>
             <w:r>
               <w:rPr>
                 <w:rFonts w:ascii="Calibri" w:hAnsi="Calibri"/>
                 <w:b/>
+                <w:i w:val="0"/>
                 <w:color w:val="FFFFFF"/>
-                <w:sz w:val="26"/>
+                <w:sz w:val="24"/>
               </w:rPr>
               <w:t>VERTRAUEN</w:t>
+            </w:r>
+          </w:p>
+        </w:tc>
+      </w:tr>
+    </w:tbl>
+    <w:tbl>
+      <w:tblPr>
+        <w:tblStyle w:val="TableGrid"/>
+        <w:tblW w:type="auto" w:w="0"/>
+        <w:tblLook w:firstColumn="1" w:firstRow="1" w:lastColumn="0" w:lastRow="0" w:noHBand="0" w:noVBand="1" w:val="04A0"/>
+      </w:tblPr>
+      <w:tblGrid>
+        <w:gridCol w:w="4306"/>
+        <w:gridCol w:w="4306"/>
+      </w:tblGrid>
+      <w:tr>
+        <w:tc>
+          <w:tcPr>
+            <w:tcW w:type="dxa" w:w="4306"/>
+            <w:shd w:val="clear" w:color="auto" w:fill="F5F3FF"/>
+            <w:tcMar>
+              <w:top w:w="90" w:type="dxa"/>
+              <w:bottom w:w="90" w:type="dxa"/>
+              <w:left w:w="100" w:type="dxa"/>
+              <w:right w:w="100" w:type="dxa"/>
+            </w:tcMar>
+          </w:tcPr>
+          <w:p>
+            <w:r>
+              <w:rPr>
+                <w:rFonts w:ascii="Calibri" w:hAnsi="Calibri"/>
+                <w:b/>
+                <w:i w:val="0"/>
+                <w:color w:val="4B319B"/>
+                <w:sz w:val="16"/>
+              </w:rPr>
+              <w:t>AKTIVE KANÄLE</w:t>
+            </w:r>
+          </w:p>
+          <w:p>
+            <w:r>
+              <w:rPr>
+                <w:rFonts w:ascii="Calibri" w:hAnsi="Calibri"/>
+                <w:b w:val="0"/>
+                <w:i w:val="0"/>
+                <w:color w:val="333333"/>
+                <w:sz w:val="18"/>
+              </w:rPr>
+              <w:t>→  Website — Transparenzbereich (Löhne, Struktur, 5 Projekte)</w:t>
+            </w:r>
+          </w:p>
+          <w:p>
+            <w:r>
+              <w:rPr>
+                <w:rFonts w:ascii="Calibri" w:hAnsi="Calibri"/>
+                <w:b w:val="0"/>
+                <w:i w:val="0"/>
+                <w:color w:val="333333"/>
+                <w:sz w:val="18"/>
+              </w:rPr>
+              <w:t>→  Viktor &amp; Lydia — Nahbarkeit, persönliche Posts</w:t>
+            </w:r>
+          </w:p>
+          <w:p>
+            <w:r>
+              <w:rPr>
+                <w:rFonts w:ascii="Calibri" w:hAnsi="Calibri"/>
+                <w:b w:val="0"/>
+                <w:i w:val="0"/>
+                <w:color w:val="333333"/>
+                <w:sz w:val="18"/>
+              </w:rPr>
+              <w:t>→  FourGive — reale Wirkungsmomente, Geschichten</w:t>
+            </w:r>
+          </w:p>
+        </w:tc>
+        <w:tc>
+          <w:tcPr>
+            <w:tcW w:type="dxa" w:w="4306"/>
+            <w:shd w:val="clear" w:color="auto" w:fill="F5F3FF"/>
+            <w:tcMar>
+              <w:top w:w="90" w:type="dxa"/>
+              <w:bottom w:w="90" w:type="dxa"/>
+              <w:left w:w="100" w:type="dxa"/>
+              <w:right w:w="100" w:type="dxa"/>
+            </w:tcMar>
+          </w:tcPr>
+          <w:p>
+            <w:r>
+              <w:rPr>
+                <w:rFonts w:ascii="Calibri" w:hAnsi="Calibri"/>
+                <w:b/>
+                <w:i w:val="0"/>
+                <w:color w:val="4B319B"/>
+                <w:sz w:val="16"/>
+              </w:rPr>
+              <w:t>BERÜHRUNGSPUNKTE</w:t>
+            </w:r>
+          </w:p>
+          <w:p>
+            <w:r>
+              <w:rPr>
+                <w:rFonts w:ascii="Calibri" w:hAnsi="Calibri"/>
+                <w:b w:val="0"/>
+                <w:i w:val="0"/>
+                <w:color w:val="333333"/>
+                <w:sz w:val="18"/>
+              </w:rPr>
+              <w:t>→  Transparenzseite gelesen</w:t>
+            </w:r>
+          </w:p>
+          <w:p>
+            <w:r>
+              <w:rPr>
+                <w:rFonts w:ascii="Calibri" w:hAnsi="Calibri"/>
+                <w:b w:val="0"/>
+                <w:i w:val="0"/>
+                <w:color w:val="333333"/>
+                <w:sz w:val="18"/>
+              </w:rPr>
+              <w:t>→  Lohnstruktur entdeckt und verstanden</w:t>
+            </w:r>
+          </w:p>
+          <w:p>
+            <w:r>
+              <w:rPr>
+                <w:rFonts w:ascii="Calibri" w:hAnsi="Calibri"/>
+                <w:b w:val="0"/>
+                <w:i w:val="0"/>
+                <w:color w:val="333333"/>
+                <w:sz w:val="18"/>
+              </w:rPr>
+              <w:t>→  FourGive-Geschichte nachverfolgt</w:t>
+            </w:r>
+          </w:p>
+          <w:p>
+            <w:r>
+              <w:rPr>
+                <w:rFonts w:ascii="Calibri" w:hAnsi="Calibri"/>
+                <w:b w:val="0"/>
+                <w:i w:val="0"/>
+                <w:color w:val="333333"/>
+                <w:sz w:val="18"/>
+              </w:rPr>
+              <w:t>→  Viktor / Lydia als echte Menschen wahrgenommen</w:t>
             </w:r>
           </w:p>
         </w:tc>
@@ -2084,10 +2483,10 @@
         <w:tc>
           <w:tcPr>
             <w:tcW w:type="dxa" w:w="2871"/>
-            <w:shd w:val="clear" w:color="auto" w:fill="F7F3FF"/>
+            <w:shd w:val="clear" w:color="auto" w:fill="FEF3EE"/>
             <w:tcMar>
-              <w:top w:w="90" w:type="dxa"/>
-              <w:bottom w:w="90" w:type="dxa"/>
+              <w:top w:w="80" w:type="dxa"/>
+              <w:bottom w:w="80" w:type="dxa"/>
               <w:left w:w="100" w:type="dxa"/>
               <w:right w:w="100" w:type="dxa"/>
             </w:tcMar>
@@ -2097,34 +2496,70 @@
               <w:rPr>
                 <w:rFonts w:ascii="Calibri" w:hAnsi="Calibri"/>
                 <w:b/>
-                <w:color w:val="4B319B"/>
+                <w:i w:val="0"/>
+                <w:color w:val="BD5435"/>
                 <w:sz w:val="16"/>
               </w:rPr>
-              <w:t>KANÄLE</w:t>
+              <w:t>KEIN ENGAGEMENT</w:t>
+            </w:r>
+            <w:r>
+              <w:rPr>
+                <w:rFonts w:ascii="Calibri" w:hAnsi="Calibri"/>
+                <w:b w:val="0"/>
+                <w:i w:val="0"/>
+                <w:color w:val="333333"/>
+                <w:sz w:val="18"/>
+              </w:rPr>
+              <w:t xml:space="preserve">  →  </w:t>
             </w:r>
           </w:p>
           <w:p>
             <w:r>
               <w:rPr>
                 <w:rFonts w:ascii="Calibri" w:hAnsi="Calibri"/>
-                <w:color w:val="333333"/>
+                <w:b w:val="0"/>
+                <w:i w:val="0"/>
+                <w:color w:val="8B3A20"/>
                 <w:sz w:val="18"/>
               </w:rPr>
-              <w:t>→ Website — Transparenzbereich (Löhne, Struktur, Mittelverwendung)</w:t>
-              <w:br/>
-              <w:t>→ Viktor &amp; Lydia als Personen (Nahbarkeit, Authentizität)</w:t>
-              <w:br/>
-              <w:t>→ FourGive — Wirkungsbelege, reale Geschichten</w:t>
+              <w:t>Zweifel bleiben → gezielter Beweis-Content, Transparenz-Posts, Retargeting mit Substanz.</w:t>
+            </w:r>
+          </w:p>
+        </w:tc>
+        <w:tc>
+          <w:tcPr>
+            <w:tcW w:type="dxa" w:w="720"/>
+            <w:shd w:val="clear" w:color="auto" w:fill="FFFFFF"/>
+            <w:tcMar>
+              <w:top w:w="80" w:type="dxa"/>
+              <w:bottom w:w="80" w:type="dxa"/>
+              <w:left w:w="80" w:type="dxa"/>
+              <w:right w:w="80" w:type="dxa"/>
+            </w:tcMar>
+          </w:tcPr>
+          <w:p>
+            <w:pPr>
+              <w:jc w:val="center"/>
+            </w:pPr>
+            <w:r>
+              <w:rPr>
+                <w:rFonts w:ascii="Calibri" w:hAnsi="Calibri"/>
+                <w:b w:val="0"/>
+                <w:i w:val="0"/>
+                <w:color w:val="A176F4"/>
+                <w:sz w:val="32"/>
+              </w:rPr>
+              <w:t>▼</w:t>
             </w:r>
           </w:p>
         </w:tc>
         <w:tc>
           <w:tcPr>
             <w:tcW w:type="dxa" w:w="2871"/>
-            <w:shd w:val="clear" w:color="auto" w:fill="F7F3FF"/>
+            <w:shd w:val="clear" w:color="auto" w:fill="EDF7EE"/>
             <w:tcMar>
-              <w:top w:w="90" w:type="dxa"/>
-              <w:bottom w:w="90" w:type="dxa"/>
+              <w:top w:w="80" w:type="dxa"/>
+              <w:bottom w:w="80" w:type="dxa"/>
               <w:left w:w="100" w:type="dxa"/>
               <w:right w:w="100" w:type="dxa"/>
             </w:tcMar>
@@ -2134,56 +2569,33 @@
               <w:rPr>
                 <w:rFonts w:ascii="Calibri" w:hAnsi="Calibri"/>
                 <w:b/>
-                <w:color w:val="4B319B"/>
+                <w:i w:val="0"/>
+                <w:color w:val="1A5C38"/>
                 <w:sz w:val="16"/>
               </w:rPr>
-              <w:t>BOTSCHAFT</w:t>
+              <w:t>ENGAGEMENT</w:t>
+            </w:r>
+            <w:r>
+              <w:rPr>
+                <w:rFonts w:ascii="Calibri" w:hAnsi="Calibri"/>
+                <w:b w:val="0"/>
+                <w:i w:val="0"/>
+                <w:color w:val="333333"/>
+                <w:sz w:val="18"/>
+              </w:rPr>
+              <w:t xml:space="preserve">  →  </w:t>
             </w:r>
           </w:p>
           <w:p>
             <w:r>
               <w:rPr>
                 <w:rFonts w:ascii="Calibri" w:hAnsi="Calibri"/>
-                <w:color w:val="333333"/>
+                <w:b w:val="0"/>
+                <w:i w:val="0"/>
+                <w:color w:val="1A5C38"/>
                 <w:sz w:val="18"/>
               </w:rPr>
-              <w:t>«Hier werden Löhne gezeigt.»  /  «Kein Bonus-System.»  /  «20% der Fee geht direkt an Tierschutz.»  /  Nicht Charity — Struktur.</w:t>
-            </w:r>
-          </w:p>
-        </w:tc>
-        <w:tc>
-          <w:tcPr>
-            <w:tcW w:type="dxa" w:w="2871"/>
-            <w:shd w:val="clear" w:color="auto" w:fill="F7F3FF"/>
-            <w:tcMar>
-              <w:top w:w="90" w:type="dxa"/>
-              <w:bottom w:w="90" w:type="dxa"/>
-              <w:left w:w="100" w:type="dxa"/>
-              <w:right w:w="100" w:type="dxa"/>
-            </w:tcMar>
-          </w:tcPr>
-          <w:p>
-            <w:r>
-              <w:rPr>
-                <w:rFonts w:ascii="Calibri" w:hAnsi="Calibri"/>
-                <w:b/>
-                <w:color w:val="4B319B"/>
-                <w:sz w:val="16"/>
-              </w:rPr>
-              <w:t>ZUR NÄCHSTEN STUFE</w:t>
-            </w:r>
-          </w:p>
-          <w:p>
-            <w:r>
-              <w:rPr>
-                <w:rFonts w:ascii="Calibri" w:hAnsi="Calibri"/>
-                <w:color w:val="333333"/>
-                <w:sz w:val="18"/>
-              </w:rPr>
-              <w:t>Ziel: Zweifel ausräumen. Substanz beweisen. Beastly als ernsthaftes, glaubwürdiges Produkt verankern.</w:t>
-              <w:br/>
-              <w:br/>
-              <w:t>Wer kommt weiter? Alle, die bereit sind zu prüfen — ob das stimmt, was versprochen wird.</w:t>
+              <w:t>Vertrauen gewonnen → bereit zu prüfen, ob das Produkt für sie passt.</w:t>
             </w:r>
           </w:p>
         </w:tc>
@@ -2197,6 +2609,8 @@
       <w:r>
         <w:rPr>
           <w:rFonts w:ascii="Calibri" w:hAnsi="Calibri"/>
+          <w:b w:val="0"/>
+          <w:i w:val="0"/>
           <w:color w:val="A176F4"/>
           <w:sz w:val="28"/>
         </w:rPr>
@@ -2216,7 +2630,7 @@
       <w:tr>
         <w:tc>
           <w:tcPr>
-            <w:tcW w:type="dxa" w:w="720"/>
+            <w:tcW w:type="dxa" w:w="648"/>
             <w:shd w:val="clear" w:color="auto" w:fill="344E5A"/>
             <w:tcMar>
               <w:top w:w="80" w:type="dxa"/>
@@ -2233,8 +2647,9 @@
               <w:rPr>
                 <w:rFonts w:ascii="Calibri" w:hAnsi="Calibri"/>
                 <w:b/>
+                <w:i w:val="0"/>
                 <w:color w:val="FFFFFF"/>
-                <w:sz w:val="40"/>
+                <w:sz w:val="36"/>
               </w:rPr>
               <w:t>04</w:t>
             </w:r>
@@ -2252,17 +2667,160 @@
             </w:tcMar>
           </w:tcPr>
           <w:p>
-            <w:pPr>
-              <w:jc w:val="left"/>
-            </w:pPr>
             <w:r>
               <w:rPr>
                 <w:rFonts w:ascii="Calibri" w:hAnsi="Calibri"/>
                 <w:b/>
+                <w:i w:val="0"/>
                 <w:color w:val="FFFFFF"/>
-                <w:sz w:val="26"/>
+                <w:sz w:val="24"/>
               </w:rPr>
               <w:t>ERKLÄRUNG</w:t>
+            </w:r>
+          </w:p>
+        </w:tc>
+      </w:tr>
+    </w:tbl>
+    <w:tbl>
+      <w:tblPr>
+        <w:tblStyle w:val="TableGrid"/>
+        <w:tblW w:type="auto" w:w="0"/>
+        <w:tblLook w:firstColumn="1" w:firstRow="1" w:lastColumn="0" w:lastRow="0" w:noHBand="0" w:noVBand="1" w:val="04A0"/>
+      </w:tblPr>
+      <w:tblGrid>
+        <w:gridCol w:w="4306"/>
+        <w:gridCol w:w="4306"/>
+      </w:tblGrid>
+      <w:tr>
+        <w:tc>
+          <w:tcPr>
+            <w:tcW w:type="dxa" w:w="4306"/>
+            <w:shd w:val="clear" w:color="auto" w:fill="EEF4FF"/>
+            <w:tcMar>
+              <w:top w:w="90" w:type="dxa"/>
+              <w:bottom w:w="90" w:type="dxa"/>
+              <w:left w:w="100" w:type="dxa"/>
+              <w:right w:w="100" w:type="dxa"/>
+            </w:tcMar>
+          </w:tcPr>
+          <w:p>
+            <w:r>
+              <w:rPr>
+                <w:rFonts w:ascii="Calibri" w:hAnsi="Calibri"/>
+                <w:b/>
+                <w:i w:val="0"/>
+                <w:color w:val="4B319B"/>
+                <w:sz w:val="16"/>
+              </w:rPr>
+              <w:t>AKTIVE KANÄLE</w:t>
+            </w:r>
+          </w:p>
+          <w:p>
+            <w:r>
+              <w:rPr>
+                <w:rFonts w:ascii="Calibri" w:hAnsi="Calibri"/>
+                <w:b w:val="0"/>
+                <w:i w:val="0"/>
+                <w:color w:val="333333"/>
+                <w:sz w:val="18"/>
+              </w:rPr>
+              <w:t>→  Pitch Deck (emotionaler Aufbau + faktische Tiefe)</w:t>
+            </w:r>
+          </w:p>
+          <w:p>
+            <w:r>
+              <w:rPr>
+                <w:rFonts w:ascii="Calibri" w:hAnsi="Calibri"/>
+                <w:b w:val="0"/>
+                <w:i w:val="0"/>
+                <w:color w:val="333333"/>
+                <w:sz w:val="18"/>
+              </w:rPr>
+              <w:t>→  Direktgespräch Viktor &amp; Lydia (professionelle Investoren)</w:t>
+            </w:r>
+          </w:p>
+          <w:p>
+            <w:r>
+              <w:rPr>
+                <w:rFonts w:ascii="Calibri" w:hAnsi="Calibri"/>
+                <w:b w:val="0"/>
+                <w:i w:val="0"/>
+                <w:color w:val="333333"/>
+                <w:sz w:val="18"/>
+              </w:rPr>
+              <w:t>→  Website — Deep Dive: KI-Logik, Governance, Portfolio</w:t>
+            </w:r>
+          </w:p>
+        </w:tc>
+        <w:tc>
+          <w:tcPr>
+            <w:tcW w:type="dxa" w:w="4306"/>
+            <w:shd w:val="clear" w:color="auto" w:fill="EEF4FF"/>
+            <w:tcMar>
+              <w:top w:w="90" w:type="dxa"/>
+              <w:bottom w:w="90" w:type="dxa"/>
+              <w:left w:w="100" w:type="dxa"/>
+              <w:right w:w="100" w:type="dxa"/>
+            </w:tcMar>
+          </w:tcPr>
+          <w:p>
+            <w:r>
+              <w:rPr>
+                <w:rFonts w:ascii="Calibri" w:hAnsi="Calibri"/>
+                <w:b/>
+                <w:i w:val="0"/>
+                <w:color w:val="4B319B"/>
+                <w:sz w:val="16"/>
+              </w:rPr>
+              <w:t>BERÜHRUNGSPUNKTE</w:t>
+            </w:r>
+          </w:p>
+          <w:p>
+            <w:r>
+              <w:rPr>
+                <w:rFonts w:ascii="Calibri" w:hAnsi="Calibri"/>
+                <w:b w:val="0"/>
+                <w:i w:val="0"/>
+                <w:color w:val="333333"/>
+                <w:sz w:val="18"/>
+              </w:rPr>
+              <w:t>→  Pitch Deck angefordert oder erhalten</w:t>
+            </w:r>
+          </w:p>
+          <w:p>
+            <w:r>
+              <w:rPr>
+                <w:rFonts w:ascii="Calibri" w:hAnsi="Calibri"/>
+                <w:b w:val="0"/>
+                <w:i w:val="0"/>
+                <w:color w:val="333333"/>
+                <w:sz w:val="18"/>
+              </w:rPr>
+              <w:t>→  Gespräch mit Viktor / Lydia geführt</w:t>
+            </w:r>
+          </w:p>
+          <w:p>
+            <w:r>
+              <w:rPr>
+                <w:rFonts w:ascii="Calibri" w:hAnsi="Calibri"/>
+                <w:b w:val="0"/>
+                <w:i w:val="0"/>
+                <w:color w:val="333333"/>
+                <w:sz w:val="18"/>
+              </w:rPr>
+              <w:t>→  Produkt-Details gelesen und verstanden</w:t>
+            </w:r>
+          </w:p>
+          <w:p>
+            <w:r>
+              <w:rPr>
+                <w:rFonts w:ascii="Calibri" w:hAnsi="Calibri"/>
+                <w:b w:val="0"/>
+                <w:i w:val="0"/>
+                <w:color w:val="333333"/>
+                <w:sz w:val="18"/>
+              </w:rPr>
+              <w:t>→  Fragen gestellt und beantwortet</w:t>
             </w:r>
           </w:p>
         </w:tc>
@@ -2283,10 +2841,10 @@
         <w:tc>
           <w:tcPr>
             <w:tcW w:type="dxa" w:w="2871"/>
-            <w:shd w:val="clear" w:color="auto" w:fill="F0F4FF"/>
+            <w:shd w:val="clear" w:color="auto" w:fill="FEF3EE"/>
             <w:tcMar>
-              <w:top w:w="90" w:type="dxa"/>
-              <w:bottom w:w="90" w:type="dxa"/>
+              <w:top w:w="80" w:type="dxa"/>
+              <w:bottom w:w="80" w:type="dxa"/>
               <w:left w:w="100" w:type="dxa"/>
               <w:right w:w="100" w:type="dxa"/>
             </w:tcMar>
@@ -2296,34 +2854,70 @@
               <w:rPr>
                 <w:rFonts w:ascii="Calibri" w:hAnsi="Calibri"/>
                 <w:b/>
-                <w:color w:val="4B319B"/>
+                <w:i w:val="0"/>
+                <w:color w:val="BD5435"/>
                 <w:sz w:val="16"/>
               </w:rPr>
-              <w:t>KANÄLE</w:t>
+              <w:t>KEIN ENGAGEMENT</w:t>
+            </w:r>
+            <w:r>
+              <w:rPr>
+                <w:rFonts w:ascii="Calibri" w:hAnsi="Calibri"/>
+                <w:b w:val="0"/>
+                <w:i w:val="0"/>
+                <w:color w:val="333333"/>
+                <w:sz w:val="18"/>
+              </w:rPr>
+              <w:t xml:space="preserve">  →  </w:t>
             </w:r>
           </w:p>
           <w:p>
             <w:r>
               <w:rPr>
                 <w:rFonts w:ascii="Calibri" w:hAnsi="Calibri"/>
-                <w:color w:val="333333"/>
+                <w:b w:val="0"/>
+                <w:i w:val="0"/>
+                <w:color w:val="8B3A20"/>
                 <w:sz w:val="18"/>
               </w:rPr>
-              <w:t>→ Pitch Deck — emotionaler Aufbau, faktische Tiefe</w:t>
-              <w:br/>
-              <w:t>→ Direktgespräch Viktor &amp; Lydia (professionelle Investoren)</w:t>
-              <w:br/>
-              <w:t>→ Vertiefende Website-Inhalte (KI-Logik, Governance, Reporting)</w:t>
+              <w:t>Zu komplex oder zu risikoreich → nicht der richtige Moment. Kein Druck — Tür bleibt offen.</w:t>
+            </w:r>
+          </w:p>
+        </w:tc>
+        <w:tc>
+          <w:tcPr>
+            <w:tcW w:type="dxa" w:w="720"/>
+            <w:shd w:val="clear" w:color="auto" w:fill="FFFFFF"/>
+            <w:tcMar>
+              <w:top w:w="80" w:type="dxa"/>
+              <w:bottom w:w="80" w:type="dxa"/>
+              <w:left w:w="80" w:type="dxa"/>
+              <w:right w:w="80" w:type="dxa"/>
+            </w:tcMar>
+          </w:tcPr>
+          <w:p>
+            <w:pPr>
+              <w:jc w:val="center"/>
+            </w:pPr>
+            <w:r>
+              <w:rPr>
+                <w:rFonts w:ascii="Calibri" w:hAnsi="Calibri"/>
+                <w:b w:val="0"/>
+                <w:i w:val="0"/>
+                <w:color w:val="A176F4"/>
+                <w:sz w:val="32"/>
+              </w:rPr>
+              <w:t>▼</w:t>
             </w:r>
           </w:p>
         </w:tc>
         <w:tc>
           <w:tcPr>
             <w:tcW w:type="dxa" w:w="2871"/>
-            <w:shd w:val="clear" w:color="auto" w:fill="F0F4FF"/>
+            <w:shd w:val="clear" w:color="auto" w:fill="EDF7EE"/>
             <w:tcMar>
-              <w:top w:w="90" w:type="dxa"/>
-              <w:bottom w:w="90" w:type="dxa"/>
+              <w:top w:w="80" w:type="dxa"/>
+              <w:bottom w:w="80" w:type="dxa"/>
               <w:left w:w="100" w:type="dxa"/>
               <w:right w:w="100" w:type="dxa"/>
             </w:tcMar>
@@ -2333,56 +2927,33 @@
               <w:rPr>
                 <w:rFonts w:ascii="Calibri" w:hAnsi="Calibri"/>
                 <w:b/>
-                <w:color w:val="4B319B"/>
+                <w:i w:val="0"/>
+                <w:color w:val="1A5C38"/>
                 <w:sz w:val="16"/>
               </w:rPr>
-              <w:t>BOTSCHAFT</w:t>
+              <w:t>ENGAGEMENT</w:t>
+            </w:r>
+            <w:r>
+              <w:rPr>
+                <w:rFonts w:ascii="Calibri" w:hAnsi="Calibri"/>
+                <w:b w:val="0"/>
+                <w:i w:val="0"/>
+                <w:color w:val="333333"/>
+                <w:sz w:val="18"/>
+              </w:rPr>
+              <w:t xml:space="preserve">  →  </w:t>
             </w:r>
           </w:p>
           <w:p>
             <w:r>
               <w:rPr>
                 <w:rFonts w:ascii="Calibri" w:hAnsi="Calibri"/>
-                <w:color w:val="333333"/>
+                <w:b w:val="0"/>
+                <w:i w:val="0"/>
+                <w:color w:val="1A5C38"/>
                 <w:sz w:val="18"/>
               </w:rPr>
-              <w:t>Wie funktioniert die KI-Bewertung? Was ist die Rendite-Logik? Was passiert mit den 20%? Wer ist Chipiron?</w:t>
-            </w:r>
-          </w:p>
-        </w:tc>
-        <w:tc>
-          <w:tcPr>
-            <w:tcW w:type="dxa" w:w="2871"/>
-            <w:shd w:val="clear" w:color="auto" w:fill="F0F4FF"/>
-            <w:tcMar>
-              <w:top w:w="90" w:type="dxa"/>
-              <w:bottom w:w="90" w:type="dxa"/>
-              <w:left w:w="100" w:type="dxa"/>
-              <w:right w:w="100" w:type="dxa"/>
-            </w:tcMar>
-          </w:tcPr>
-          <w:p>
-            <w:r>
-              <w:rPr>
-                <w:rFonts w:ascii="Calibri" w:hAnsi="Calibri"/>
-                <w:b/>
-                <w:color w:val="4B319B"/>
-                <w:sz w:val="16"/>
-              </w:rPr>
-              <w:t>ZUR NÄCHSTEN STUFE</w:t>
-            </w:r>
-          </w:p>
-          <w:p>
-            <w:r>
-              <w:rPr>
-                <w:rFonts w:ascii="Calibri" w:hAnsi="Calibri"/>
-                <w:color w:val="333333"/>
-                <w:sz w:val="18"/>
-              </w:rPr>
-              <w:t>Ziel: Investitionsentscheidung vorbereiten. Retail: einfacher Prozess. Professionell: tiefe Beweisführung.</w:t>
-              <w:br/>
-              <w:br/>
-              <w:t>Wer kommt weiter? Alle, die investieren wollen — aber noch Fragen haben.</w:t>
+              <w:t>Entscheidungsreif → kennt das Produkt, versteht die Logik, ist bereit zu investieren.</w:t>
             </w:r>
           </w:p>
         </w:tc>
@@ -2396,10 +2967,12 @@
       <w:r>
         <w:rPr>
           <w:rFonts w:ascii="Calibri" w:hAnsi="Calibri"/>
-          <w:color w:val="A176F4"/>
-          <w:sz w:val="28"/>
+          <w:b/>
+          <w:i w:val="0"/>
+          <w:color w:val="4B319B"/>
+          <w:sz w:val="22"/>
         </w:rPr>
-        <w:t>▼</w:t>
+        <w:t>▼  ENTSCHEIDUNGSWEG  ▼</w:t>
       </w:r>
     </w:p>
     <w:tbl>
@@ -2415,58 +2988,155 @@
       <w:tr>
         <w:tc>
           <w:tcPr>
-            <w:tcW w:type="dxa" w:w="720"/>
+            <w:tcW w:type="dxa" w:w="4306"/>
             <w:shd w:val="clear" w:color="auto" w:fill="BD5435"/>
             <w:tcMar>
-              <w:top w:w="80" w:type="dxa"/>
-              <w:bottom w:w="80" w:type="dxa"/>
+              <w:top w:w="100" w:type="dxa"/>
+              <w:bottom w:w="100" w:type="dxa"/>
               <w:left w:w="120" w:type="dxa"/>
-              <w:right w:w="60" w:type="dxa"/>
+              <w:right w:w="120" w:type="dxa"/>
             </w:tcMar>
           </w:tcPr>
           <w:p>
-            <w:pPr>
-              <w:jc w:val="center"/>
-            </w:pPr>
             <w:r>
               <w:rPr>
                 <w:rFonts w:ascii="Calibri" w:hAnsi="Calibri"/>
                 <w:b/>
+                <w:i w:val="0"/>
                 <w:color w:val="FFFFFF"/>
-                <w:sz w:val="40"/>
+                <w:sz w:val="20"/>
               </w:rPr>
-              <w:t>05</w:t>
+              <w:t>RETAIL — ab CHF 50</w:t>
+            </w:r>
+          </w:p>
+          <w:p>
+            <w:r>
+              <w:rPr>
+                <w:rFonts w:ascii="Calibri" w:hAnsi="Calibri"/>
+                <w:b w:val="0"/>
+                <w:i w:val="0"/>
+                <w:color w:val="FFFFFF"/>
+                <w:sz w:val="19"/>
+              </w:rPr>
+              <w:t>→ Geht zur Bank oder Investment-App</w:t>
+            </w:r>
+          </w:p>
+          <w:p>
+            <w:r>
+              <w:rPr>
+                <w:rFonts w:ascii="Calibri" w:hAnsi="Calibri"/>
+                <w:b w:val="0"/>
+                <w:i w:val="0"/>
+                <w:color w:val="FFFFFF"/>
+                <w:sz w:val="19"/>
+              </w:rPr>
+              <w:t>→ Sucht «Beastly Investments» im Produktkatalog</w:t>
+            </w:r>
+          </w:p>
+          <w:p>
+            <w:r>
+              <w:rPr>
+                <w:rFonts w:ascii="Calibri" w:hAnsi="Calibri"/>
+                <w:b w:val="0"/>
+                <w:i w:val="0"/>
+                <w:color w:val="FFFFFF"/>
+                <w:sz w:val="19"/>
+              </w:rPr>
+              <w:t>→ Gibt Betrag ein (min. CHF 50)</w:t>
+            </w:r>
+          </w:p>
+          <w:p>
+            <w:r>
+              <w:rPr>
+                <w:rFonts w:ascii="Calibri" w:hAnsi="Calibri"/>
+                <w:b w:val="0"/>
+                <w:i w:val="0"/>
+                <w:color w:val="FFFFFF"/>
+                <w:sz w:val="19"/>
+              </w:rPr>
+              <w:t>→ Bestätigt das Investment</w:t>
             </w:r>
           </w:p>
         </w:tc>
         <w:tc>
           <w:tcPr>
             <w:tcW w:type="dxa" w:w="4306"/>
-            <w:shd w:val="clear" w:color="auto" w:fill="BD5435"/>
+            <w:shd w:val="clear" w:color="auto" w:fill="4b319b"/>
             <w:tcMar>
-              <w:top w:w="80" w:type="dxa"/>
-              <w:bottom w:w="80" w:type="dxa"/>
-              <w:left w:w="100" w:type="dxa"/>
-              <w:right w:w="100" w:type="dxa"/>
+              <w:top w:w="100" w:type="dxa"/>
+              <w:bottom w:w="100" w:type="dxa"/>
+              <w:left w:w="120" w:type="dxa"/>
+              <w:right w:w="120" w:type="dxa"/>
             </w:tcMar>
           </w:tcPr>
           <w:p>
-            <w:pPr>
-              <w:jc w:val="left"/>
-            </w:pPr>
             <w:r>
               <w:rPr>
                 <w:rFonts w:ascii="Calibri" w:hAnsi="Calibri"/>
                 <w:b/>
+                <w:i w:val="0"/>
                 <w:color w:val="FFFFFF"/>
-                <w:sz w:val="26"/>
+                <w:sz w:val="20"/>
               </w:rPr>
-              <w:t>ENTSCHEIDUNG</w:t>
+              <w:t>PROFESSIONELL — Direktabschluss</w:t>
+            </w:r>
+          </w:p>
+          <w:p>
+            <w:r>
+              <w:rPr>
+                <w:rFonts w:ascii="Calibri" w:hAnsi="Calibri"/>
+                <w:b w:val="0"/>
+                <w:i w:val="0"/>
+                <w:color w:val="FFFFFF"/>
+                <w:sz w:val="19"/>
+              </w:rPr>
+              <w:t>→ Hat Gespräch mit Viktor &amp; Lydia geführt</w:t>
+            </w:r>
+          </w:p>
+          <w:p>
+            <w:r>
+              <w:rPr>
+                <w:rFonts w:ascii="Calibri" w:hAnsi="Calibri"/>
+                <w:b w:val="0"/>
+                <w:i w:val="0"/>
+                <w:color w:val="FFFFFF"/>
+                <w:sz w:val="19"/>
+              </w:rPr>
+              <w:t>→ Pitch Deck und Unterlagen erhalten</w:t>
+            </w:r>
+          </w:p>
+          <w:p>
+            <w:r>
+              <w:rPr>
+                <w:rFonts w:ascii="Calibri" w:hAnsi="Calibri"/>
+                <w:b w:val="0"/>
+                <w:i w:val="0"/>
+                <w:color w:val="FFFFFF"/>
+                <w:sz w:val="19"/>
+              </w:rPr>
+              <w:t>→ Investmententscheid intern abgestimmt</w:t>
+            </w:r>
+          </w:p>
+          <w:p>
+            <w:r>
+              <w:rPr>
+                <w:rFonts w:ascii="Calibri" w:hAnsi="Calibri"/>
+                <w:b w:val="0"/>
+                <w:i w:val="0"/>
+                <w:color w:val="FFFFFF"/>
+                <w:sz w:val="19"/>
+              </w:rPr>
+              <w:t>→ Abschluss über eigene Bank / Custody-Lösung</w:t>
             </w:r>
           </w:p>
         </w:tc>
       </w:tr>
     </w:tbl>
+    <w:p>
+      <w:pPr>
+        <w:spacing w:after="40"/>
+      </w:pPr>
+    </w:p>
     <w:tbl>
       <w:tblPr>
         <w:tblStyle w:val="TableGrid"/>
@@ -2474,20 +3144,18 @@
         <w:tblLook w:firstColumn="1" w:firstRow="1" w:lastColumn="0" w:lastRow="0" w:noHBand="0" w:noVBand="1" w:val="04A0"/>
       </w:tblPr>
       <w:tblGrid>
-        <w:gridCol w:w="2871"/>
-        <w:gridCol w:w="2871"/>
-        <w:gridCol w:w="2871"/>
+        <w:gridCol w:w="8612"/>
       </w:tblGrid>
       <w:tr>
         <w:tc>
           <w:tcPr>
-            <w:tcW w:type="dxa" w:w="2871"/>
-            <w:shd w:val="clear" w:color="auto" w:fill="F7F3FF"/>
+            <w:tcW w:type="dxa" w:w="8612"/>
+            <w:shd w:val="clear" w:color="auto" w:fill="1a5c38"/>
             <w:tcMar>
-              <w:top w:w="90" w:type="dxa"/>
-              <w:bottom w:w="90" w:type="dxa"/>
-              <w:left w:w="100" w:type="dxa"/>
-              <w:right w:w="100" w:type="dxa"/>
+              <w:top w:w="100" w:type="dxa"/>
+              <w:bottom w:w="100" w:type="dxa"/>
+              <w:left w:w="140" w:type="dxa"/>
+              <w:right w:w="140" w:type="dxa"/>
             </w:tcMar>
           </w:tcPr>
           <w:p>
@@ -2495,36 +3163,66 @@
               <w:rPr>
                 <w:rFonts w:ascii="Calibri" w:hAnsi="Calibri"/>
                 <w:b/>
-                <w:color w:val="4B319B"/>
-                <w:sz w:val="16"/>
+                <w:i w:val="0"/>
+                <w:color w:val="FFFFFF"/>
+                <w:sz w:val="24"/>
               </w:rPr>
-              <w:t>KANÄLE</w:t>
+              <w:t xml:space="preserve">✓  INVESTMENT GETÄTIGT  </w:t>
             </w:r>
-          </w:p>
-          <w:p>
             <w:r>
               <w:rPr>
                 <w:rFonts w:ascii="Calibri" w:hAnsi="Calibri"/>
-                <w:color w:val="333333"/>
-                <w:sz w:val="18"/>
+                <w:b w:val="0"/>
+                <w:i w:val="0"/>
+                <w:color w:val="B0E8C0"/>
+                <w:sz w:val="22"/>
               </w:rPr>
-              <w:t>→ Retail: Online-Einstieg ab CHF 50 — niedrigschwellig</w:t>
-              <w:br/>
-              <w:t>→ Professionell: Direktabschluss nach Gespräch mit Viktor &amp; Lydia</w:t>
-              <w:br/>
-              <w:t>→ Conversion-Ads (Phase 2, wenn Fundament steht)</w:t>
+              <w:t>— Beastly hat einen neuen Investor.</w:t>
             </w:r>
           </w:p>
         </w:tc>
+      </w:tr>
+    </w:tbl>
+    <w:p>
+      <w:pPr>
+        <w:spacing w:after="80"/>
+      </w:pPr>
+    </w:p>
+    <w:p>
+      <w:pPr>
+        <w:spacing w:before="40" w:after="40"/>
+        <w:jc w:val="center"/>
+      </w:pPr>
+      <w:r>
+        <w:rPr>
+          <w:rFonts w:ascii="Calibri" w:hAnsi="Calibri"/>
+          <w:b w:val="0"/>
+          <w:i w:val="0"/>
+          <w:color w:val="A176F4"/>
+          <w:sz w:val="28"/>
+        </w:rPr>
+        <w:t>▼</w:t>
+      </w:r>
+    </w:p>
+    <w:tbl>
+      <w:tblPr>
+        <w:tblStyle w:val="TableGrid"/>
+        <w:tblW w:type="auto" w:w="0"/>
+        <w:tblLook w:firstColumn="1" w:firstRow="1" w:lastColumn="0" w:lastRow="0" w:noHBand="0" w:noVBand="1" w:val="04A0"/>
+      </w:tblPr>
+      <w:tblGrid>
+        <w:gridCol w:w="8612"/>
+      </w:tblGrid>
+      <w:tr>
         <w:tc>
           <w:tcPr>
-            <w:tcW w:type="dxa" w:w="2871"/>
-            <w:shd w:val="clear" w:color="auto" w:fill="F7F3FF"/>
+            <w:tcW w:type="dxa" w:w="8612"/>
+            <w:shd w:val="clear" w:color="auto" w:fill="2D1B5E"/>
             <w:tcMar>
-              <w:top w:w="90" w:type="dxa"/>
-              <w:bottom w:w="90" w:type="dxa"/>
-              <w:left w:w="100" w:type="dxa"/>
-              <w:right w:w="100" w:type="dxa"/>
+              <w:top w:w="100" w:type="dxa"/>
+              <w:bottom w:w="100" w:type="dxa"/>
+              <w:left w:w="140" w:type="dxa"/>
+              <w:right w:w="140" w:type="dxa"/>
             </w:tcMar>
           </w:tcPr>
           <w:p>
@@ -2532,56 +3230,59 @@
               <w:rPr>
                 <w:rFonts w:ascii="Calibri" w:hAnsi="Calibri"/>
                 <w:b/>
-                <w:color w:val="4B319B"/>
-                <w:sz w:val="16"/>
+                <w:i w:val="0"/>
+                <w:color w:val="A176F4"/>
+                <w:sz w:val="21"/>
               </w:rPr>
-              <w:t>BOTSCHAFT</w:t>
+              <w:t>POST-INVESTMENT — Bindung &amp; Weiterempfehlung</w:t>
             </w:r>
           </w:p>
           <w:p>
             <w:r>
               <w:rPr>
                 <w:rFonts w:ascii="Calibri" w:hAnsi="Calibri"/>
-                <w:color w:val="333333"/>
-                <w:sz w:val="18"/>
+                <w:b w:val="0"/>
+                <w:i w:val="0"/>
+                <w:color w:val="E0D8FF"/>
+                <w:sz w:val="19"/>
               </w:rPr>
-              <w:t>«Jetzt investieren.»  /  «Wirkung ab CHF 50.»  /  Klare, einfache Handlungsaufforderung.</w:t>
-            </w:r>
-          </w:p>
-        </w:tc>
-        <w:tc>
-          <w:tcPr>
-            <w:tcW w:type="dxa" w:w="2871"/>
-            <w:shd w:val="clear" w:color="auto" w:fill="F7F3FF"/>
-            <w:tcMar>
-              <w:top w:w="90" w:type="dxa"/>
-              <w:bottom w:w="90" w:type="dxa"/>
-              <w:left w:w="100" w:type="dxa"/>
-              <w:right w:w="100" w:type="dxa"/>
-            </w:tcMar>
-          </w:tcPr>
-          <w:p>
-            <w:r>
-              <w:rPr>
-                <w:rFonts w:ascii="Calibri" w:hAnsi="Calibri"/>
-                <w:b/>
-                <w:color w:val="4B319B"/>
-                <w:sz w:val="16"/>
-              </w:rPr>
-              <w:t>ZUR NÄCHSTEN STUFE</w:t>
+              <w:t>→  Wirkungskommunikation: Welche Projekte wurden unterstützt, was hat das ausgelöst?</w:t>
             </w:r>
           </w:p>
           <w:p>
             <w:r>
               <w:rPr>
                 <w:rFonts w:ascii="Calibri" w:hAnsi="Calibri"/>
-                <w:color w:val="333333"/>
-                <w:sz w:val="18"/>
+                <w:b w:val="0"/>
+                <w:i w:val="0"/>
+                <w:color w:val="E0D8FF"/>
+                <w:sz w:val="19"/>
               </w:rPr>
-              <w:t>Ziel: Investmententscheidung auslösen. Retail ohne Hürden. Professionell mit Begleitung.</w:t>
-              <w:br/>
-              <w:br/>
-              <w:t>Wer kommt weiter? Alle, die sich entschieden haben — Retail digital, Profis über persönlichen Kontakt.</w:t>
+              <w:t>→  Transparenz-Updates: Jahresbericht, Mittelverwendung, Portfolio-Entwicklung</w:t>
+            </w:r>
+          </w:p>
+          <w:p>
+            <w:r>
+              <w:rPr>
+                <w:rFonts w:ascii="Calibri" w:hAnsi="Calibri"/>
+                <w:b w:val="0"/>
+                <w:i w:val="0"/>
+                <w:color w:val="E0D8FF"/>
+                <w:sz w:val="19"/>
+              </w:rPr>
+              <w:t>→  Einladung zu Events und Moments (Swiss Funds Anlass, Tierschutz-Momente)</w:t>
+            </w:r>
+          </w:p>
+          <w:p>
+            <w:r>
+              <w:rPr>
+                <w:rFonts w:ascii="Calibri" w:hAnsi="Calibri"/>
+                <w:b w:val="0"/>
+                <w:i w:val="0"/>
+                <w:color w:val="E0D8FF"/>
+                <w:sz w:val="19"/>
+              </w:rPr>
+              <w:t>→  Weiterempfehlung: Zufriedene Investoren sind der stärkste Kanal</w:t>
             </w:r>
           </w:p>
         </w:tc>
@@ -2589,7 +3290,7 @@
     </w:tbl>
     <w:p>
       <w:pPr>
-        <w:spacing w:after="120"/>
+        <w:spacing w:after="160"/>
       </w:pPr>
     </w:p>
     <w:p>
@@ -2599,6 +3300,11 @@
           <w:bottom w:val="single" w:sz="4" w:space="1" w:color="a176f4"/>
         </w:pBdr>
       </w:pPr>
+    </w:p>
+    <w:p>
+      <w:r>
+        <w:br w:type="page"/>
+      </w:r>
     </w:p>
     <w:p>
       <w:pPr>
@@ -2627,7 +3333,7 @@
           <w:color w:val="333333"/>
           <w:sz w:val="21"/>
         </w:rPr>
-        <w:t>Die acht Kommunikationselemente sind nach der Umsetzungslogik priorisiert: Fundament → Marke → Botschaft → Sichtbarkeit → Reichweite. Jedes Element enthält die strategische Begründung — das Warum ist ebenso wichtig wie das Was.</w:t>
+        <w:t>Die acht Kommunikationselemente sind nach der Umsetzungslogik priorisiert: Fundament → Marke → Sichtbarkeit → Reichweite. Jedes Element enthält die strategische Begründung.</w:t>
       </w:r>
     </w:p>
     <w:p>
@@ -2657,22 +3363,7 @@
           <w:color w:val="333333"/>
           <w:sz w:val="21"/>
         </w:rPr>
-        <w:t>Das Branding-System steht: DM Sans, Farbpalette (Navy #142233 / Clay #BD5435 / Ivory #F7EFE0 + 8 Sekundärfarben), drei Logo-Varianten. Das visuelle Grundsystem ist stark. Die strategische Aufgabe ist jetzt, die Rollentrennung sauber visuell zu verankern: Beastly als emotionaler Markenauftritt, Chipiron als diskreter Absender. Solange diese Architektur nicht klar geführt wird, sendet jede Massnahme ein widersprüchliches Signal.</w:t>
-      </w:r>
-    </w:p>
-    <w:p>
-      <w:pPr>
-        <w:spacing w:after="140"/>
-      </w:pPr>
-      <w:r>
-        <w:rPr>
-          <w:rFonts w:ascii="Calibri" w:hAnsi="Calibri"/>
-          <w:b w:val="0"/>
-          <w:i w:val="0"/>
-          <w:color w:val="333333"/>
-          <w:sz w:val="21"/>
-        </w:rPr>
-        <w:t>Die duale Bildwelt (starke vs. schützenswerte Tiere) muss als konsistentes visuelles System ausgebaut werden — nicht als einmaliger Designentscheid.</w:t>
+        <w:t>Das Branding-System steht: DM Sans, Farbpalette (Navy #142233 / Clay #BD5435 / Ivory #F7EFE0), drei Logo-Varianten. Die strategische Aufgabe ist jetzt die Rollentrennung visuell zu verankern: Beastly als emotionaler Markenauftritt, Chipiron als diskreter Absender am Rande. Die duale Bildwelt (starke vs. schützenswerte Tiere) wird als konsistentes visuelles System ausgebaut — nicht als einmaliger Designentscheid.</w:t>
       </w:r>
     </w:p>
     <w:tbl>
@@ -2715,7 +3406,7 @@
                 <w:color w:val="1A1033"/>
                 <w:sz w:val="19"/>
               </w:rPr>
-              <w:t>Das Branding ist die Sprache, in der alles andere kommuniziert wird. Ohne saubere Rollenklärung auf visueller Ebene ist jeder Kanal inkonsistent. Erst wenn die Markenarchitektur klar ist, kann konsequent gebaut werden.</w:t>
+              <w:t>Solange die Markenarchitektur visuell nicht klar ist, sendet jede Massnahme ein widersprüchliches Signal. Das Branding ist die Sprache, in der alles andere kommuniziert wird.</w:t>
             </w:r>
           </w:p>
         </w:tc>
@@ -2753,22 +3444,7 @@
           <w:color w:val="333333"/>
           <w:sz w:val="21"/>
         </w:rPr>
-        <w:t>Die Website ist nicht der Akquise-Kanal, sondern der Vertrauensschritt im Funnel. Sie wird von Menschen besucht, die sich bereits interessieren und mehr wissen wollen. Heute zeigt die Seite Werte, aber lebt sie nicht: Gesichter fehlen, die Gründerstory ist kaum sichtbar, die Substanz (Löhne, Mittelverwendung, Projektstruktur) ist nicht direkt zugänglich.</w:t>
-      </w:r>
-    </w:p>
-    <w:p>
-      <w:pPr>
-        <w:spacing w:after="140"/>
-      </w:pPr>
-      <w:r>
-        <w:rPr>
-          <w:rFonts w:ascii="Calibri" w:hAnsi="Calibri"/>
-          <w:b w:val="0"/>
-          <w:i w:val="0"/>
-          <w:color w:val="333333"/>
-          <w:sz w:val="21"/>
-        </w:rPr>
-        <w:t>Das Design wird überarbeitet (Fabio erarbeitet das visuelle Mockup parallel zu dieser Strategie — es wird als Bestandteil dieser Strategie ergänzt). Inhaltlich wird volle Transparenz als sichtbare Stärke direkt zugänglich gemacht, nicht gestaffelt.</w:t>
+        <w:t>Die Website ist der Vertrauensschritt im Funnel — kein Akquise-Instrument. Sie wird von Menschen besucht, die sich bereits interessieren und mehr wissen wollen. Heute zeigt die Seite Werte, aber lebt sie nicht: Gesichter fehlen, die Gründerstory ist kaum sichtbar, die Substanz ist nicht direkt zugänglich. Das visuelle Konzept wird durch Fabio parallel erarbeitet und als Bestandteil dieser Strategie ergänzt. Inhaltlich: volle Transparenz direkt sichtbar — nicht gestaffelt.</w:t>
       </w:r>
     </w:p>
     <w:tbl>
@@ -2811,7 +3487,7 @@
                 <w:color w:val="1A1033"/>
                 <w:sz w:val="19"/>
               </w:rPr>
-              <w:t>Die Webseite ist der einzige Ort, der vollständig kontrolliert wird. Sie muss die Vertrauensfrage beantworten — nicht durch Versprechen, sondern durch Beweis. Wer die Seite verlässt ohne Vertrauen gewonnen zu haben, investiert nicht.</w:t>
+              <w:t>Die Website ist der einzige vollständig kontrollierbare Kommunikationskanal. Sie muss die Vertrauensfrage beantworten — durch Beweis, nicht durch Versprechen.</w:t>
             </w:r>
           </w:p>
         </w:tc>
@@ -2849,7 +3525,22 @@
           <w:color w:val="333333"/>
           <w:sz w:val="21"/>
         </w:rPr>
-        <w:t>Viktor baut ein LinkedIn-Profil als öffentliche Persönlichkeit auf — mit doppeltem Auftrag: Aufmerksamkeit generieren und Vertrauen aufbauen. Lydia flankiert, Viktor ist der Hauptakteur. Sein Profil ist kein ergänzendes Instrument — es ist der wichtigste Kommunikationskanal in der gesamten Strategie.</w:t>
+        <w:t>Viktor Ackermann soll ein öffentliches LinkedIn-Profil als eigenständige Persönlichkeit aufbauen. Nicht als «CEO von Beastly», sondern als Mensch mit einer Überzeugung. Lydia flankiert — Viktor ist der Hauptakteur.</w:t>
+      </w:r>
+    </w:p>
+    <w:p>
+      <w:pPr>
+        <w:spacing w:before="160" w:after="60"/>
+      </w:pPr>
+      <w:r>
+        <w:rPr>
+          <w:rFonts w:ascii="Calibri" w:hAnsi="Calibri"/>
+          <w:b/>
+          <w:i w:val="0"/>
+          <w:color w:val="142233"/>
+          <w:sz w:val="21"/>
+        </w:rPr>
+        <w:t>Was macht Viktors Profil aus?</w:t>
       </w:r>
     </w:p>
     <w:p>
@@ -2864,7 +3555,193 @@
           <w:color w:val="333333"/>
           <w:sz w:val="21"/>
         </w:rPr>
-        <w:t>Personenzentriertes Content: Haltung, Gründerstory, FourGive-Momente, Investment-Reflexionen. Nicht selbst-promotend, sondern überzeugend durch Substanz.</w:t>
+        <w:t>Drei Ebenen prägen seinen Auftritt:</w:t>
+      </w:r>
+    </w:p>
+    <w:p>
+      <w:pPr>
+        <w:pStyle w:val="ListBullet"/>
+        <w:spacing w:after="60"/>
+      </w:pPr>
+      <w:r>
+        <w:rPr>
+          <w:rFonts w:ascii="Calibri" w:hAnsi="Calibri"/>
+          <w:b/>
+          <w:i w:val="0"/>
+          <w:color w:val="333333"/>
+          <w:sz w:val="21"/>
+        </w:rPr>
+        <w:t xml:space="preserve">Haltung  </w:t>
+      </w:r>
+      <w:r>
+        <w:rPr>
+          <w:rFonts w:ascii="Calibri" w:hAnsi="Calibri"/>
+          <w:b w:val="0"/>
+          <w:i w:val="0"/>
+          <w:color w:val="333333"/>
+          <w:sz w:val="21"/>
+        </w:rPr>
+        <w:t>Die persönliche Geschichte: FourGive, Ägypten, die Erkenntnis. Das ist die Gründungsmotivation — sie darf nicht im Kleingedruckten stehen.</w:t>
+      </w:r>
+    </w:p>
+    <w:p>
+      <w:pPr>
+        <w:pStyle w:val="ListBullet"/>
+        <w:spacing w:after="60"/>
+      </w:pPr>
+      <w:r>
+        <w:rPr>
+          <w:rFonts w:ascii="Calibri" w:hAnsi="Calibri"/>
+          <w:b/>
+          <w:i w:val="0"/>
+          <w:color w:val="333333"/>
+          <w:sz w:val="21"/>
+        </w:rPr>
+        <w:t xml:space="preserve">Expertise  </w:t>
+      </w:r>
+      <w:r>
+        <w:rPr>
+          <w:rFonts w:ascii="Calibri" w:hAnsi="Calibri"/>
+          <w:b w:val="0"/>
+          <w:i w:val="0"/>
+          <w:color w:val="333333"/>
+          <w:sz w:val="21"/>
+        </w:rPr>
+        <w:t>Investment-Perspektive: Wie denkt Viktor über Kapitalallokation, Risiko, Finanzmarkt? Er ist nicht nur Tierschützer — er ist Investor mit Überzeugung.</w:t>
+      </w:r>
+    </w:p>
+    <w:p>
+      <w:pPr>
+        <w:pStyle w:val="ListBullet"/>
+        <w:spacing w:after="60"/>
+      </w:pPr>
+      <w:r>
+        <w:rPr>
+          <w:rFonts w:ascii="Calibri" w:hAnsi="Calibri"/>
+          <w:b/>
+          <w:i w:val="0"/>
+          <w:color w:val="333333"/>
+          <w:sz w:val="21"/>
+        </w:rPr>
+        <w:t xml:space="preserve">Wirkung  </w:t>
+      </w:r>
+      <w:r>
+        <w:rPr>
+          <w:rFonts w:ascii="Calibri" w:hAnsi="Calibri"/>
+          <w:b w:val="0"/>
+          <w:i w:val="0"/>
+          <w:color w:val="333333"/>
+          <w:sz w:val="21"/>
+        </w:rPr>
+        <w:t>Wirkungsebene: Was passiert mit den Projekten? Echte Momente, reale Geschichten, Fortschritte.</w:t>
+      </w:r>
+    </w:p>
+    <w:p>
+      <w:pPr>
+        <w:spacing w:before="160" w:after="60"/>
+      </w:pPr>
+      <w:r>
+        <w:rPr>
+          <w:rFonts w:ascii="Calibri" w:hAnsi="Calibri"/>
+          <w:b/>
+          <w:i w:val="0"/>
+          <w:color w:val="142233"/>
+          <w:sz w:val="21"/>
+        </w:rPr>
+        <w:t>Was wird nicht gemacht?</w:t>
+      </w:r>
+    </w:p>
+    <w:p>
+      <w:pPr>
+        <w:pStyle w:val="ListBullet"/>
+        <w:spacing w:after="60"/>
+      </w:pPr>
+      <w:r>
+        <w:rPr>
+          <w:rFonts w:ascii="Calibri" w:hAnsi="Calibri"/>
+          <w:b w:val="0"/>
+          <w:i w:val="0"/>
+          <w:color w:val="333333"/>
+          <w:sz w:val="21"/>
+        </w:rPr>
+        <w:t>Keine Werbeposts für Beastly («Investiert jetzt!»)</w:t>
+      </w:r>
+    </w:p>
+    <w:p>
+      <w:pPr>
+        <w:pStyle w:val="ListBullet"/>
+        <w:spacing w:after="60"/>
+      </w:pPr>
+      <w:r>
+        <w:rPr>
+          <w:rFonts w:ascii="Calibri" w:hAnsi="Calibri"/>
+          <w:b w:val="0"/>
+          <w:i w:val="0"/>
+          <w:color w:val="333333"/>
+          <w:sz w:val="21"/>
+        </w:rPr>
+        <w:t>Kein aktivistischer Ton («Tierleid muss aufhören!»)</w:t>
+      </w:r>
+    </w:p>
+    <w:p>
+      <w:pPr>
+        <w:pStyle w:val="ListBullet"/>
+        <w:spacing w:after="60"/>
+      </w:pPr>
+      <w:r>
+        <w:rPr>
+          <w:rFonts w:ascii="Calibri" w:hAnsi="Calibri"/>
+          <w:b w:val="0"/>
+          <w:i w:val="0"/>
+          <w:color w:val="333333"/>
+          <w:sz w:val="21"/>
+        </w:rPr>
+        <w:t>Kein permanentes Selbstmarketing</w:t>
+      </w:r>
+    </w:p>
+    <w:p>
+      <w:pPr>
+        <w:spacing w:before="160" w:after="60"/>
+      </w:pPr>
+      <w:r>
+        <w:rPr>
+          <w:rFonts w:ascii="Calibri" w:hAnsi="Calibri"/>
+          <w:b/>
+          <w:i w:val="0"/>
+          <w:color w:val="142233"/>
+          <w:sz w:val="21"/>
+        </w:rPr>
+        <w:t>Content-Prinzip</w:t>
+      </w:r>
+    </w:p>
+    <w:p>
+      <w:pPr>
+        <w:spacing w:after="140"/>
+      </w:pPr>
+      <w:r>
+        <w:rPr>
+          <w:rFonts w:ascii="Calibri" w:hAnsi="Calibri"/>
+          <w:b w:val="0"/>
+          <w:i w:val="0"/>
+          <w:color w:val="333333"/>
+          <w:sz w:val="21"/>
+        </w:rPr>
+        <w:t>Viktor postet so, wie er spricht: direkt, reflektiert, ohne Schönfärberei. Haltung zeigen, ohne zu predigen. Das ist der schwerste Teil — und der wirkungsvollste.</w:t>
+      </w:r>
+    </w:p>
+    <w:p>
+      <w:pPr>
+        <w:spacing w:after="140"/>
+      </w:pPr>
+      <w:r>
+        <w:rPr>
+          <w:rFonts w:ascii="Calibri" w:hAnsi="Calibri"/>
+          <w:b w:val="0"/>
+          <w:i w:val="0"/>
+          <w:color w:val="333333"/>
+          <w:sz w:val="21"/>
+        </w:rPr>
+        <w:t>Lydia flankiert sichtbar dort, wo es natürlich ist: gemeinsame Momente, FourGive-Besuche, persönliche Statements. Kein erzwungenes Branding.</w:t>
       </w:r>
     </w:p>
     <w:tbl>
@@ -2907,7 +3784,7 @@
                 <w:color w:val="1A1033"/>
                 <w:sz w:val="19"/>
               </w:rPr>
-              <w:t>«Vertrauen entsteht über Menschen, Bilder, Momente und Nahbarkeit.» Persönliche LinkedIn-Profile sind in dieser Grösse um ein Vielfaches wirksamer als Unternehmens- oder Markenprofile. Viktor ist die glaubwürdigste Stimme für Beastly — weil er das Produkt nicht nur führt, sondern lebt. Ohne diese menschliche Ebene bleibt Beastly abstrakt.</w:t>
+              <w:t>Persönliche Profile sind in dieser Grösse und Branche um ein Vielfaches wirksamer als Unternehmensprofile. Viktor ist die glaubwürdigste Stimme für Beastly — weil er das Produkt nicht nur führt, sondern lebt. Ohne diese menschliche Ebene bleibt Beastly abstrakt.</w:t>
             </w:r>
           </w:p>
         </w:tc>
@@ -2930,7 +3807,7 @@
           <w:color w:val="1A1033"/>
           <w:sz w:val="24"/>
         </w:rPr>
-        <w:t>6.4  Repräsentationsmaterial — Pitch Deck</w:t>
+        <w:t>6.4  Kanalstrategie Social Media</w:t>
       </w:r>
     </w:p>
     <w:p>
@@ -2945,7 +3822,682 @@
           <w:color w:val="333333"/>
           <w:sz w:val="21"/>
         </w:rPr>
-        <w:t>Ein emotionales Pitch Deck, das faktisch abholt und gleichzeitig berührt. Viktor und Lydia führen alle Verkaufsgespräche direkt — kein eigenständiges Leave-Behind ist nötig. Das Deck muss die dramaturgische Kurve abbilden: Emotion → Vertrauen → Performance. Die Gründerstory kommt zuerst. Die Struktur kommt danach. Die Zahlen kommen am Ende.</w:t>
+        <w:t>Beastly startet mit LinkedIn — das ist gesetzt. Alle weiteren Kanäle sind kombinierbare Optionen, die zur bestehenden LinkedIn-Basis hinzugenommen werden können, wenn Kapazität und Bereitschaft vorhanden sind.</w:t>
+      </w:r>
+    </w:p>
+    <w:tbl>
+      <w:tblPr>
+        <w:tblStyle w:val="TableGrid"/>
+        <w:tblW w:type="auto" w:w="0"/>
+        <w:tblLook w:firstColumn="1" w:firstRow="1" w:lastColumn="0" w:lastRow="0" w:noHBand="0" w:noVBand="1" w:val="04A0"/>
+      </w:tblPr>
+      <w:tblGrid>
+        <w:gridCol w:w="8612"/>
+      </w:tblGrid>
+      <w:tr>
+        <w:tc>
+          <w:tcPr>
+            <w:tcW w:type="dxa" w:w="8612"/>
+            <w:shd w:val="clear" w:color="auto" w:fill="0A66C2"/>
+            <w:tcMar>
+              <w:top w:w="100" w:type="dxa"/>
+              <w:bottom w:w="100" w:type="dxa"/>
+              <w:left w:w="140" w:type="dxa"/>
+              <w:right w:w="140" w:type="dxa"/>
+            </w:tcMar>
+          </w:tcPr>
+          <w:p>
+            <w:r>
+              <w:rPr>
+                <w:rFonts w:ascii="Calibri" w:hAnsi="Calibri"/>
+                <w:b/>
+                <w:i w:val="0"/>
+                <w:color w:val="FFFFFF"/>
+                <w:sz w:val="22"/>
+              </w:rPr>
+              <w:t>LINKEDIN — Gesetzter Ausgangspunkt (nicht verhandelbar)</w:t>
+            </w:r>
+          </w:p>
+          <w:p>
+            <w:r>
+              <w:rPr>
+                <w:rFonts w:ascii="Calibri" w:hAnsi="Calibri"/>
+                <w:b w:val="0"/>
+                <w:i w:val="0"/>
+                <w:color w:val="FFFFFF"/>
+                <w:sz w:val="19"/>
+              </w:rPr>
+              <w:t>→  Professionelle Zielgruppe ist hier präsent — sowohl Retail-affine als auch institutionelle Investoren</w:t>
+            </w:r>
+          </w:p>
+          <w:p>
+            <w:r>
+              <w:rPr>
+                <w:rFonts w:ascii="Calibri" w:hAnsi="Calibri"/>
+                <w:b w:val="0"/>
+                <w:i w:val="0"/>
+                <w:color w:val="FFFFFF"/>
+                <w:sz w:val="19"/>
+              </w:rPr>
+              <w:t>→  Plattform erlaubt tiefe, substanzielle Inhalte — ideal für Vertrauen und Erklärung</w:t>
+            </w:r>
+          </w:p>
+          <w:p>
+            <w:r>
+              <w:rPr>
+                <w:rFonts w:ascii="Calibri" w:hAnsi="Calibri"/>
+                <w:b w:val="0"/>
+                <w:i w:val="0"/>
+                <w:color w:val="FFFFFF"/>
+                <w:sz w:val="19"/>
+              </w:rPr>
+              <w:t>→  Viktors persönliches Profil und Beastlys Markenkanal sind auf derselben Plattform</w:t>
+            </w:r>
+          </w:p>
+          <w:p>
+            <w:r>
+              <w:rPr>
+                <w:rFonts w:ascii="Calibri" w:hAnsi="Calibri"/>
+                <w:b w:val="0"/>
+                <w:i w:val="0"/>
+                <w:color w:val="FFFFFF"/>
+                <w:sz w:val="19"/>
+              </w:rPr>
+              <w:t>→  Höchste Qualität der Engagements im Vergleich zu anderen Kanälen</w:t>
+            </w:r>
+          </w:p>
+        </w:tc>
+      </w:tr>
+    </w:tbl>
+    <w:p>
+      <w:pPr>
+        <w:spacing w:after="120"/>
+      </w:pPr>
+    </w:p>
+    <w:p>
+      <w:pPr>
+        <w:spacing w:before="160" w:after="60"/>
+      </w:pPr>
+      <w:r>
+        <w:rPr>
+          <w:rFonts w:ascii="Calibri" w:hAnsi="Calibri"/>
+          <w:b/>
+          <w:i w:val="0"/>
+          <w:color w:val="142233"/>
+          <w:sz w:val="21"/>
+        </w:rPr>
+        <w:t>Kombinierbare Erweiterungsoptionen</w:t>
+      </w:r>
+    </w:p>
+    <w:tbl>
+      <w:tblPr>
+        <w:tblStyle w:val="TableGrid"/>
+        <w:tblW w:type="auto" w:w="0"/>
+        <w:tblLook w:firstColumn="1" w:firstRow="1" w:lastColumn="0" w:lastRow="0" w:noHBand="0" w:noVBand="1" w:val="04A0"/>
+      </w:tblPr>
+      <w:tblGrid>
+        <w:gridCol w:w="2871"/>
+        <w:gridCol w:w="2871"/>
+        <w:gridCol w:w="2871"/>
+      </w:tblGrid>
+      <w:tr>
+        <w:tc>
+          <w:tcPr>
+            <w:tcW w:type="dxa" w:w="2871"/>
+            <w:shd w:val="clear" w:color="auto" w:fill="1a1033"/>
+            <w:tcMar>
+              <w:top w:w="80" w:type="dxa"/>
+              <w:bottom w:w="80" w:type="dxa"/>
+              <w:left w:w="100" w:type="dxa"/>
+              <w:right w:w="100" w:type="dxa"/>
+            </w:tcMar>
+          </w:tcPr>
+          <w:p>
+            <w:r>
+              <w:rPr>
+                <w:rFonts w:ascii="Calibri" w:hAnsi="Calibri"/>
+                <w:b/>
+                <w:i w:val="0"/>
+                <w:color w:val="A176F4"/>
+                <w:sz w:val="18"/>
+              </w:rPr>
+              <w:t>KANAL</w:t>
+            </w:r>
+          </w:p>
+        </w:tc>
+        <w:tc>
+          <w:tcPr>
+            <w:tcW w:type="dxa" w:w="2871"/>
+            <w:shd w:val="clear" w:color="auto" w:fill="1a1033"/>
+            <w:tcMar>
+              <w:top w:w="80" w:type="dxa"/>
+              <w:bottom w:w="80" w:type="dxa"/>
+              <w:left w:w="100" w:type="dxa"/>
+              <w:right w:w="100" w:type="dxa"/>
+            </w:tcMar>
+          </w:tcPr>
+          <w:p>
+            <w:r>
+              <w:rPr>
+                <w:rFonts w:ascii="Calibri" w:hAnsi="Calibri"/>
+                <w:b/>
+                <w:i w:val="0"/>
+                <w:color w:val="A176F4"/>
+                <w:sz w:val="18"/>
+              </w:rPr>
+              <w:t>SCHWERPUNKT &amp; INHALT</w:t>
+            </w:r>
+          </w:p>
+        </w:tc>
+        <w:tc>
+          <w:tcPr>
+            <w:tcW w:type="dxa" w:w="2871"/>
+            <w:shd w:val="clear" w:color="auto" w:fill="1a1033"/>
+            <w:tcMar>
+              <w:top w:w="80" w:type="dxa"/>
+              <w:bottom w:w="80" w:type="dxa"/>
+              <w:left w:w="100" w:type="dxa"/>
+              <w:right w:w="100" w:type="dxa"/>
+            </w:tcMar>
+          </w:tcPr>
+          <w:p>
+            <w:r>
+              <w:rPr>
+                <w:rFonts w:ascii="Calibri" w:hAnsi="Calibri"/>
+                <w:b/>
+                <w:i w:val="0"/>
+                <w:color w:val="A176F4"/>
+                <w:sz w:val="18"/>
+              </w:rPr>
+              <w:t>WANN SINNVOLL</w:t>
+            </w:r>
+          </w:p>
+        </w:tc>
+      </w:tr>
+      <w:tr>
+        <w:tc>
+          <w:tcPr>
+            <w:tcW w:type="dxa" w:w="2871"/>
+            <w:shd w:val="clear" w:color="auto" w:fill="EDE8FF"/>
+            <w:tcMar>
+              <w:top w:w="80" w:type="dxa"/>
+              <w:bottom w:w="80" w:type="dxa"/>
+              <w:left w:w="100" w:type="dxa"/>
+              <w:right w:w="100" w:type="dxa"/>
+            </w:tcMar>
+          </w:tcPr>
+          <w:p>
+            <w:r>
+              <w:rPr>
+                <w:rFonts w:ascii="Calibri" w:hAnsi="Calibri"/>
+                <w:b/>
+                <w:i w:val="0"/>
+                <w:color w:val="4B319B"/>
+                <w:sz w:val="20"/>
+              </w:rPr>
+              <w:t>+  INSTAGRAM / META</w:t>
+            </w:r>
+          </w:p>
+        </w:tc>
+        <w:tc>
+          <w:tcPr>
+            <w:tcW w:type="dxa" w:w="2871"/>
+            <w:shd w:val="clear" w:color="auto" w:fill="F8F6FF"/>
+            <w:tcMar>
+              <w:top w:w="80" w:type="dxa"/>
+              <w:bottom w:w="80" w:type="dxa"/>
+              <w:left w:w="100" w:type="dxa"/>
+              <w:right w:w="100" w:type="dxa"/>
+            </w:tcMar>
+          </w:tcPr>
+          <w:p>
+            <w:r>
+              <w:rPr>
+                <w:rFonts w:ascii="Calibri" w:hAnsi="Calibri"/>
+                <w:b w:val="0"/>
+                <w:i w:val="0"/>
+                <w:color w:val="333333"/>
+                <w:sz w:val="19"/>
+              </w:rPr>
+              <w:t>Visueller Schwerpunkt: Dual-Bildwelt, Tierwohl-Momente, FourGive-Geschichten, emotionale Momentaufnahmen. Beide Botschaften (Invest + Tierwohl) — Emotion führt.</w:t>
+            </w:r>
+          </w:p>
+        </w:tc>
+        <w:tc>
+          <w:tcPr>
+            <w:tcW w:type="dxa" w:w="2871"/>
+            <w:shd w:val="clear" w:color="auto" w:fill="F8F6FF"/>
+            <w:tcMar>
+              <w:top w:w="80" w:type="dxa"/>
+              <w:bottom w:w="80" w:type="dxa"/>
+              <w:left w:w="100" w:type="dxa"/>
+              <w:right w:w="100" w:type="dxa"/>
+            </w:tcMar>
+          </w:tcPr>
+          <w:p>
+            <w:r>
+              <w:rPr>
+                <w:rFonts w:ascii="Calibri" w:hAnsi="Calibri"/>
+                <w:b w:val="0"/>
+                <w:i w:val="0"/>
+                <w:color w:val="555555"/>
+                <w:sz w:val="19"/>
+              </w:rPr>
+              <w:t>Wenn visueller Content (Tierbilder, FourGive-Momente) produziert werden kann. Synergie mit Meta-Ads.</w:t>
+            </w:r>
+          </w:p>
+        </w:tc>
+      </w:tr>
+      <w:tr>
+        <w:tc>
+          <w:tcPr>
+            <w:tcW w:type="dxa" w:w="2871"/>
+            <w:shd w:val="clear" w:color="auto" w:fill="EDE8FF"/>
+            <w:tcMar>
+              <w:top w:w="80" w:type="dxa"/>
+              <w:bottom w:w="80" w:type="dxa"/>
+              <w:left w:w="100" w:type="dxa"/>
+              <w:right w:w="100" w:type="dxa"/>
+            </w:tcMar>
+          </w:tcPr>
+          <w:p>
+            <w:r>
+              <w:rPr>
+                <w:rFonts w:ascii="Calibri" w:hAnsi="Calibri"/>
+                <w:b/>
+                <w:i w:val="0"/>
+                <w:color w:val="4B319B"/>
+                <w:sz w:val="20"/>
+              </w:rPr>
+              <w:t>+  TIKTOK</w:t>
+            </w:r>
+          </w:p>
+        </w:tc>
+        <w:tc>
+          <w:tcPr>
+            <w:tcW w:type="dxa" w:w="2871"/>
+            <w:shd w:val="clear" w:color="auto" w:fill="F0EDFF"/>
+            <w:tcMar>
+              <w:top w:w="80" w:type="dxa"/>
+              <w:bottom w:w="80" w:type="dxa"/>
+              <w:left w:w="100" w:type="dxa"/>
+              <w:right w:w="100" w:type="dxa"/>
+            </w:tcMar>
+          </w:tcPr>
+          <w:p>
+            <w:r>
+              <w:rPr>
+                <w:rFonts w:ascii="Calibri" w:hAnsi="Calibri"/>
+                <w:b w:val="0"/>
+                <w:i w:val="0"/>
+                <w:color w:val="333333"/>
+                <w:sz w:val="19"/>
+              </w:rPr>
+              <w:t>Persönlichkeit und Gesichter: kurze, authentische Video-Formate. Viktor erklärt etwas. Ein Moment bei FourGive. Eine ehrliche Reflexion. Roher als LinkedIn.</w:t>
+            </w:r>
+          </w:p>
+        </w:tc>
+        <w:tc>
+          <w:tcPr>
+            <w:tcW w:type="dxa" w:w="2871"/>
+            <w:shd w:val="clear" w:color="auto" w:fill="F0EDFF"/>
+            <w:tcMar>
+              <w:top w:w="80" w:type="dxa"/>
+              <w:bottom w:w="80" w:type="dxa"/>
+              <w:left w:w="100" w:type="dxa"/>
+              <w:right w:w="100" w:type="dxa"/>
+            </w:tcMar>
+          </w:tcPr>
+          <w:p>
+            <w:r>
+              <w:rPr>
+                <w:rFonts w:ascii="Calibri" w:hAnsi="Calibri"/>
+                <w:b w:val="0"/>
+                <w:i w:val="0"/>
+                <w:color w:val="555555"/>
+                <w:sz w:val="19"/>
+              </w:rPr>
+              <w:t>Wenn Viktor bereit ist, sich selbst vor der Kamera zu zeigen. Höchster Produktionsaufwand per Kanal — aber stärkste Persönlichkeitswirkung.</w:t>
+            </w:r>
+          </w:p>
+        </w:tc>
+      </w:tr>
+      <w:tr>
+        <w:tc>
+          <w:tcPr>
+            <w:tcW w:type="dxa" w:w="2871"/>
+          </w:tcPr>
+          <w:p/>
+        </w:tc>
+        <w:tc>
+          <w:tcPr>
+            <w:tcW w:type="dxa" w:w="2871"/>
+          </w:tcPr>
+          <w:p/>
+        </w:tc>
+        <w:tc>
+          <w:tcPr>
+            <w:tcW w:type="dxa" w:w="2871"/>
+          </w:tcPr>
+          <w:p/>
+        </w:tc>
+      </w:tr>
+    </w:tbl>
+    <w:p>
+      <w:pPr>
+        <w:spacing w:after="120"/>
+      </w:pPr>
+    </w:p>
+    <w:p>
+      <w:pPr>
+        <w:spacing w:before="160" w:after="60"/>
+      </w:pPr>
+      <w:r>
+        <w:rPr>
+          <w:rFonts w:ascii="Calibri" w:hAnsi="Calibri"/>
+          <w:b/>
+          <w:i w:val="0"/>
+          <w:color w:val="142233"/>
+          <w:sz w:val="21"/>
+        </w:rPr>
+        <w:t>Empfohlene Kombinationslogik</w:t>
+      </w:r>
+    </w:p>
+    <w:tbl>
+      <w:tblPr>
+        <w:tblStyle w:val="TableGrid"/>
+        <w:tblW w:type="auto" w:w="0"/>
+        <w:tblLook w:firstColumn="1" w:firstRow="1" w:lastColumn="0" w:lastRow="0" w:noHBand="0" w:noVBand="1" w:val="04A0"/>
+      </w:tblPr>
+      <w:tblGrid>
+        <w:gridCol w:w="4306"/>
+        <w:gridCol w:w="4306"/>
+      </w:tblGrid>
+      <w:tr>
+        <w:tc>
+          <w:tcPr>
+            <w:tcW w:type="dxa" w:w="4306"/>
+            <w:shd w:val="clear" w:color="auto" w:fill="142233"/>
+            <w:tcMar>
+              <w:top w:w="70" w:type="dxa"/>
+              <w:bottom w:w="70" w:type="dxa"/>
+              <w:left w:w="100" w:type="dxa"/>
+              <w:right w:w="100" w:type="dxa"/>
+            </w:tcMar>
+          </w:tcPr>
+          <w:p>
+            <w:r>
+              <w:rPr>
+                <w:rFonts w:ascii="Calibri" w:hAnsi="Calibri"/>
+                <w:b/>
+                <w:i w:val="0"/>
+                <w:color w:val="A176F4"/>
+                <w:sz w:val="18"/>
+              </w:rPr>
+              <w:t>RESSOURCEN / SITUATION</w:t>
+            </w:r>
+          </w:p>
+        </w:tc>
+        <w:tc>
+          <w:tcPr>
+            <w:tcW w:type="dxa" w:w="4306"/>
+            <w:shd w:val="clear" w:color="auto" w:fill="142233"/>
+            <w:tcMar>
+              <w:top w:w="70" w:type="dxa"/>
+              <w:bottom w:w="70" w:type="dxa"/>
+              <w:left w:w="100" w:type="dxa"/>
+              <w:right w:w="100" w:type="dxa"/>
+            </w:tcMar>
+          </w:tcPr>
+          <w:p>
+            <w:r>
+              <w:rPr>
+                <w:rFonts w:ascii="Calibri" w:hAnsi="Calibri"/>
+                <w:b/>
+                <w:i w:val="0"/>
+                <w:color w:val="A176F4"/>
+                <w:sz w:val="18"/>
+              </w:rPr>
+              <w:t>EMPFEHLUNG</w:t>
+            </w:r>
+          </w:p>
+        </w:tc>
+      </w:tr>
+      <w:tr>
+        <w:tc>
+          <w:tcPr>
+            <w:tcW w:type="dxa" w:w="4306"/>
+            <w:shd w:val="clear" w:color="auto" w:fill="F5F3FF"/>
+            <w:tcMar>
+              <w:top w:w="80" w:type="dxa"/>
+              <w:bottom w:w="80" w:type="dxa"/>
+              <w:left w:w="100" w:type="dxa"/>
+              <w:right w:w="100" w:type="dxa"/>
+            </w:tcMar>
+          </w:tcPr>
+          <w:p>
+            <w:r>
+              <w:rPr>
+                <w:rFonts w:ascii="Calibri" w:hAnsi="Calibri"/>
+                <w:b/>
+                <w:i w:val="0"/>
+                <w:color w:val="1A1033"/>
+                <w:sz w:val="19"/>
+              </w:rPr>
+              <w:t>Minimale Ressourcen / Startphase</w:t>
+            </w:r>
+          </w:p>
+        </w:tc>
+        <w:tc>
+          <w:tcPr>
+            <w:tcW w:type="dxa" w:w="4306"/>
+            <w:shd w:val="clear" w:color="auto" w:fill="F5F3FF"/>
+            <w:tcMar>
+              <w:top w:w="80" w:type="dxa"/>
+              <w:bottom w:w="80" w:type="dxa"/>
+              <w:left w:w="100" w:type="dxa"/>
+              <w:right w:w="100" w:type="dxa"/>
+            </w:tcMar>
+          </w:tcPr>
+          <w:p>
+            <w:r>
+              <w:rPr>
+                <w:rFonts w:ascii="Calibri" w:hAnsi="Calibri"/>
+                <w:b w:val="0"/>
+                <w:i w:val="0"/>
+                <w:color w:val="333333"/>
+                <w:sz w:val="19"/>
+              </w:rPr>
+              <w:t>LinkedIn allein (Viktor Profil + Beastly Markenkanal) — Fokus, Konsistenz, Qualität über Quantität.</w:t>
+            </w:r>
+          </w:p>
+        </w:tc>
+      </w:tr>
+      <w:tr>
+        <w:tc>
+          <w:tcPr>
+            <w:tcW w:type="dxa" w:w="4306"/>
+            <w:shd w:val="clear" w:color="auto" w:fill="EEF0FF"/>
+            <w:tcMar>
+              <w:top w:w="80" w:type="dxa"/>
+              <w:bottom w:w="80" w:type="dxa"/>
+              <w:left w:w="100" w:type="dxa"/>
+              <w:right w:w="100" w:type="dxa"/>
+            </w:tcMar>
+          </w:tcPr>
+          <w:p>
+            <w:r>
+              <w:rPr>
+                <w:rFonts w:ascii="Calibri" w:hAnsi="Calibri"/>
+                <w:b/>
+                <w:i w:val="0"/>
+                <w:color w:val="1A1033"/>
+                <w:sz w:val="19"/>
+              </w:rPr>
+              <w:t>Moderate Ressourcen / visueller Content vorhanden</w:t>
+            </w:r>
+          </w:p>
+        </w:tc>
+        <w:tc>
+          <w:tcPr>
+            <w:tcW w:type="dxa" w:w="4306"/>
+            <w:shd w:val="clear" w:color="auto" w:fill="EEF0FF"/>
+            <w:tcMar>
+              <w:top w:w="80" w:type="dxa"/>
+              <w:bottom w:w="80" w:type="dxa"/>
+              <w:left w:w="100" w:type="dxa"/>
+              <w:right w:w="100" w:type="dxa"/>
+            </w:tcMar>
+          </w:tcPr>
+          <w:p>
+            <w:r>
+              <w:rPr>
+                <w:rFonts w:ascii="Calibri" w:hAnsi="Calibri"/>
+                <w:b w:val="0"/>
+                <w:i w:val="0"/>
+                <w:color w:val="333333"/>
+                <w:sz w:val="19"/>
+              </w:rPr>
+              <w:t>LinkedIn + Instagram — visuelle Tierwohl-Inhalte ergänzen den textlastigen LinkedIn-Auftritt. Synergie mit Meta-Ads.</w:t>
+            </w:r>
+          </w:p>
+        </w:tc>
+      </w:tr>
+      <w:tr>
+        <w:tc>
+          <w:tcPr>
+            <w:tcW w:type="dxa" w:w="4306"/>
+            <w:shd w:val="clear" w:color="auto" w:fill="F5F3FF"/>
+            <w:tcMar>
+              <w:top w:w="80" w:type="dxa"/>
+              <w:bottom w:w="80" w:type="dxa"/>
+              <w:left w:w="100" w:type="dxa"/>
+              <w:right w:w="100" w:type="dxa"/>
+            </w:tcMar>
+          </w:tcPr>
+          <w:p>
+            <w:r>
+              <w:rPr>
+                <w:rFonts w:ascii="Calibri" w:hAnsi="Calibri"/>
+                <w:b/>
+                <w:i w:val="0"/>
+                <w:color w:val="1A1033"/>
+                <w:sz w:val="19"/>
+              </w:rPr>
+              <w:t>Volle Kapazität / nach erstem Fundament</w:t>
+            </w:r>
+          </w:p>
+        </w:tc>
+        <w:tc>
+          <w:tcPr>
+            <w:tcW w:type="dxa" w:w="4306"/>
+            <w:shd w:val="clear" w:color="auto" w:fill="F5F3FF"/>
+            <w:tcMar>
+              <w:top w:w="80" w:type="dxa"/>
+              <w:bottom w:w="80" w:type="dxa"/>
+              <w:left w:w="100" w:type="dxa"/>
+              <w:right w:w="100" w:type="dxa"/>
+            </w:tcMar>
+          </w:tcPr>
+          <w:p>
+            <w:r>
+              <w:rPr>
+                <w:rFonts w:ascii="Calibri" w:hAnsi="Calibri"/>
+                <w:b w:val="0"/>
+                <w:i w:val="0"/>
+                <w:color w:val="333333"/>
+                <w:sz w:val="19"/>
+              </w:rPr>
+              <w:t>LinkedIn + Instagram + TikTok — erst wenn das Fundament steht, die Botschaften klar sind und Produktionskapazität vorhanden ist.</w:t>
+            </w:r>
+          </w:p>
+        </w:tc>
+      </w:tr>
+    </w:tbl>
+    <w:p>
+      <w:pPr>
+        <w:spacing w:after="80"/>
+      </w:pPr>
+    </w:p>
+    <w:tbl>
+      <w:tblPr>
+        <w:tblStyle w:val="TableGrid"/>
+        <w:tblW w:type="auto" w:w="0"/>
+        <w:tblLook w:firstColumn="1" w:firstRow="1" w:lastColumn="0" w:lastRow="0" w:noHBand="0" w:noVBand="1" w:val="04A0"/>
+      </w:tblPr>
+      <w:tblGrid>
+        <w:gridCol w:w="8612"/>
+      </w:tblGrid>
+      <w:tr>
+        <w:tc>
+          <w:tcPr>
+            <w:tcW w:type="dxa" w:w="8612"/>
+            <w:shd w:val="clear" w:color="auto" w:fill="EDF2FB"/>
+            <w:tcMar>
+              <w:top w:w="80" w:type="dxa"/>
+              <w:bottom w:w="80" w:type="dxa"/>
+              <w:left w:w="120" w:type="dxa"/>
+              <w:right w:w="120" w:type="dxa"/>
+            </w:tcMar>
+          </w:tcPr>
+          <w:p>
+            <w:r>
+              <w:rPr>
+                <w:rFonts w:ascii="Calibri" w:hAnsi="Calibri"/>
+                <w:b/>
+                <w:i w:val="0"/>
+                <w:color w:val="4B319B"/>
+                <w:sz w:val="17"/>
+              </w:rPr>
+              <w:t xml:space="preserve">WARUM  </w:t>
+            </w:r>
+            <w:r>
+              <w:rPr>
+                <w:rFonts w:ascii="Calibri" w:hAnsi="Calibri"/>
+                <w:b w:val="0"/>
+                <w:i w:val="0"/>
+                <w:color w:val="1A1033"/>
+                <w:sz w:val="19"/>
+              </w:rPr>
+              <w:t>Nicht «alle Kanäle, weil man dann überall präsent ist» — sondern «der richtige Kanal mit der richtigen Energie». Beastly ist ein erklärungsbedürftiges Produkt. Mehr Kanäle bedeuten mehr Komplexität, mehr Inkonsistenz-Risiko und mehr Produktionsaufwand. LinkedIn ist die einzige Plattform, wo alle Zielgruppen gleichzeitig präsent sind und wo Tiefe möglich ist. Alles andere ist Erweiterung — nicht Ersatz.</w:t>
+            </w:r>
+          </w:p>
+        </w:tc>
+      </w:tr>
+    </w:tbl>
+    <w:p>
+      <w:pPr>
+        <w:spacing w:after="80"/>
+      </w:pPr>
+    </w:p>
+    <w:p>
+      <w:pPr>
+        <w:spacing w:before="240" w:after="80"/>
+      </w:pPr>
+      <w:r>
+        <w:rPr>
+          <w:rFonts w:ascii="Calibri" w:hAnsi="Calibri"/>
+          <w:b/>
+          <w:i w:val="0"/>
+          <w:color w:val="1A1033"/>
+          <w:sz w:val="24"/>
+        </w:rPr>
+        <w:t>6.5  Repräsentationsmaterial — Pitch Deck</w:t>
+      </w:r>
+    </w:p>
+    <w:p>
+      <w:pPr>
+        <w:spacing w:after="140"/>
+      </w:pPr>
+      <w:r>
+        <w:rPr>
+          <w:rFonts w:ascii="Calibri" w:hAnsi="Calibri"/>
+          <w:b w:val="0"/>
+          <w:i w:val="0"/>
+          <w:color w:val="333333"/>
+          <w:sz w:val="21"/>
+        </w:rPr>
+        <w:t>Ein emotionales Pitch Deck, das faktisch abholt und gleichzeitig berührt. Viktor und Lydia führen alle Verkaufsgespräche direkt — kein eigenständiges Leave-Behind ist nötig. Das Deck muss die dramaturgische Kurve abbilden: Emotion → Vertrauen → Performance. Die Gründerstory kommt zuerst. Die Struktur danach. Die Zahlen am Ende.</w:t>
       </w:r>
     </w:p>
     <w:tbl>
@@ -2988,7 +4540,7 @@
                 <w:color w:val="1A1033"/>
                 <w:sz w:val="19"/>
               </w:rPr>
-              <w:t>Wer emotional berührt wird, hört zu. Wer vertraut, prüft. Wer überzeugt ist, investiert. Ein rein faktisches Pitch Deck überspringt die ersten beiden Stufen — und verliert genau die Investoren, die eigentlich offen wären.</w:t>
+              <w:t>Wer emotional berührt wird, hört zu. Wer vertraut, prüft. Wer überzeugt ist, investiert. Ein rein faktisches Deck überspringt die ersten zwei Stufen.</w:t>
             </w:r>
           </w:p>
         </w:tc>
@@ -3011,7 +4563,7 @@
           <w:color w:val="1A1033"/>
           <w:sz w:val="24"/>
         </w:rPr>
-        <w:t>6.5  Partnerschaften — FourGive</w:t>
+        <w:t>6.6  Partnerschaften — FourGive</w:t>
       </w:r>
     </w:p>
     <w:p>
@@ -3026,7 +4578,7 @@
           <w:color w:val="333333"/>
           <w:sz w:val="21"/>
         </w:rPr>
-        <w:t>FourGive ist keine akquirierte Partnerschaft — es ist die Gründungsgeschichte. Die Tierklinik, in der die Idee zu Beastly entstand. Genau deshalb ist sie kommunikativ so wertvoll: als lebender Beweis der Überzeugung, nicht als Kampagnenelement. FourGive wird eines der fünf Tierschutzprojekte 2026 sein. Da die Projekte jährlich wechseln, wird es nicht als feste Partnerschaft kommuniziert, sondern als prägender Bestandteil der Gründerstory.</w:t>
+        <w:t>FourGive ist keine akquirierte Partnerschaft — es ist die Gründungsgeschichte. Die Tierklinik, in der die Idee zu Beastly entstand, und prägender Bestandteil der persönlichen Entwicklung von Viktor und Lydia. FourGive wird eines der fünf Tierschutzprojekte 2026 sein. Da die Projekte jährlich wechseln, kommunizieren wir es nicht als feste Partnerschaft, sondern als Teil der Gründerstory. Als eigener Kommunikationskanal wird FourGive vorerst nicht bespielt — das ist ein späterer Schritt.</w:t>
       </w:r>
     </w:p>
     <w:tbl>
@@ -3069,7 +4621,7 @@
                 <w:color w:val="1A1033"/>
                 <w:sz w:val="19"/>
               </w:rPr>
-              <w:t>FourGive darf nie instrumentalisiert werden — das würde die Echtheit zerstören, die Beastly ausmacht. Der Wert liegt in der Authentizität, nicht in der Verwendung als Marketinginstrument.</w:t>
+              <w:t>FourGive darf nie instrumentalisiert werden — das würde die Echtheit zerstören, die Beastly ausmacht. Der Wert liegt in der Authentizität, nicht in der Verwertung als Marketing-Asset.</w:t>
             </w:r>
           </w:p>
         </w:tc>
@@ -3092,7 +4644,7 @@
           <w:color w:val="1A1033"/>
           <w:sz w:val="24"/>
         </w:rPr>
-        <w:t>6.6  Social Media Posting — drei Kanäle</w:t>
+        <w:t>6.7  Events</w:t>
       </w:r>
     </w:p>
     <w:p>
@@ -3107,13 +4659,12 @@
           <w:color w:val="333333"/>
           <w:sz w:val="21"/>
         </w:rPr>
-        <w:t>Drei Kanäle, unterschiedliche Schwerpunkte — alle kommunizieren immer beide Botschaften: Investieren UND Tierwohl.</w:t>
+        <w:t>Im September 2026 bietet sich eine konkrete Auftrittschance an einem relevanten Anlass im Schweizer Finanzumfeld — nicht als Veranstalter, sondern als Präsenz. Beastly zeigt sich, steht aber nicht im Mittelpunkt. Strategisches Ziel: erste Sichtbarkeit im richtigen Umfeld aufbauen, Vertrauen durch Vernetzung gewinnen.</w:t>
       </w:r>
     </w:p>
     <w:p>
       <w:pPr>
-        <w:pStyle w:val="ListBullet"/>
-        <w:spacing w:after="60"/>
+        <w:spacing w:after="140"/>
       </w:pPr>
       <w:r>
         <w:rPr>
@@ -3123,54 +4674,7 @@
           <w:color w:val="333333"/>
           <w:sz w:val="21"/>
         </w:rPr>
-        <w:t>LinkedIn (Hauptempfehlung): professionell und nahbar, längere Inhalte, Vertrauen und Expertise</w:t>
-      </w:r>
-    </w:p>
-    <w:p>
-      <w:pPr>
-        <w:pStyle w:val="ListBullet"/>
-        <w:spacing w:after="60"/>
-      </w:pPr>
-      <w:r>
-        <w:rPr>
-          <w:rFonts w:ascii="Calibri" w:hAnsi="Calibri"/>
-          <w:b w:val="0"/>
-          <w:i w:val="0"/>
-          <w:color w:val="333333"/>
-          <w:sz w:val="21"/>
-        </w:rPr>
-        <w:t>TikTok (strategische Option): Persönlichkeit und Gesichter im Vordergrund, kurze authentische Formate</w:t>
-      </w:r>
-    </w:p>
-    <w:p>
-      <w:pPr>
-        <w:pStyle w:val="ListBullet"/>
-        <w:spacing w:after="60"/>
-      </w:pPr>
-      <w:r>
-        <w:rPr>
-          <w:rFonts w:ascii="Calibri" w:hAnsi="Calibri"/>
-          <w:b w:val="0"/>
-          <w:i w:val="0"/>
-          <w:color w:val="333333"/>
-          <w:sz w:val="21"/>
-        </w:rPr>
-        <w:t>Instagram/Meta (strategische Option): visuelle Stärke, Schwerpunkt Tierschutz und Emotion</w:t>
-      </w:r>
-    </w:p>
-    <w:p>
-      <w:pPr>
-        <w:spacing w:after="140"/>
-      </w:pPr>
-      <w:r>
-        <w:rPr>
-          <w:rFonts w:ascii="Calibri" w:hAnsi="Calibri"/>
-          <w:b w:val="0"/>
-          <w:i w:val="0"/>
-          <w:color w:val="333333"/>
-          <w:sz w:val="21"/>
-        </w:rPr>
-        <w:t>Der Markenkanal ist der Hintergrund — Viktors Profil ist der Hauptmotor.</w:t>
+        <w:t>Events dieser Art sind keine Launch-Plattformen, sondern Beziehungsmomente. Beastly muss noch nicht alles fertig haben — aber einen klaren, überzeugenden Auftritt vorbereitet haben: einen Gesprächseinstieg, ein sauberes Profil, ein Deck das greifbar ist.</w:t>
       </w:r>
     </w:p>
     <w:tbl>
@@ -3213,7 +4717,7 @@
                 <w:color w:val="1A1033"/>
                 <w:sz w:val="19"/>
               </w:rPr>
-              <w:t>Drei Kanäle weil: unterschiedliche Zielgruppen, unterschiedliche Aggregatzustände. LinkedIn erreicht professionelle Investoren und erlaubt tiefere Inhalte. TikTok ist der ehrlichste Kanal für Persönlichkeit. Instagram übersetzt Tierwohl-Emotionen visuell. Kein Kanal reicht allein.</w:t>
+              <w:t>Ein Netzwerk-Anlass in einem hochwertigem Finanzumfeld ist für Beastly wertvoller als jede bezahlte Medienpräsenz in dieser Phase. Persönliche Gespräche bauen Vertrauen schneller auf als jeder Kanal.</w:t>
             </w:r>
           </w:p>
         </w:tc>
@@ -3236,7 +4740,7 @@
           <w:color w:val="1A1033"/>
           <w:sz w:val="24"/>
         </w:rPr>
-        <w:t>6.7  Events — Swiss Funds Anlass 16.09.2026</w:t>
+        <w:t>6.8  Social Media Ads — zwei Phasen</w:t>
       </w:r>
     </w:p>
     <w:p>
@@ -3251,7 +4755,10 @@
           <w:color w:val="333333"/>
           <w:sz w:val="21"/>
         </w:rPr>
-        <w:t>Der Swiss Funds Anlass von Norbert Bernhard am 16.09.2026 ist nicht Beastlys eigener Event — es ist eine Auftrittschance in einem hochwertigen Umfeld. Mit Simonetta Sommaruga und Norbert Bernhard als Kontext signalisiert dieser Anlass: Das ist genau das Finanzmarkt-Umfeld, in dem Beastly langfristig gehört werden will. Präsenz hier baut Glaubwürdigkeit in der richtigen Community auf — ohne dass Beastly schon alles fertig haben muss.</w:t>
+        <w:t>Phase 1 — Awareness: Reichweite aufbauen, erste Berührungspunkte erzeugen. Primär LinkedIn, Meta für emotionale Tierwohl-Hooks. Ziel ist Grundrauschen, nicht Conversion.</w:t>
+        <w:br/>
+        <w:br/>
+        <w:t>Phase 2 — Conversion: Erst wenn das organische Fundament steht und Vertrauen aufgebaut ist, setzt gezieltes Conversion-Advertising ein. Einstieg ab CHF 50 als konkrete Handlungsaufforderung.</w:t>
       </w:r>
     </w:p>
     <w:tbl>
@@ -3294,103 +4801,7 @@
                 <w:color w:val="1A1033"/>
                 <w:sz w:val="19"/>
               </w:rPr>
-              <w:t>Events dieser Qualität können nicht gebucht werden — sie müssen sich ergeben. Diese Chance strategisch zu nutzen bedeutet: Klar auftreten, offen vernetzen, ohne zu überwältigen. Beastly zeigt sich als seriöser Player, nicht als Pitch.</w:t>
-            </w:r>
-          </w:p>
-        </w:tc>
-      </w:tr>
-    </w:tbl>
-    <w:p>
-      <w:pPr>
-        <w:spacing w:after="80"/>
-      </w:pPr>
-    </w:p>
-    <w:p>
-      <w:pPr>
-        <w:spacing w:before="240" w:after="80"/>
-      </w:pPr>
-      <w:r>
-        <w:rPr>
-          <w:rFonts w:ascii="Calibri" w:hAnsi="Calibri"/>
-          <w:b/>
-          <w:i w:val="0"/>
-          <w:color w:val="1A1033"/>
-          <w:sz w:val="24"/>
-        </w:rPr>
-        <w:t>6.8  Social Media Ads — zwei Phasen</w:t>
-      </w:r>
-    </w:p>
-    <w:p>
-      <w:pPr>
-        <w:spacing w:after="140"/>
-      </w:pPr>
-      <w:r>
-        <w:rPr>
-          <w:rFonts w:ascii="Calibri" w:hAnsi="Calibri"/>
-          <w:b w:val="0"/>
-          <w:i w:val="0"/>
-          <w:color w:val="333333"/>
-          <w:sz w:val="21"/>
-        </w:rPr>
-        <w:t>Phase 1 — Awareness: Reichweite aufbauen, erste Berührungspunkte erzeugen, Grundrauschen schaffen. Vor allem LinkedIn, wo die Klickqualität höher und die professionelle Zielgruppe präsent ist. Meta für emotionale Tierwohl-Hooks.</w:t>
-      </w:r>
-    </w:p>
-    <w:p>
-      <w:pPr>
-        <w:spacing w:after="140"/>
-      </w:pPr>
-      <w:r>
-        <w:rPr>
-          <w:rFonts w:ascii="Calibri" w:hAnsi="Calibri"/>
-          <w:b w:val="0"/>
-          <w:i w:val="0"/>
-          <w:color w:val="333333"/>
-          <w:sz w:val="21"/>
-        </w:rPr>
-        <w:t>Phase 2 — Conversion: Erst wenn das organische Fundament steht und Vertrauen aufgebaut ist, setzt Conversion-Advertising ein. Einstieg ab CHF 50 als konkrete Handlungsaufforderung.</w:t>
-      </w:r>
-    </w:p>
-    <w:tbl>
-      <w:tblPr>
-        <w:tblStyle w:val="TableGrid"/>
-        <w:tblW w:type="auto" w:w="0"/>
-        <w:tblLook w:firstColumn="1" w:firstRow="1" w:lastColumn="0" w:lastRow="0" w:noHBand="0" w:noVBand="1" w:val="04A0"/>
-      </w:tblPr>
-      <w:tblGrid>
-        <w:gridCol w:w="8612"/>
-      </w:tblGrid>
-      <w:tr>
-        <w:tc>
-          <w:tcPr>
-            <w:tcW w:type="dxa" w:w="8612"/>
-            <w:shd w:val="clear" w:color="auto" w:fill="EDF2FB"/>
-            <w:tcMar>
-              <w:top w:w="80" w:type="dxa"/>
-              <w:bottom w:w="80" w:type="dxa"/>
-              <w:left w:w="120" w:type="dxa"/>
-              <w:right w:w="120" w:type="dxa"/>
-            </w:tcMar>
-          </w:tcPr>
-          <w:p>
-            <w:r>
-              <w:rPr>
-                <w:rFonts w:ascii="Calibri" w:hAnsi="Calibri"/>
-                <w:b/>
-                <w:i w:val="0"/>
-                <w:color w:val="4B319B"/>
-                <w:sz w:val="17"/>
-              </w:rPr>
-              <w:t xml:space="preserve">WARUM  </w:t>
-            </w:r>
-            <w:r>
-              <w:rPr>
-                <w:rFonts w:ascii="Calibri" w:hAnsi="Calibri"/>
-                <w:b w:val="0"/>
-                <w:i w:val="0"/>
-                <w:color w:val="1A1033"/>
-                <w:sz w:val="19"/>
-              </w:rPr>
-              <w:t>Wer Conversion-Ads schaltet, bevor das Grundrauschen steht, verbrennt Budget. Wer nur auf organisch setzt, wächst zu langsam. Sequenz ist der Schlüssel: Fundament → organisch → Awareness-Ads → Conversion.</w:t>
+              <w:t>Wer Conversion-Ads schaltet, bevor das Grundrauschen steht, verbrennt Budget. Sequenz ist der Schlüssel: Fundament → organisch → Awareness-Ads → Conversion.</w:t>
             </w:r>
           </w:p>
         </w:tc>
@@ -3441,22 +4852,7 @@
           <w:color w:val="333333"/>
           <w:sz w:val="21"/>
         </w:rPr>
-        <w:t>Beastly invested hat einen starken, eigenständigen und glaubwürdigen Ausgangspunkt: eine klare Gründerüberzeugung, ein relevantes Marktproblem und einen Produktansatz, der Tierschutz und Rendite nicht als Widerspruch versteht.</w:t>
-      </w:r>
-    </w:p>
-    <w:p>
-      <w:pPr>
-        <w:spacing w:after="140"/>
-      </w:pPr>
-      <w:r>
-        <w:rPr>
-          <w:rFonts w:ascii="Calibri" w:hAnsi="Calibri"/>
-          <w:b w:val="0"/>
-          <w:i w:val="0"/>
-          <w:color w:val="333333"/>
-          <w:sz w:val="21"/>
-        </w:rPr>
-        <w:t>Gleichzeitig ist die angestrebte Kommunikation anspruchsvoll, weil mehrere Ebenen gleichzeitig sauber geführt werden müssen:</w:t>
+        <w:t>Beastly invested hat einen starken, eigenständigen und glaubwürdigen Ausgangspunkt: eine klare Gründerüberzeugung, ein relevantes Marktproblem und einen Produktansatz, der Tierschutz und Rendite nicht als Widerspruch versteht. Gleichzeitig ist die Kommunikation anspruchsvoll, weil mehrere Ebenen gleichzeitig sauber geführt werden müssen.</w:t>
       </w:r>
     </w:p>
     <w:p>
@@ -3520,7 +4916,7 @@
           <w:color w:val="333333"/>
           <w:sz w:val="21"/>
         </w:rPr>
-        <w:t>unterschiedliche Zielgruppen: Retail-Investoren, professionelle Investoren, Partner, Medien und kritische Beobachter</w:t>
+        <w:t>unterschiedliche Zielgruppen: Retail-Investoren, professionelle Investoren, Partner, Medien, kritische Beobachter</w:t>
       </w:r>
     </w:p>
     <w:p>
@@ -3540,7 +4936,8 @@
     </w:p>
     <w:p>
       <w:pPr>
-        <w:spacing w:after="140"/>
+        <w:pStyle w:val="ListBullet"/>
+        <w:spacing w:after="60"/>
       </w:pPr>
       <w:r>
         <w:rPr>
@@ -3550,23 +4947,7 @@
           <w:color w:val="333333"/>
           <w:sz w:val="21"/>
         </w:rPr>
-        <w:t>Die Herausforderung liegt darin, Vertrauen aufzubauen, ohne zu überladen:</w:t>
-      </w:r>
-    </w:p>
-    <w:p>
-      <w:pPr>
-        <w:pStyle w:val="ListBullet"/>
-        <w:spacing w:after="60"/>
-      </w:pPr>
-      <w:r>
-        <w:rPr>
-          <w:rFonts w:ascii="Calibri" w:hAnsi="Calibri"/>
-          <w:b w:val="0"/>
-          <w:i w:val="0"/>
-          <w:color w:val="333333"/>
-          <w:sz w:val="21"/>
-        </w:rPr>
-        <w:t>transparent sein, ohne alles offenzulegen</w:t>
+        <w:t>transparent sein, ohne zu überladen</w:t>
       </w:r>
     </w:p>
     <w:p>
@@ -3614,7 +4995,7 @@
           <w:color w:val="333333"/>
           <w:sz w:val="21"/>
         </w:rPr>
-        <w:t>Expertise sichtbar machen, ohne das eigene Know-how vollständig preiszugeben</w:t>
+        <w:t>Expertise sichtbar machen, ohne Know-how vollständig preiszugeben</w:t>
       </w:r>
     </w:p>
     <w:p>
@@ -3630,7 +5011,7 @@
           <w:color w:val="333333"/>
           <w:sz w:val="21"/>
         </w:rPr>
-        <w:t>Klarheit schaffen, ohne die Komplexität des Produkts zu unterschätzen</w:t>
+        <w:t>Klarheit schaffen, ohne Komplexität zu unterschätzen</w:t>
       </w:r>
     </w:p>
     <w:tbl>
@@ -3673,7 +5054,7 @@
                 <w:b w:val="0"/>
                 <w:i w:val="0"/>
                 <w:color w:val="555555"/>
-                <w:sz w:val="19"/>
+                <w:sz w:val="18"/>
               </w:rPr>
               <w:t>— Gedanken aus dem Workshop</w:t>
             </w:r>
@@ -3721,37 +5102,7 @@
           <w:color w:val="333333"/>
           <w:sz w:val="21"/>
         </w:rPr>
-        <w:t>Das Projekt braucht für die nächste Phase eine erfahrene kommunikative Führung — nicht nur operative Marketing-Unterstützung. Die Vision ist stark, das Produkt ist erklärungsbedürftig und die Zielgruppen sind anspruchsvoll. Viele Entscheidungen, die jetzt anstehen, sind strategisch, markenprägend und für die künftige Wahrnehmung entscheidend.</w:t>
-      </w:r>
-    </w:p>
-    <w:p>
-      <w:pPr>
-        <w:spacing w:before="240" w:after="80"/>
-      </w:pPr>
-      <w:r>
-        <w:rPr>
-          <w:rFonts w:ascii="Calibri" w:hAnsi="Calibri"/>
-          <w:b/>
-          <w:i w:val="0"/>
-          <w:color w:val="1A1033"/>
-          <w:sz w:val="24"/>
-        </w:rPr>
-        <w:t>Die externe CMO-Funktion</w:t>
-      </w:r>
-    </w:p>
-    <w:p>
-      <w:pPr>
-        <w:spacing w:after="140"/>
-      </w:pPr>
-      <w:r>
-        <w:rPr>
-          <w:rFonts w:ascii="Calibri" w:hAnsi="Calibri"/>
-          <w:b w:val="0"/>
-          <w:i w:val="0"/>
-          <w:color w:val="333333"/>
-          <w:sz w:val="21"/>
-        </w:rPr>
-        <w:t>Diese Rolle ist vergleichbar mit einer externen CMO-Funktion:</w:t>
+        <w:t>Das Projekt braucht für die nächste Phase eine erfahrene kommunikative Führung — nicht nur operative Marketing-Unterstützung. Die externe CMO-Funktion führt, challengt, übersetzt und entlastet Viktor.</w:t>
       </w:r>
     </w:p>
     <w:p>
@@ -3874,11 +5225,11 @@
         <w:rPr>
           <w:rFonts w:ascii="Calibri" w:hAnsi="Calibri"/>
           <w:b w:val="0"/>
-          <w:i/>
-          <w:color w:val="1A1033"/>
+          <w:i w:val="0"/>
+          <w:color w:val="333333"/>
           <w:sz w:val="21"/>
         </w:rPr>
-        <w:t>Die Vision braucht Nähe zum Gründer. Die Umsetzung braucht klare Entscheidungswege.</w:t>
+        <w:t>1322 bringt die Erfahrung mit, Visionen zu strukturieren, Positionierungen zu schärfen, Kommunikationsarchitekturen aufzubauen und operative Massnahmen auf ein klares strategisches Ziel einzuzahlen. Diese Rolle können wir übernehmen.</w:t>
       </w:r>
     </w:p>
     <w:p>
@@ -3893,52 +5244,7 @@
           <w:color w:val="1A1033"/>
           <w:sz w:val="24"/>
         </w:rPr>
-        <w:t>1322 als externe CMO</w:t>
-      </w:r>
-    </w:p>
-    <w:p>
-      <w:pPr>
-        <w:spacing w:after="140"/>
-      </w:pPr>
-      <w:r>
-        <w:rPr>
-          <w:rFonts w:ascii="Calibri" w:hAnsi="Calibri"/>
-          <w:b w:val="0"/>
-          <w:i w:val="0"/>
-          <w:color w:val="333333"/>
-          <w:sz w:val="21"/>
-        </w:rPr>
-        <w:t>1322 bringt die Erfahrung mit, Visionen zu strukturieren, Positionierungen zu schärfen, Kommunikationsarchitekturen aufzubauen und operative Massnahmen so zu führen, dass sie auf ein klares strategisches Ziel einzahlen. Diese Rolle können wir übernehmen.</w:t>
-      </w:r>
-    </w:p>
-    <w:p>
-      <w:pPr>
-        <w:spacing w:before="240" w:after="80"/>
-      </w:pPr>
-      <w:r>
-        <w:rPr>
-          <w:rFonts w:ascii="Calibri" w:hAnsi="Calibri"/>
-          <w:b/>
-          <w:i w:val="0"/>
-          <w:color w:val="1A1033"/>
-          <w:sz w:val="24"/>
-        </w:rPr>
-        <w:t>Voraussetzungen für eine effiziente Zusammenarbeit</w:t>
-      </w:r>
-    </w:p>
-    <w:p>
-      <w:pPr>
-        <w:spacing w:after="140"/>
-      </w:pPr>
-      <w:r>
-        <w:rPr>
-          <w:rFonts w:ascii="Calibri" w:hAnsi="Calibri"/>
-          <w:b w:val="0"/>
-          <w:i w:val="0"/>
-          <w:color w:val="333333"/>
-          <w:sz w:val="21"/>
-        </w:rPr>
-        <w:t>Damit diese Zusammenarbeit effizient funktioniert, müssen die organisatorischen Grundlagen vorab geklärt sein:</w:t>
+        <w:t>Voraussetzungen</w:t>
       </w:r>
     </w:p>
     <w:p>
@@ -3986,7 +5292,7 @@
           <w:color w:val="333333"/>
           <w:sz w:val="21"/>
         </w:rPr>
-        <w:t>Wer spricht für Chipiron?</w:t>
+        <w:t>Wer spricht für Chipiron / für beastly invested?</w:t>
       </w:r>
     </w:p>
     <w:p>
@@ -4002,23 +5308,7 @@
           <w:color w:val="333333"/>
           <w:sz w:val="21"/>
         </w:rPr>
-        <w:t>Wer spricht für beastly invested?</w:t>
-      </w:r>
-    </w:p>
-    <w:p>
-      <w:pPr>
-        <w:pStyle w:val="ListBullet"/>
-        <w:spacing w:after="60"/>
-      </w:pPr>
-      <w:r>
-        <w:rPr>
-          <w:rFonts w:ascii="Calibri" w:hAnsi="Calibri"/>
-          <w:b w:val="0"/>
-          <w:i w:val="0"/>
-          <w:color w:val="333333"/>
-          <w:sz w:val="21"/>
-        </w:rPr>
-        <w:t>Welche Informationen werden kommunikativ genutzt?</w:t>
+        <w:t>Welche Informationen werden kommunikativ genutzt, welche bleiben intern?</w:t>
       </w:r>
     </w:p>
     <w:p>
@@ -4039,22 +5329,6 @@
     </w:p>
     <w:p>
       <w:pPr>
-        <w:pStyle w:val="ListBullet"/>
-        <w:spacing w:after="60"/>
-      </w:pPr>
-      <w:r>
-        <w:rPr>
-          <w:rFonts w:ascii="Calibri" w:hAnsi="Calibri"/>
-          <w:b w:val="0"/>
-          <w:i w:val="0"/>
-          <w:color w:val="333333"/>
-          <w:sz w:val="21"/>
-        </w:rPr>
-        <w:t>Wer übernimmt welche operative Verantwortung intern?</w:t>
-      </w:r>
-    </w:p>
-    <w:p>
-      <w:pPr>
         <w:spacing w:after="140"/>
       </w:pPr>
       <w:r>
@@ -4062,10 +5336,10 @@
           <w:rFonts w:ascii="Calibri" w:hAnsi="Calibri"/>
           <w:b w:val="0"/>
           <w:i/>
-          <w:color w:val="333333"/>
+          <w:color w:val="1A1033"/>
           <w:sz w:val="21"/>
         </w:rPr>
-        <w:t>Was nicht sinnvoll abgedeckt werden kann: lange Abstimmungsschlaufen, unklare Entscheidungswege oder wiederkehrende Grundsatzdiskussionen innerhalb eines laufenden Umsetzungsmandats.</w:t>
+        <w:t>Die Vision braucht Nähe zum Gründer. Die Umsetzung braucht klare Entscheidungswege.</w:t>
       </w:r>
     </w:p>
     <w:p>
@@ -4103,7 +5377,7 @@
           <w:color w:val="333333"/>
           <w:sz w:val="21"/>
         </w:rPr>
-        <w:t>Die Strategie ist definiert. Die zentrale Frage ist jetzt: Womit fangen wir an — und in welcher Logik? Es gibt drei plausible Einstiegsszenarien, jedes mit anderen Prioritäten, anderen Risiken und anderen Voraussetzungen.</w:t>
+        <w:t>Die Strategie ist definiert. Die zentrale Frage ist: Womit fangen wir an — und in welcher Logik? Drei Einstiegsszenarien, jedes mit anderen Prioritäten und Risiken.</w:t>
       </w:r>
     </w:p>
     <w:p>
@@ -4133,7 +5407,7 @@
           <w:color w:val="333333"/>
           <w:sz w:val="21"/>
         </w:rPr>
-        <w:t>Strategisches Fundament → Markenarchitektur (Beastly/Chipiron/FourGive) → Kernbotschaften → Visuelles System (mit Fabios Mockup) → Website → LinkedIn Viktor → Launch-Moment → Retail-Kampagne.</w:t>
+        <w:t>Markenarchitektur → Kernbotschaften → Fabios Mockup integrieren → Website → Viktor LinkedIn → Events / Ads.</w:t>
       </w:r>
     </w:p>
     <w:p>
@@ -4159,7 +5433,7 @@
           <w:color w:val="333333"/>
           <w:sz w:val="21"/>
         </w:rPr>
-        <w:t>Alles baut auf einem soliden Fundament auf. Konsistenz von Anfang an.</w:t>
+        <w:t>Konsistenz von Anfang an. Alles baut auf sauberem Fundament.</w:t>
       </w:r>
     </w:p>
     <w:p>
@@ -4185,7 +5459,7 @@
           <w:color w:val="333333"/>
           <w:sz w:val="21"/>
         </w:rPr>
-        <w:t>Das 16.09.-Fenster (Swiss Funds Event) könnte verpasst werden, bevor der Auftritt steht. Braucht mehr Zeit und Kapazität in der Startphase.</w:t>
+        <w:t>Das September-Fenster kann zu eng werden, wenn das Fundament zu viel Zeit braucht.</w:t>
       </w:r>
     </w:p>
     <w:p>
@@ -4215,7 +5489,7 @@
           <w:color w:val="333333"/>
           <w:sz w:val="21"/>
         </w:rPr>
-        <w:t>Viktor LinkedIn aufsetzen und mit Content beginnen — sofort, noch bevor alle anderen Elemente fertig sind. Personal Branding als erstes Signal, das Vertrauen und Sichtbarkeit gleichzeitig aufbaut.</w:t>
+        <w:t>Viktor LinkedIn sofort aufsetzen und Content beginnen — auch bevor alle anderen Elemente fertig sind.</w:t>
       </w:r>
     </w:p>
     <w:p>
@@ -4241,7 +5515,7 @@
           <w:color w:val="333333"/>
           <w:sz w:val="21"/>
         </w:rPr>
-        <w:t>Höchste Wirkung bei geringstem initialen Aufwand. Viktor ist ohnehin der Träger — sein Profil braucht keine Produktionsinfrastruktur.</w:t>
+        <w:t>Höchste Wirkung bei geringstem initialem Aufwand. Viktor braucht keine Produktionsinfrastruktur.</w:t>
       </w:r>
     </w:p>
     <w:p>
@@ -4267,7 +5541,7 @@
           <w:color w:val="333333"/>
           <w:sz w:val="21"/>
         </w:rPr>
-        <w:t>Ohne strategische Rahmung (Botschaften, Bildwelt, Rollendefinition) kann der Auftritt inkonsistent werden und späterer Korrektur bedürfen.</w:t>
+        <w:t>Ohne klare Botschaften und Markenarchitektur kann der Auftritt inkonsistent werden.</w:t>
       </w:r>
     </w:p>
     <w:p>
@@ -4282,7 +5556,7 @@
           <w:color w:val="1A1033"/>
           <w:sz w:val="24"/>
         </w:rPr>
-        <w:t>Option C — Event als Ankerpunkt (16.09.2026)</w:t>
+        <w:t>Option C — Event als Ankerpunkt</w:t>
       </w:r>
     </w:p>
     <w:p>
@@ -4297,7 +5571,7 @@
           <w:color w:val="333333"/>
           <w:sz w:val="21"/>
         </w:rPr>
-        <w:t>Rückwärtsplanung vom Swiss Funds Anlass: Was muss bis 16.09. stehen? Pitch Deck, Viktor LinkedIn, erste Webseite, ein klares Versprechen. Das Datum erzwingt Priorisierung.</w:t>
+        <w:t>Rückwärtsplanung vom September-Anlass: Was muss bis dahin stehen? Pitch Deck, Viktor LinkedIn, Website-Basics, klares Versprechen.</w:t>
       </w:r>
     </w:p>
     <w:p>
@@ -4323,7 +5597,7 @@
           <w:color w:val="333333"/>
           <w:sz w:val="21"/>
         </w:rPr>
-        <w:t>Konkretes Datum schafft Entscheidungsdruck und Klarheit. Beastly hat einen ersten echten Auftrittstermin in einem hochwertigen Umfeld.</w:t>
+        <w:t>Konkretes Datum schafft Entscheidungsdruck und Fokus.</w:t>
       </w:r>
     </w:p>
     <w:p>
@@ -4349,37 +5623,7 @@
           <w:color w:val="333333"/>
           <w:sz w:val="21"/>
         </w:rPr>
-        <w:t>Hektik und Kompromisse, wenn zu viel gleichzeitig fertig werden muss. Qualität kann leiden, wenn die Zeit nicht reicht.</w:t>
-      </w:r>
-    </w:p>
-    <w:p>
-      <w:pPr>
-        <w:spacing w:before="240" w:after="80"/>
-      </w:pPr>
-      <w:r>
-        <w:rPr>
-          <w:rFonts w:ascii="Calibri" w:hAnsi="Calibri"/>
-          <w:b/>
-          <w:i w:val="0"/>
-          <w:color w:val="1A1033"/>
-          <w:sz w:val="24"/>
-        </w:rPr>
-        <w:t>Voraussetzung für alle Optionen</w:t>
-      </w:r>
-    </w:p>
-    <w:p>
-      <w:pPr>
-        <w:spacing w:after="140"/>
-      </w:pPr>
-      <w:r>
-        <w:rPr>
-          <w:rFonts w:ascii="Calibri" w:hAnsi="Calibri"/>
-          <w:b w:val="0"/>
-          <w:i w:val="0"/>
-          <w:color w:val="333333"/>
-          <w:sz w:val="21"/>
-        </w:rPr>
-        <w:t>Unabhängig davon, welche Option gewählt wird, braucht es als absoluten ersten Schritt organisatorische Klarheit: Wer entscheidet? Wer gibt frei? Wer spricht für Chipiron, wer für Beastly? Ohne diese Klärung wird jede Umsetzung zur Abstimmungsaufgabe.</w:t>
+        <w:t>Hektik und Kompromisse, wenn zu viel gleichzeitig fertig werden muss.</w:t>
       </w:r>
     </w:p>
     <w:tbl>
@@ -4410,7 +5654,7 @@
                 <w:b/>
                 <w:i w:val="0"/>
                 <w:color w:val="BD5435"/>
-                <w:sz w:val="20"/>
+                <w:sz w:val="21"/>
               </w:rPr>
               <w:t xml:space="preserve">Empfehlung 1322:  </w:t>
             </w:r>
@@ -4420,9 +5664,9 @@
                 <w:b w:val="0"/>
                 <w:i w:val="0"/>
                 <w:color w:val="333333"/>
-                <w:sz w:val="20"/>
+                <w:sz w:val="21"/>
               </w:rPr>
-              <w:t>Option A oder C — je nach verfügbarer Kapazität und Dringlichkeit des 16.09.-Fensters. In jedem Fall: Rollenklärung und Markenarchitektur als erste Entscheidung, bevor Sichtbarkeit aufgebaut wird.</w:t>
+              <w:t>Option A oder C — abhängig von verfügbarer Kapazität und Dringlichkeit des September-Fensters. In jedem Fall: organisatorische Klärung und Markenarchitektur-Entscheid als absolute erste Priorität, bevor Sichtbarkeit aufgebaut wird.</w:t>
             </w:r>
           </w:p>
         </w:tc>
@@ -4520,7 +5764,7 @@
           <w:color w:val="333333"/>
           <w:sz w:val="21"/>
         </w:rPr>
-        <w:t>Gegründet von Viktor &amp; Lydia Ackermann, geprägt durch FourGive Tierklinik Ägypten</w:t>
+        <w:t>Gründer Viktor &amp; Lydia Ackermann — FourGive Tierklinik Ägypten als Ursprung</w:t>
       </w:r>
     </w:p>
     <w:p>
@@ -4536,7 +5780,7 @@
           <w:color w:val="333333"/>
           <w:sz w:val="21"/>
         </w:rPr>
-        <w:t>Animal Cruelty Free Portfolio, KI-basierte Bewertung börsenkotierter Unternehmen</w:t>
+        <w:t>Animal Cruelty Free Portfolio, KI-basierte Bewertung</w:t>
       </w:r>
     </w:p>
     <w:p>
@@ -4552,7 +5796,27 @@
           <w:color w:val="333333"/>
           <w:sz w:val="21"/>
         </w:rPr>
-        <w:t>Starke Substanz: gecappte Löhne, kein Bonus-System, Gewinne → Tierschutz</w:t>
+        <w:t>Drei Ebenen: Beastly (Emotion) · Chipiron (Vertrauen) · FourGive (Wirkung)</w:t>
+      </w:r>
+    </w:p>
+    <w:p>
+      <w:pPr>
+        <w:spacing w:after="40"/>
+      </w:pPr>
+    </w:p>
+    <w:p>
+      <w:pPr>
+        <w:spacing w:before="240" w:after="80"/>
+      </w:pPr>
+      <w:r>
+        <w:rPr>
+          <w:rFonts w:ascii="Calibri" w:hAnsi="Calibri"/>
+          <w:b/>
+          <w:i w:val="0"/>
+          <w:color w:val="1A1033"/>
+          <w:sz w:val="24"/>
+        </w:rPr>
+        <w:t>Folie 2 — Strategische Positionierung</w:t>
       </w:r>
     </w:p>
     <w:p>
@@ -4568,7 +5832,55 @@
           <w:color w:val="333333"/>
           <w:sz w:val="21"/>
         </w:rPr>
-        <w:t>Drei Ebenen gleichzeitig: Beastly (Emotion) / Chipiron (Vertrauen) / FourGive (Wirkung)</w:t>
+        <w:t>Beastly führt — Chipiron bleibt diskret</w:t>
+      </w:r>
+    </w:p>
+    <w:p>
+      <w:pPr>
+        <w:pStyle w:val="ListBullet"/>
+        <w:spacing w:after="60"/>
+      </w:pPr>
+      <w:r>
+        <w:rPr>
+          <w:rFonts w:ascii="Calibri" w:hAnsi="Calibri"/>
+          <w:b w:val="0"/>
+          <w:i w:val="0"/>
+          <w:color w:val="333333"/>
+          <w:sz w:val="21"/>
+        </w:rPr>
+        <w:t>Kernversprechen: Rendite · Wirkung · Keine Gewinnausschüttung</w:t>
+      </w:r>
+    </w:p>
+    <w:p>
+      <w:pPr>
+        <w:pStyle w:val="ListBullet"/>
+        <w:spacing w:after="60"/>
+      </w:pPr>
+      <w:r>
+        <w:rPr>
+          <w:rFonts w:ascii="Calibri" w:hAnsi="Calibri"/>
+          <w:b w:val="0"/>
+          <w:i w:val="0"/>
+          <w:color w:val="333333"/>
+          <w:sz w:val="21"/>
+        </w:rPr>
+        <w:t>Haltung ohne Aktivismus: konsequent, mutig, wertebasiert — nie belehrend</w:t>
+      </w:r>
+    </w:p>
+    <w:p>
+      <w:pPr>
+        <w:pStyle w:val="ListBullet"/>
+        <w:spacing w:after="60"/>
+      </w:pPr>
+      <w:r>
+        <w:rPr>
+          <w:rFonts w:ascii="Calibri" w:hAnsi="Calibri"/>
+          <w:b w:val="0"/>
+          <w:i w:val="0"/>
+          <w:color w:val="333333"/>
+          <w:sz w:val="21"/>
+        </w:rPr>
+        <w:t>Radikale Transparenz als Differenzierungshebel</w:t>
       </w:r>
     </w:p>
     <w:p>
@@ -4588,7 +5900,7 @@
           <w:color w:val="1A1033"/>
           <w:sz w:val="24"/>
         </w:rPr>
-        <w:t>Folie 2 — Das Ziel</w:t>
+        <w:t>Folie 3 — Zielgruppen</w:t>
       </w:r>
     </w:p>
     <w:p>
@@ -4604,107 +5916,7 @@
           <w:color w:val="333333"/>
           <w:sz w:val="21"/>
         </w:rPr>
-        <w:t>Beastly als eigenständige Anlagemarke im DACH-Raum etablieren</w:t>
-      </w:r>
-    </w:p>
-    <w:p>
-      <w:pPr>
-        <w:pStyle w:val="ListBullet"/>
-        <w:spacing w:after="60"/>
-      </w:pPr>
-      <w:r>
-        <w:rPr>
-          <w:rFonts w:ascii="Calibri" w:hAnsi="Calibri"/>
-          <w:b w:val="0"/>
-          <w:i w:val="0"/>
-          <w:color w:val="333333"/>
-          <w:sz w:val="21"/>
-        </w:rPr>
-        <w:t>Kernversprechen: Rendite für Investoren · Wirkung für Tiere · Keine Gewinnausschüttung</w:t>
-      </w:r>
-    </w:p>
-    <w:p>
-      <w:pPr>
-        <w:pStyle w:val="ListBullet"/>
-        <w:spacing w:after="60"/>
-      </w:pPr>
-      <w:r>
-        <w:rPr>
-          <w:rFonts w:ascii="Calibri" w:hAnsi="Calibri"/>
-          <w:b w:val="0"/>
-          <w:i w:val="0"/>
-          <w:color w:val="333333"/>
-          <w:sz w:val="21"/>
-        </w:rPr>
-        <w:t>Vertrauen über radikale Transparenz aufbauen — nicht versprechen, beweisen</w:t>
-      </w:r>
-    </w:p>
-    <w:p>
-      <w:pPr>
-        <w:pStyle w:val="ListBullet"/>
-        <w:spacing w:after="60"/>
-      </w:pPr>
-      <w:r>
-        <w:rPr>
-          <w:rFonts w:ascii="Calibri" w:hAnsi="Calibri"/>
-          <w:b w:val="0"/>
-          <w:i w:val="0"/>
-          <w:color w:val="333333"/>
-          <w:sz w:val="21"/>
-        </w:rPr>
-        <w:t>Start DACH, später UK — Externe Kommunikation auf Deutsch</w:t>
-      </w:r>
-    </w:p>
-    <w:p>
-      <w:pPr>
-        <w:spacing w:after="40"/>
-      </w:pPr>
-    </w:p>
-    <w:p>
-      <w:pPr>
-        <w:spacing w:before="240" w:after="80"/>
-      </w:pPr>
-      <w:r>
-        <w:rPr>
-          <w:rFonts w:ascii="Calibri" w:hAnsi="Calibri"/>
-          <w:b/>
-          <w:i w:val="0"/>
-          <w:color w:val="1A1033"/>
-          <w:sz w:val="24"/>
-        </w:rPr>
-        <w:t>Folie 3 — Die Zielgruppe</w:t>
-      </w:r>
-    </w:p>
-    <w:p>
-      <w:pPr>
-        <w:pStyle w:val="ListBullet"/>
-        <w:spacing w:after="60"/>
-      </w:pPr>
-      <w:r>
-        <w:rPr>
-          <w:rFonts w:ascii="Calibri" w:hAnsi="Calibri"/>
-          <w:b w:val="0"/>
-          <w:i w:val="0"/>
-          <w:color w:val="333333"/>
-          <w:sz w:val="21"/>
-        </w:rPr>
-        <w:t>Nicht: Retail = Herz / Institutionell = Kopf</w:t>
-      </w:r>
-    </w:p>
-    <w:p>
-      <w:pPr>
-        <w:pStyle w:val="ListBullet"/>
-        <w:spacing w:after="60"/>
-      </w:pPr>
-      <w:r>
-        <w:rPr>
-          <w:rFonts w:ascii="Calibri" w:hAnsi="Calibri"/>
-          <w:b w:val="0"/>
-          <w:i w:val="0"/>
-          <w:color w:val="333333"/>
-          <w:sz w:val="21"/>
-        </w:rPr>
-        <w:t>Sondern: Beide brauchen Herz. Institutionelle brauchen zusätzlich Beweisführung.</w:t>
+        <w:t>Beide brauchen Herz — Institutionelle brauchen zusätzlich Beweisführung</w:t>
       </w:r>
     </w:p>
     <w:p>
@@ -4752,7 +5964,7 @@
           <w:color w:val="333333"/>
           <w:sz w:val="21"/>
         </w:rPr>
-        <w:t>Entscheidungslogik: Emotion → Vertrauen → Performance → Entscheidung</w:t>
+        <w:t>Entscheidungslogik: Emotion → Vertrauen → Performance → Investment</w:t>
       </w:r>
     </w:p>
     <w:p>
@@ -4772,7 +5984,7 @@
           <w:color w:val="1A1033"/>
           <w:sz w:val="24"/>
         </w:rPr>
-        <w:t>Folie 4 — Strategischer Rahmen</w:t>
+        <w:t>Folie 4 — Kommunikationsfunnel</w:t>
       </w:r>
     </w:p>
     <w:p>
@@ -4788,7 +6000,7 @@
           <w:color w:val="333333"/>
           <w:sz w:val="21"/>
         </w:rPr>
-        <w:t>Beastly führt emotional / Chipiron bleibt diskret als Absender</w:t>
+        <w:t>Aufmerksamkeit: Viktor LinkedIn + Beastly Social + Awareness-Ads</w:t>
       </w:r>
     </w:p>
     <w:p>
@@ -4804,7 +6016,7 @@
           <w:color w:val="333333"/>
           <w:sz w:val="21"/>
         </w:rPr>
-        <w:t>«Non-Profit» wird erklärt: Rendite · Wirkung · Keine Gewinnausschüttung</w:t>
+        <w:t>Neugier: Gründerstory, Dual-Bildwelt, Website-Einstieg</w:t>
       </w:r>
     </w:p>
     <w:p>
@@ -4820,7 +6032,7 @@
           <w:color w:val="333333"/>
           <w:sz w:val="21"/>
         </w:rPr>
-        <w:t>Haltung ohne Aktivismus: konsequent, mutig, wertebasiert — nie belehrend</w:t>
+        <w:t>Vertrauen: Transparenz, FourGive-Momente, Viktor &amp; Lydia als Menschen</w:t>
       </w:r>
     </w:p>
     <w:p>
@@ -4836,7 +6048,7 @@
           <w:color w:val="333333"/>
           <w:sz w:val="21"/>
         </w:rPr>
-        <w:t>Radikale Transparenz als Differenzierungshebel, nicht als ethisches Gebot</w:t>
+        <w:t>Erklärung: Pitch Deck + Direktgespräch + Website Deep Dive</w:t>
       </w:r>
     </w:p>
     <w:p>
@@ -4852,7 +6064,7 @@
           <w:color w:val="333333"/>
           <w:sz w:val="21"/>
         </w:rPr>
-        <w:t>Personenzentriert: Viktor vorne, Lydia flankierend — kein Markenauftritt ohne Gesicht</w:t>
+        <w:t>Entscheidung: Retail Bank/App ab CHF 50 · Professionell Direktabschluss</w:t>
       </w:r>
     </w:p>
     <w:p>
@@ -4872,7 +6084,7 @@
           <w:color w:val="1A1033"/>
           <w:sz w:val="24"/>
         </w:rPr>
-        <w:t>Folie 5 — Der Kommunikationsfunnel</w:t>
+        <w:t>Folie 5 — Kanalstrategie</w:t>
       </w:r>
     </w:p>
     <w:p>
@@ -4888,7 +6100,7 @@
           <w:color w:val="333333"/>
           <w:sz w:val="21"/>
         </w:rPr>
-        <w:t>Aufmerksamkeit: Viktor LinkedIn + Social Posting + Awareness-Ads</w:t>
+        <w:t>LinkedIn: gesetzter Ausgangspunkt — immer (Viktor Profil + Beastly Marke)</w:t>
       </w:r>
     </w:p>
     <w:p>
@@ -4904,7 +6116,7 @@
           <w:color w:val="333333"/>
           <w:sz w:val="21"/>
         </w:rPr>
-        <w:t>Neugier: Gründerstory, FourGive-Momente, Dual-Bildwelt</w:t>
+        <w:t>+ Instagram: visueller Tierwohl-Content, Meta-Ads-Synergie</w:t>
       </w:r>
     </w:p>
     <w:p>
@@ -4920,7 +6132,7 @@
           <w:color w:val="333333"/>
           <w:sz w:val="21"/>
         </w:rPr>
-        <w:t>Vertrauen: Website (Transparenz) + Viktor &amp; Lydia als Menschen</w:t>
+        <w:t>+ TikTok: Persönlichkeit, Gesichter, authentische Formate</w:t>
       </w:r>
     </w:p>
     <w:p>
@@ -4936,7 +6148,27 @@
           <w:color w:val="333333"/>
           <w:sz w:val="21"/>
         </w:rPr>
-        <w:t>Erklärung: Pitch Deck + Direktgespräch + vertiefende Website-Inhalte</w:t>
+        <w:t>Kombination nach Ressourcen wählen — nicht alle Kanäle gleichzeitig</w:t>
+      </w:r>
+    </w:p>
+    <w:p>
+      <w:pPr>
+        <w:spacing w:after="40"/>
+      </w:pPr>
+    </w:p>
+    <w:p>
+      <w:pPr>
+        <w:spacing w:before="240" w:after="80"/>
+      </w:pPr>
+      <w:r>
+        <w:rPr>
+          <w:rFonts w:ascii="Calibri" w:hAnsi="Calibri"/>
+          <w:b/>
+          <w:i w:val="0"/>
+          <w:color w:val="1A1033"/>
+          <w:sz w:val="24"/>
+        </w:rPr>
+        <w:t>Folie 6 — Persönliche Einschätzung</w:t>
       </w:r>
     </w:p>
     <w:p>
@@ -4952,175 +6184,7 @@
           <w:color w:val="333333"/>
           <w:sz w:val="21"/>
         </w:rPr>
-        <w:t>Entscheidung: Retail CHF 50+ online / Professionell Direktabschluss</w:t>
-      </w:r>
-    </w:p>
-    <w:p>
-      <w:pPr>
-        <w:spacing w:after="40"/>
-      </w:pPr>
-    </w:p>
-    <w:p>
-      <w:pPr>
-        <w:spacing w:before="240" w:after="80"/>
-      </w:pPr>
-      <w:r>
-        <w:rPr>
-          <w:rFonts w:ascii="Calibri" w:hAnsi="Calibri"/>
-          <w:b/>
-          <w:i w:val="0"/>
-          <w:color w:val="1A1033"/>
-          <w:sz w:val="24"/>
-        </w:rPr>
-        <w:t>Folie 6 — Die Kommunikationselemente</w:t>
-      </w:r>
-    </w:p>
-    <w:p>
-      <w:pPr>
-        <w:pStyle w:val="ListBullet"/>
-        <w:spacing w:after="60"/>
-      </w:pPr>
-      <w:r>
-        <w:rPr>
-          <w:rFonts w:ascii="Calibri" w:hAnsi="Calibri"/>
-          <w:b w:val="0"/>
-          <w:i w:val="0"/>
-          <w:color w:val="333333"/>
-          <w:sz w:val="21"/>
-        </w:rPr>
-        <w:t>Branding: Markenarchitektur schärfen, Dual-Bildwelt verankern</w:t>
-      </w:r>
-    </w:p>
-    <w:p>
-      <w:pPr>
-        <w:pStyle w:val="ListBullet"/>
-        <w:spacing w:after="60"/>
-      </w:pPr>
-      <w:r>
-        <w:rPr>
-          <w:rFonts w:ascii="Calibri" w:hAnsi="Calibri"/>
-          <w:b w:val="0"/>
-          <w:i w:val="0"/>
-          <w:color w:val="333333"/>
-          <w:sz w:val="21"/>
-        </w:rPr>
-        <w:t>Website: Vertrauensschritt, Transparenz direkt sichtbar (Mockup: Fabio)</w:t>
-      </w:r>
-    </w:p>
-    <w:p>
-      <w:pPr>
-        <w:pStyle w:val="ListBullet"/>
-        <w:spacing w:after="60"/>
-      </w:pPr>
-      <w:r>
-        <w:rPr>
-          <w:rFonts w:ascii="Calibri" w:hAnsi="Calibri"/>
-          <w:b w:val="0"/>
-          <w:i w:val="0"/>
-          <w:color w:val="333333"/>
-          <w:sz w:val="21"/>
-        </w:rPr>
-        <w:t>Viktor LinkedIn: wichtigster Reichweiten- und Vertrauenskanal</w:t>
-      </w:r>
-    </w:p>
-    <w:p>
-      <w:pPr>
-        <w:pStyle w:val="ListBullet"/>
-        <w:spacing w:after="60"/>
-      </w:pPr>
-      <w:r>
-        <w:rPr>
-          <w:rFonts w:ascii="Calibri" w:hAnsi="Calibri"/>
-          <w:b w:val="0"/>
-          <w:i w:val="0"/>
-          <w:color w:val="333333"/>
-          <w:sz w:val="21"/>
-        </w:rPr>
-        <w:t>Pitch Deck: emotionaler Aufbau, faktische Tiefe</w:t>
-      </w:r>
-    </w:p>
-    <w:p>
-      <w:pPr>
-        <w:pStyle w:val="ListBullet"/>
-        <w:spacing w:after="60"/>
-      </w:pPr>
-      <w:r>
-        <w:rPr>
-          <w:rFonts w:ascii="Calibri" w:hAnsi="Calibri"/>
-          <w:b w:val="0"/>
-          <w:i w:val="0"/>
-          <w:color w:val="333333"/>
-          <w:sz w:val="21"/>
-        </w:rPr>
-        <w:t>3 Social-Kanäle: LinkedIn (Haupt) / TikTok / Instagram — immer Invest + Tierwohl</w:t>
-      </w:r>
-    </w:p>
-    <w:p>
-      <w:pPr>
-        <w:pStyle w:val="ListBullet"/>
-        <w:spacing w:after="60"/>
-      </w:pPr>
-      <w:r>
-        <w:rPr>
-          <w:rFonts w:ascii="Calibri" w:hAnsi="Calibri"/>
-          <w:b w:val="0"/>
-          <w:i w:val="0"/>
-          <w:color w:val="333333"/>
-          <w:sz w:val="21"/>
-        </w:rPr>
-        <w:t>Swiss Funds 16.09.2026: Auftrittschance, Networking, nicht eigener Launch</w:t>
-      </w:r>
-    </w:p>
-    <w:p>
-      <w:pPr>
-        <w:pStyle w:val="ListBullet"/>
-        <w:spacing w:after="60"/>
-      </w:pPr>
-      <w:r>
-        <w:rPr>
-          <w:rFonts w:ascii="Calibri" w:hAnsi="Calibri"/>
-          <w:b w:val="0"/>
-          <w:i w:val="0"/>
-          <w:color w:val="333333"/>
-          <w:sz w:val="21"/>
-        </w:rPr>
-        <w:t>Ads zweiphasig: Awareness zuerst, Conversion wenn Fundament steht</w:t>
-      </w:r>
-    </w:p>
-    <w:p>
-      <w:pPr>
-        <w:spacing w:after="40"/>
-      </w:pPr>
-    </w:p>
-    <w:p>
-      <w:pPr>
-        <w:spacing w:before="240" w:after="80"/>
-      </w:pPr>
-      <w:r>
-        <w:rPr>
-          <w:rFonts w:ascii="Calibri" w:hAnsi="Calibri"/>
-          <w:b/>
-          <w:i w:val="0"/>
-          <w:color w:val="1A1033"/>
-          <w:sz w:val="24"/>
-        </w:rPr>
-        <w:t>Folie 7 — Persönliche Einschätzung</w:t>
-      </w:r>
-    </w:p>
-    <w:p>
-      <w:pPr>
-        <w:pStyle w:val="ListBullet"/>
-        <w:spacing w:after="60"/>
-      </w:pPr>
-      <w:r>
-        <w:rPr>
-          <w:rFonts w:ascii="Calibri" w:hAnsi="Calibri"/>
-          <w:b w:val="0"/>
-          <w:i w:val="0"/>
-          <w:color w:val="333333"/>
-          <w:sz w:val="21"/>
-        </w:rPr>
-        <w:t>Solider Startpunkt: starke Gründerüberzeugung, relevante Nische, klare Substanz</w:t>
+        <w:t>Solider Startpunkt: starke Gründerüberzeugung, relevante Nische</w:t>
       </w:r>
     </w:p>
     <w:p>
@@ -5152,7 +6216,7 @@
           <w:color w:val="333333"/>
           <w:sz w:val="21"/>
         </w:rPr>
-        <w:t>Die Idee ist stark — die Herausforderung ist Dosierung, Führung, Übersetzung</w:t>
+        <w:t>«Die Idee ist stark — die Herausforderung ist Dosierung, Führung, Übersetzung»</w:t>
       </w:r>
     </w:p>
     <w:p>
@@ -5168,7 +6232,7 @@
           <w:color w:val="333333"/>
           <w:sz w:val="21"/>
         </w:rPr>
-        <w:t>«Transparent sein, ohne zu überladen. Emotion wecken, ohne aktivistisch zu wirken.»</w:t>
+        <w:t>Transparent sein, ohne zu überladen. Emotion wecken, ohne aktivistisch zu wirken.</w:t>
       </w:r>
     </w:p>
     <w:p>
@@ -5188,23 +6252,7 @@
           <w:color w:val="1A1033"/>
           <w:sz w:val="24"/>
         </w:rPr>
-        <w:t>Folie 8 — Empfehlung</w:t>
-      </w:r>
-    </w:p>
-    <w:p>
-      <w:pPr>
-        <w:pStyle w:val="ListBullet"/>
-        <w:spacing w:after="60"/>
-      </w:pPr>
-      <w:r>
-        <w:rPr>
-          <w:rFonts w:ascii="Calibri" w:hAnsi="Calibri"/>
-          <w:b w:val="0"/>
-          <w:i w:val="0"/>
-          <w:color w:val="333333"/>
-          <w:sz w:val="21"/>
-        </w:rPr>
-        <w:t>Nicht nur operative Unterstützung — strategische Führung der Kommunikation</w:t>
+        <w:t>Folie 7 — Empfehlung</w:t>
       </w:r>
     </w:p>
     <w:p>
@@ -5257,6 +6305,22 @@
     </w:p>
     <w:p>
       <w:pPr>
+        <w:pStyle w:val="ListBullet"/>
+        <w:spacing w:after="60"/>
+      </w:pPr>
+      <w:r>
+        <w:rPr>
+          <w:rFonts w:ascii="Calibri" w:hAnsi="Calibri"/>
+          <w:b w:val="0"/>
+          <w:i w:val="0"/>
+          <w:color w:val="333333"/>
+          <w:sz w:val="21"/>
+        </w:rPr>
+        <w:t>Die Vision braucht Nähe zum Gründer. Die Umsetzung braucht klare Entscheidungswege.</w:t>
+      </w:r>
+    </w:p>
+    <w:p>
+      <w:pPr>
         <w:spacing w:after="40"/>
       </w:pPr>
     </w:p>
@@ -5272,7 +6336,7 @@
           <w:color w:val="1A1033"/>
           <w:sz w:val="24"/>
         </w:rPr>
-        <w:t>Folie 9 — Mögliche Einstiege</w:t>
+        <w:t>Folie 8 — Mögliche Einstiege</w:t>
       </w:r>
     </w:p>
     <w:p>
@@ -5320,7 +6384,7 @@
           <w:color w:val="333333"/>
           <w:sz w:val="21"/>
         </w:rPr>
-        <w:t>Option C: Event-orientiert (16.09.2026 als Ankerpunkt, rückwärts planen)</w:t>
+        <w:t>Option C: Event-orientiert (September-Anlass als Ankerpunkt)</w:t>
       </w:r>
     </w:p>
     <w:p>
@@ -5336,7 +6400,7 @@
           <w:color w:val="333333"/>
           <w:sz w:val="21"/>
         </w:rPr>
-        <w:t>Voraussetzung für alle: Organisatorische Klärung zuerst</w:t>
+        <w:t>Voraussetzung für alle: Organisatorische Klärung als allererster Schritt</w:t>
       </w:r>
     </w:p>
     <w:p>

</xml_diff>

<commit_message>
strategy: expand 6.4 Social Media + 6.8 Ads with strategic depth [DungeonMasterAlex]
</commit_message>
<xml_diff>
--- a/beastly-investments/strategies/2026-06-24_strategy_beastly-investments.docx
+++ b/beastly-investments/strategies/2026-06-24_strategy_beastly-investments.docx
@@ -267,6 +267,1220 @@
       </w:r>
     </w:p>
     <w:p>
+      <w:r>
+        <w:rPr>
+          <w:b w:val="0"/>
+          <w:sz w:val="18"/>
+        </w:rPr>
+        <w:t>Beastly startet mit LinkedIn — das ist gesetzt. Die übrigen Kanäle sind kombinierbare Optionen, die schrittweise hinzugenommen werden. Entscheidend: Jeder Kanal hat eine eigene Aufgabe im Kommunikationssystem. Es geht nicht darum, überall präsent zu sein — sondern auf dem richtigen Kanal die richtige Energie zu bringen.</w:t>
+      </w:r>
+    </w:p>
+    <w:tbl>
+      <w:tblPr>
+        <w:tblStyle w:val="TableGrid"/>
+        <w:tblW w:type="auto" w:w="0"/>
+        <w:tblLook w:firstColumn="1" w:firstRow="1" w:lastColumn="0" w:lastRow="0" w:noHBand="0" w:noVBand="1" w:val="04A0"/>
+      </w:tblPr>
+      <w:tblGrid>
+        <w:gridCol w:w="8612"/>
+      </w:tblGrid>
+      <w:tr>
+        <w:tc>
+          <w:tcPr>
+            <w:tcW w:type="dxa" w:w="8612"/>
+            <w:shd w:val="clear" w:color="auto" w:fill="0A66C2"/>
+            <w:tcMar>
+              <w:top w:w="100" w:type="dxa"/>
+              <w:bottom w:w="100" w:type="dxa"/>
+              <w:left w:w="140" w:type="dxa"/>
+              <w:right w:w="140" w:type="dxa"/>
+            </w:tcMar>
+          </w:tcPr>
+          <w:p>
+            <w:r>
+              <w:rPr>
+                <w:rFonts w:ascii="Calibri" w:hAnsi="Calibri"/>
+                <w:b/>
+                <w:i w:val="0"/>
+                <w:color w:val="FFFFFF"/>
+                <w:sz w:val="22"/>
+              </w:rPr>
+              <w:t>LINKEDIN — Gesetzter Ausgangspunkt (nicht verhandelbar)</w:t>
+            </w:r>
+          </w:p>
+          <w:p>
+            <w:r>
+              <w:rPr>
+                <w:rFonts w:ascii="Calibri" w:hAnsi="Calibri"/>
+                <w:b w:val="0"/>
+                <w:i w:val="0"/>
+                <w:color w:val="FFFFFF"/>
+                <w:sz w:val="19"/>
+              </w:rPr>
+              <w:t>→  Professionelle Zielgruppe ist hier präsent — sowohl Retail-affine als auch institutionelle Investoren</w:t>
+            </w:r>
+          </w:p>
+          <w:p>
+            <w:r>
+              <w:rPr>
+                <w:rFonts w:ascii="Calibri" w:hAnsi="Calibri"/>
+                <w:b w:val="0"/>
+                <w:i w:val="0"/>
+                <w:color w:val="FFFFFF"/>
+                <w:sz w:val="19"/>
+              </w:rPr>
+              <w:t>→  Plattform erlaubt tiefe, substanzielle Inhalte — ideal für Vertrauen und Erklärung</w:t>
+            </w:r>
+          </w:p>
+          <w:p>
+            <w:r>
+              <w:rPr>
+                <w:rFonts w:ascii="Calibri" w:hAnsi="Calibri"/>
+                <w:b w:val="0"/>
+                <w:i w:val="0"/>
+                <w:color w:val="FFFFFF"/>
+                <w:sz w:val="19"/>
+              </w:rPr>
+              <w:t>→  Viktors persönliches Profil und Beastlys Markenkanal sind auf derselben Plattform</w:t>
+            </w:r>
+          </w:p>
+          <w:p>
+            <w:r>
+              <w:rPr>
+                <w:rFonts w:ascii="Calibri" w:hAnsi="Calibri"/>
+                <w:b w:val="0"/>
+                <w:i w:val="0"/>
+                <w:color w:val="FFFFFF"/>
+                <w:sz w:val="19"/>
+              </w:rPr>
+              <w:t>→  Höchste Qualität der Engagements im Vergleich zu anderen Kanälen</w:t>
+            </w:r>
+          </w:p>
+        </w:tc>
+      </w:tr>
+    </w:tbl>
+    <w:tbl>
+      <w:tblPr>
+        <w:tblLook w:firstColumn="1" w:firstRow="1" w:lastColumn="0" w:lastRow="0" w:noHBand="0" w:noVBand="1" w:val="04A0"/>
+        <w:tblBorders>
+          <w:top w:val="none"/>
+          <w:left w:val="none"/>
+          <w:bottom w:val="none"/>
+          <w:right w:val="none"/>
+          <w:insideH w:val="none"/>
+          <w:insideV w:val="none"/>
+        </w:tblBorders>
+        <w:tblW w:w="5000" w:type="pct"/>
+      </w:tblPr>
+      <w:tblGrid>
+        <w:gridCol w:w="8612"/>
+      </w:tblGrid>
+      <w:tr>
+        <w:tc>
+          <w:tcPr>
+            <w:tcW w:type="dxa" w:w="8612"/>
+            <w:shd w:val="clear" w:color="auto" w:fill="4b319b"/>
+            <w:tcMar>
+              <w:top w:w="100" w:type="dxa"/>
+              <w:bottom w:w="100" w:type="dxa"/>
+              <w:left w:w="150" w:type="dxa"/>
+              <w:right w:w="150" w:type="dxa"/>
+            </w:tcMar>
+          </w:tcPr>
+          <w:p>
+            <w:r>
+              <w:rPr>
+                <w:b/>
+                <w:color w:val="FFFFFF"/>
+                <w:sz w:val="20"/>
+              </w:rPr>
+              <w:t>WAS LINKEDIN FÜR BEASTLY KONKRET BEWIRKT</w:t>
+            </w:r>
+          </w:p>
+        </w:tc>
+      </w:tr>
+      <w:tr>
+        <w:tc>
+          <w:tcPr>
+            <w:tcW w:type="dxa" w:w="8612"/>
+            <w:shd w:val="clear" w:color="auto" w:fill="EEE8F7"/>
+            <w:tcMar>
+              <w:top w:w="85" w:type="dxa"/>
+              <w:bottom w:w="90" w:type="dxa"/>
+              <w:left w:w="150" w:type="dxa"/>
+              <w:right w:w="150" w:type="dxa"/>
+            </w:tcMar>
+          </w:tcPr>
+          <w:p>
+            <w:r>
+              <w:rPr>
+                <w:b/>
+                <w:color w:val="4B319B"/>
+                <w:sz w:val="18"/>
+              </w:rPr>
+              <w:t>Professionelles Vertrauen im Finanzumfeld</w:t>
+            </w:r>
+          </w:p>
+          <w:p>
+            <w:r>
+              <w:rPr>
+                <w:sz w:val="18"/>
+              </w:rPr>
+              <w:t>LinkedIn ist der einzige Kanal, auf dem Investitionsentscheide durch Content direkt beeinflusst werden. Wer Viktor's Haltung als Gründer kennt, vertraut der Marke dahinter. Anders als visuelle Plattformen erlaubt LinkedIn tiefe, substanzielle Posts — Texte die erklären, Argumente die überzeugen.</w:t>
+            </w:r>
+          </w:p>
+        </w:tc>
+      </w:tr>
+      <w:tr>
+        <w:tc>
+          <w:tcPr>
+            <w:tcW w:type="dxa" w:w="8612"/>
+            <w:shd w:val="clear" w:color="auto" w:fill="F5F0FC"/>
+            <w:tcMar>
+              <w:top w:w="85" w:type="dxa"/>
+              <w:bottom w:w="90" w:type="dxa"/>
+              <w:left w:w="150" w:type="dxa"/>
+              <w:right w:w="150" w:type="dxa"/>
+            </w:tcMar>
+          </w:tcPr>
+          <w:p>
+            <w:r>
+              <w:rPr>
+                <w:b/>
+                <w:color w:val="4B319B"/>
+                <w:sz w:val="18"/>
+              </w:rPr>
+              <w:t>Viktor und Beastly verstärken sich gegenseitig</w:t>
+            </w:r>
+          </w:p>
+          <w:p>
+            <w:r>
+              <w:rPr>
+                <w:sz w:val="18"/>
+              </w:rPr>
+              <w:t>Persönliche Profile erzielen auf LinkedIn in dieser Unternehmensgrösse ein Vielfaches mehr organische Reichweite als Unternehmensseiten. Viktor baut persönliche Reichweite auf, Beastly liefert institutionelle Substanz. Beide Kanäle zusammen bauen das Vertrauens-Ökosystem auf.</w:t>
+            </w:r>
+          </w:p>
+        </w:tc>
+      </w:tr>
+      <w:tr>
+        <w:tc>
+          <w:tcPr>
+            <w:tcW w:type="dxa" w:w="8612"/>
+            <w:shd w:val="clear" w:color="auto" w:fill="EEE8F7"/>
+            <w:tcMar>
+              <w:top w:w="85" w:type="dxa"/>
+              <w:bottom w:w="90" w:type="dxa"/>
+              <w:left w:w="150" w:type="dxa"/>
+              <w:right w:w="150" w:type="dxa"/>
+            </w:tcMar>
+          </w:tcPr>
+          <w:p>
+            <w:r>
+              <w:rPr>
+                <w:b/>
+                <w:color w:val="4B319B"/>
+                <w:sz w:val="18"/>
+              </w:rPr>
+              <w:t>Was Viktor postet — persönliches Profil</w:t>
+            </w:r>
+          </w:p>
+          <w:p>
+            <w:r>
+              <w:rPr>
+                <w:sz w:val="18"/>
+              </w:rPr>
+              <w:t>—  Investment-Reflexionen: Wie denkt Viktor über Kapitalallokation, Risiko und das Schweizer Finanzsystem?</w:t>
+            </w:r>
+          </w:p>
+          <w:p>
+            <w:r>
+              <w:rPr>
+                <w:sz w:val="18"/>
+              </w:rPr>
+              <w:t>—  Persönliche Haltung: Warum Tierschutz und Rendite kein Widerspruch sind — konkret, klar, ohne Pathos</w:t>
+            </w:r>
+          </w:p>
+          <w:p>
+            <w:r>
+              <w:rPr>
+                <w:sz w:val="18"/>
+              </w:rPr>
+              <w:t>—  Gründungsmomente: Einzelne Szenen aus Ägypten, aus dem Aufbau von Beastly, aus FourGive</w:t>
+            </w:r>
+          </w:p>
+          <w:p>
+            <w:r>
+              <w:rPr>
+                <w:sz w:val="18"/>
+              </w:rPr>
+              <w:t>—  Ehrliche Einblicke: Was funktioniert, was ist schwierig, was haben wir gelernt?</w:t>
+            </w:r>
+          </w:p>
+          <w:p>
+            <w:r>
+              <w:rPr>
+                <w:sz w:val="18"/>
+              </w:rPr>
+              <w:t>—  Lydia flankiert dort, wo es natürlich ist — gemeinsame Momente, FourGive-Besuche, persönliche Statements</w:t>
+            </w:r>
+          </w:p>
+        </w:tc>
+      </w:tr>
+      <w:tr>
+        <w:tc>
+          <w:tcPr>
+            <w:tcW w:type="dxa" w:w="8612"/>
+            <w:shd w:val="clear" w:color="auto" w:fill="F5F0FC"/>
+            <w:tcMar>
+              <w:top w:w="85" w:type="dxa"/>
+              <w:bottom w:w="90" w:type="dxa"/>
+              <w:left w:w="150" w:type="dxa"/>
+              <w:right w:w="150" w:type="dxa"/>
+            </w:tcMar>
+          </w:tcPr>
+          <w:p>
+            <w:r>
+              <w:rPr>
+                <w:b/>
+                <w:color w:val="4B319B"/>
+                <w:sz w:val="18"/>
+              </w:rPr>
+              <w:t>Was Beastly postet — Unternehmenskanal</w:t>
+            </w:r>
+          </w:p>
+          <w:p>
+            <w:r>
+              <w:rPr>
+                <w:sz w:val="18"/>
+              </w:rPr>
+              <w:t>—  Transparenz-Content: Lohnstruktur, Mittelverwendung, Animal Cruelty Free Screening — sichtbar, belegbar, echt</w:t>
+            </w:r>
+          </w:p>
+          <w:p>
+            <w:r>
+              <w:rPr>
+                <w:sz w:val="18"/>
+              </w:rPr>
+              <w:t>—  Wirkungsberichte: Was passiert mit dem investierten Geld? Welche Projekte werden unterstützt?</w:t>
+            </w:r>
+          </w:p>
+          <w:p>
+            <w:r>
+              <w:rPr>
+                <w:sz w:val="18"/>
+              </w:rPr>
+              <w:t>—  Bildwelt: Starke Tiere für Investment-Codes, schützenswerte Tiere für Wirkungskommunikation (FourGive)</w:t>
+            </w:r>
+          </w:p>
+          <w:p>
+            <w:r>
+              <w:rPr>
+                <w:sz w:val="18"/>
+              </w:rPr>
+              <w:t>—  Milestones: FINMA-Prozess, erste Investoren, erste messbare Kennzahlen</w:t>
+            </w:r>
+          </w:p>
+        </w:tc>
+      </w:tr>
+    </w:tbl>
+    <w:p/>
+    <w:p>
+      <w:r>
+        <w:rPr>
+          <w:b/>
+          <w:color w:val="4B319B"/>
+          <w:sz w:val="20"/>
+        </w:rPr>
+        <w:t>Kombinierbare Erweiterungsoptionen</w:t>
+      </w:r>
+    </w:p>
+    <w:tbl>
+      <w:tblPr>
+        <w:tblStyle w:val="TableGrid"/>
+        <w:tblW w:type="auto" w:w="0"/>
+        <w:tblLook w:firstColumn="1" w:firstRow="1" w:lastColumn="0" w:lastRow="0" w:noHBand="0" w:noVBand="1" w:val="04A0"/>
+      </w:tblPr>
+      <w:tblGrid>
+        <w:gridCol w:w="2871"/>
+        <w:gridCol w:w="2871"/>
+        <w:gridCol w:w="2871"/>
+      </w:tblGrid>
+      <w:tr>
+        <w:tc>
+          <w:tcPr>
+            <w:tcW w:type="dxa" w:w="2871"/>
+            <w:shd w:val="clear" w:color="auto" w:fill="1a1033"/>
+            <w:tcMar>
+              <w:top w:w="80" w:type="dxa"/>
+              <w:bottom w:w="80" w:type="dxa"/>
+              <w:left w:w="100" w:type="dxa"/>
+              <w:right w:w="100" w:type="dxa"/>
+            </w:tcMar>
+          </w:tcPr>
+          <w:p>
+            <w:r>
+              <w:rPr>
+                <w:rFonts w:ascii="Calibri" w:hAnsi="Calibri"/>
+                <w:b/>
+                <w:i w:val="0"/>
+                <w:color w:val="A176F4"/>
+                <w:sz w:val="18"/>
+              </w:rPr>
+              <w:t>KANAL</w:t>
+            </w:r>
+          </w:p>
+        </w:tc>
+        <w:tc>
+          <w:tcPr>
+            <w:tcW w:type="dxa" w:w="2871"/>
+            <w:shd w:val="clear" w:color="auto" w:fill="1a1033"/>
+            <w:tcMar>
+              <w:top w:w="80" w:type="dxa"/>
+              <w:bottom w:w="80" w:type="dxa"/>
+              <w:left w:w="100" w:type="dxa"/>
+              <w:right w:w="100" w:type="dxa"/>
+            </w:tcMar>
+          </w:tcPr>
+          <w:p>
+            <w:r>
+              <w:rPr>
+                <w:rFonts w:ascii="Calibri" w:hAnsi="Calibri"/>
+                <w:b/>
+                <w:i w:val="0"/>
+                <w:color w:val="A176F4"/>
+                <w:sz w:val="18"/>
+              </w:rPr>
+              <w:t>SCHWERPUNKT &amp; INHALT</w:t>
+            </w:r>
+          </w:p>
+        </w:tc>
+        <w:tc>
+          <w:tcPr>
+            <w:tcW w:type="dxa" w:w="2871"/>
+            <w:shd w:val="clear" w:color="auto" w:fill="1a1033"/>
+            <w:tcMar>
+              <w:top w:w="80" w:type="dxa"/>
+              <w:bottom w:w="80" w:type="dxa"/>
+              <w:left w:w="100" w:type="dxa"/>
+              <w:right w:w="100" w:type="dxa"/>
+            </w:tcMar>
+          </w:tcPr>
+          <w:p>
+            <w:r>
+              <w:rPr>
+                <w:rFonts w:ascii="Calibri" w:hAnsi="Calibri"/>
+                <w:b/>
+                <w:i w:val="0"/>
+                <w:color w:val="A176F4"/>
+                <w:sz w:val="18"/>
+              </w:rPr>
+              <w:t>WANN SINNVOLL</w:t>
+            </w:r>
+          </w:p>
+        </w:tc>
+      </w:tr>
+      <w:tr>
+        <w:tc>
+          <w:tcPr>
+            <w:tcW w:type="dxa" w:w="2871"/>
+            <w:shd w:val="clear" w:color="auto" w:fill="EDE8FF"/>
+            <w:tcMar>
+              <w:top w:w="80" w:type="dxa"/>
+              <w:bottom w:w="80" w:type="dxa"/>
+              <w:left w:w="100" w:type="dxa"/>
+              <w:right w:w="100" w:type="dxa"/>
+            </w:tcMar>
+          </w:tcPr>
+          <w:p>
+            <w:r>
+              <w:rPr>
+                <w:rFonts w:ascii="Calibri" w:hAnsi="Calibri"/>
+                <w:b/>
+                <w:i w:val="0"/>
+                <w:color w:val="4B319B"/>
+                <w:sz w:val="20"/>
+              </w:rPr>
+              <w:t>+  INSTAGRAM / META</w:t>
+            </w:r>
+          </w:p>
+        </w:tc>
+        <w:tc>
+          <w:tcPr>
+            <w:tcW w:type="dxa" w:w="2871"/>
+            <w:shd w:val="clear" w:color="auto" w:fill="F8F6FF"/>
+            <w:tcMar>
+              <w:top w:w="80" w:type="dxa"/>
+              <w:bottom w:w="80" w:type="dxa"/>
+              <w:left w:w="100" w:type="dxa"/>
+              <w:right w:w="100" w:type="dxa"/>
+            </w:tcMar>
+          </w:tcPr>
+          <w:p>
+            <w:r>
+              <w:rPr>
+                <w:rFonts w:ascii="Calibri" w:hAnsi="Calibri"/>
+                <w:b w:val="0"/>
+                <w:i w:val="0"/>
+                <w:color w:val="333333"/>
+                <w:sz w:val="19"/>
+              </w:rPr>
+              <w:t>Visueller Schwerpunkt: Dual-Bildwelt, Tierwohl-Momente, FourGive-Geschichten, emotionale Momentaufnahmen. Beide Botschaften (Invest + Tierwohl) — Emotion führt.</w:t>
+            </w:r>
+          </w:p>
+        </w:tc>
+        <w:tc>
+          <w:tcPr>
+            <w:tcW w:type="dxa" w:w="2871"/>
+            <w:shd w:val="clear" w:color="auto" w:fill="F8F6FF"/>
+            <w:tcMar>
+              <w:top w:w="80" w:type="dxa"/>
+              <w:bottom w:w="80" w:type="dxa"/>
+              <w:left w:w="100" w:type="dxa"/>
+              <w:right w:w="100" w:type="dxa"/>
+            </w:tcMar>
+          </w:tcPr>
+          <w:p>
+            <w:r>
+              <w:rPr>
+                <w:rFonts w:ascii="Calibri" w:hAnsi="Calibri"/>
+                <w:b w:val="0"/>
+                <w:i w:val="0"/>
+                <w:color w:val="555555"/>
+                <w:sz w:val="19"/>
+              </w:rPr>
+              <w:t>Wenn visueller Content (Tierbilder, FourGive-Momente) produziert werden kann. Synergie mit Meta-Ads.</w:t>
+            </w:r>
+          </w:p>
+        </w:tc>
+      </w:tr>
+      <w:tr>
+        <w:tc>
+          <w:tcPr>
+            <w:tcW w:type="dxa" w:w="2871"/>
+            <w:shd w:val="clear" w:color="auto" w:fill="EDE8FF"/>
+            <w:tcMar>
+              <w:top w:w="80" w:type="dxa"/>
+              <w:bottom w:w="80" w:type="dxa"/>
+              <w:left w:w="100" w:type="dxa"/>
+              <w:right w:w="100" w:type="dxa"/>
+            </w:tcMar>
+          </w:tcPr>
+          <w:p>
+            <w:r>
+              <w:rPr>
+                <w:rFonts w:ascii="Calibri" w:hAnsi="Calibri"/>
+                <w:b/>
+                <w:i w:val="0"/>
+                <w:color w:val="4B319B"/>
+                <w:sz w:val="20"/>
+              </w:rPr>
+              <w:t>+  TIKTOK</w:t>
+            </w:r>
+          </w:p>
+        </w:tc>
+        <w:tc>
+          <w:tcPr>
+            <w:tcW w:type="dxa" w:w="2871"/>
+            <w:shd w:val="clear" w:color="auto" w:fill="F0EDFF"/>
+            <w:tcMar>
+              <w:top w:w="80" w:type="dxa"/>
+              <w:bottom w:w="80" w:type="dxa"/>
+              <w:left w:w="100" w:type="dxa"/>
+              <w:right w:w="100" w:type="dxa"/>
+            </w:tcMar>
+          </w:tcPr>
+          <w:p>
+            <w:r>
+              <w:rPr>
+                <w:rFonts w:ascii="Calibri" w:hAnsi="Calibri"/>
+                <w:b w:val="0"/>
+                <w:i w:val="0"/>
+                <w:color w:val="333333"/>
+                <w:sz w:val="19"/>
+              </w:rPr>
+              <w:t>Persönlichkeit und Gesichter: kurze, authentische Video-Formate. Viktor erklärt etwas. Ein Moment bei FourGive. Eine ehrliche Reflexion. Roher als LinkedIn.</w:t>
+            </w:r>
+          </w:p>
+        </w:tc>
+        <w:tc>
+          <w:tcPr>
+            <w:tcW w:type="dxa" w:w="2871"/>
+            <w:shd w:val="clear" w:color="auto" w:fill="F0EDFF"/>
+            <w:tcMar>
+              <w:top w:w="80" w:type="dxa"/>
+              <w:bottom w:w="80" w:type="dxa"/>
+              <w:left w:w="100" w:type="dxa"/>
+              <w:right w:w="100" w:type="dxa"/>
+            </w:tcMar>
+          </w:tcPr>
+          <w:p>
+            <w:r>
+              <w:rPr>
+                <w:rFonts w:ascii="Calibri" w:hAnsi="Calibri"/>
+                <w:b w:val="0"/>
+                <w:i w:val="0"/>
+                <w:color w:val="555555"/>
+                <w:sz w:val="19"/>
+              </w:rPr>
+              <w:t>Wenn Viktor bereit ist, sich selbst vor der Kamera zu zeigen. Höchster Produktionsaufwand per Kanal — aber stärkste Persönlichkeitswirkung.</w:t>
+            </w:r>
+          </w:p>
+        </w:tc>
+      </w:tr>
+      <w:tr>
+        <w:tc>
+          <w:tcPr>
+            <w:tcW w:type="dxa" w:w="2871"/>
+          </w:tcPr>
+          <w:p/>
+        </w:tc>
+        <w:tc>
+          <w:tcPr>
+            <w:tcW w:type="dxa" w:w="2871"/>
+          </w:tcPr>
+          <w:p/>
+        </w:tc>
+        <w:tc>
+          <w:tcPr>
+            <w:tcW w:type="dxa" w:w="2871"/>
+          </w:tcPr>
+          <w:p/>
+        </w:tc>
+      </w:tr>
+    </w:tbl>
+    <w:tbl>
+      <w:tblPr>
+        <w:tblLook w:firstColumn="1" w:firstRow="1" w:lastColumn="0" w:lastRow="0" w:noHBand="0" w:noVBand="1" w:val="04A0"/>
+        <w:tblBorders>
+          <w:top w:val="none"/>
+          <w:left w:val="none"/>
+          <w:bottom w:val="none"/>
+          <w:right w:val="none"/>
+          <w:insideH w:val="none"/>
+          <w:insideV w:val="none"/>
+        </w:tblBorders>
+        <w:tblW w:w="5000" w:type="pct"/>
+      </w:tblPr>
+      <w:tblGrid>
+        <w:gridCol w:w="8612"/>
+      </w:tblGrid>
+      <w:tr>
+        <w:tc>
+          <w:tcPr>
+            <w:tcW w:type="dxa" w:w="8612"/>
+            <w:shd w:val="clear" w:color="auto" w:fill="BD5435"/>
+            <w:tcMar>
+              <w:top w:w="100" w:type="dxa"/>
+              <w:bottom w:w="100" w:type="dxa"/>
+              <w:left w:w="150" w:type="dxa"/>
+              <w:right w:w="150" w:type="dxa"/>
+            </w:tcMar>
+          </w:tcPr>
+          <w:p>
+            <w:r>
+              <w:rPr>
+                <w:b/>
+                <w:color w:val="FFFFFF"/>
+                <w:sz w:val="20"/>
+              </w:rPr>
+              <w:t>INSTAGRAM / META — WAS DIESER KANAL FÜR BEASTLY BEWIRKT</w:t>
+            </w:r>
+          </w:p>
+        </w:tc>
+      </w:tr>
+      <w:tr>
+        <w:tc>
+          <w:tcPr>
+            <w:tcW w:type="dxa" w:w="8612"/>
+            <w:shd w:val="clear" w:color="auto" w:fill="EEE8F7"/>
+            <w:tcMar>
+              <w:top w:w="85" w:type="dxa"/>
+              <w:bottom w:w="90" w:type="dxa"/>
+              <w:left w:w="150" w:type="dxa"/>
+              <w:right w:w="150" w:type="dxa"/>
+            </w:tcMar>
+          </w:tcPr>
+          <w:p>
+            <w:r>
+              <w:rPr>
+                <w:b/>
+                <w:color w:val="4B319B"/>
+                <w:sz w:val="18"/>
+              </w:rPr>
+              <w:t>Warum Instagram / Meta</w:t>
+            </w:r>
+          </w:p>
+          <w:p>
+            <w:r>
+              <w:rPr>
+                <w:sz w:val="18"/>
+              </w:rPr>
+              <w:t>Beastly hat zwei starke Bilderwelten: kraftvolle Raubtiere als Investment-Code und schützenswerte Tiere für FourGive-Wirkungsgeschichten. Instagram ist das natürliche Zuhause dafür — wo LinkedIn auf Sprache setzt, setzt Instagram auf Bild. Menschen mit Tierwohl-Affinität werden emotional abgeholt, bevor sie über Investment nachdenken. Das erweitert den Kreis weit über den Finanzsektor hinaus.</w:t>
+            </w:r>
+          </w:p>
+        </w:tc>
+      </w:tr>
+      <w:tr>
+        <w:tc>
+          <w:tcPr>
+            <w:tcW w:type="dxa" w:w="8612"/>
+            <w:shd w:val="clear" w:color="auto" w:fill="F5F0FC"/>
+            <w:tcMar>
+              <w:top w:w="85" w:type="dxa"/>
+              <w:bottom w:w="90" w:type="dxa"/>
+              <w:left w:w="150" w:type="dxa"/>
+              <w:right w:w="150" w:type="dxa"/>
+            </w:tcMar>
+          </w:tcPr>
+          <w:p>
+            <w:r>
+              <w:rPr>
+                <w:b/>
+                <w:color w:val="4B319B"/>
+                <w:sz w:val="18"/>
+              </w:rPr>
+              <w:t>Meta-Ads-Synergie</w:t>
+            </w:r>
+          </w:p>
+          <w:p>
+            <w:r>
+              <w:rPr>
+                <w:sz w:val="18"/>
+              </w:rPr>
+              <w:t>Die Meta-Infrastruktur (Facebook + Instagram) erlaubt es, organische Creatives direkt als bezahlte Werbung einzusetzen. Kein doppelter Produktionsaufwand — ein Asset, zwei Nutzungswege. Organische Posts validieren, was als Ad skaliert werden soll.</w:t>
+            </w:r>
+          </w:p>
+        </w:tc>
+      </w:tr>
+      <w:tr>
+        <w:tc>
+          <w:tcPr>
+            <w:tcW w:type="dxa" w:w="8612"/>
+            <w:shd w:val="clear" w:color="auto" w:fill="EEE8F7"/>
+            <w:tcMar>
+              <w:top w:w="85" w:type="dxa"/>
+              <w:bottom w:w="90" w:type="dxa"/>
+              <w:left w:w="150" w:type="dxa"/>
+              <w:right w:w="150" w:type="dxa"/>
+            </w:tcMar>
+          </w:tcPr>
+          <w:p>
+            <w:r>
+              <w:rPr>
+                <w:b/>
+                <w:color w:val="4B319B"/>
+                <w:sz w:val="18"/>
+              </w:rPr>
+              <w:t>Was auf Instagram kommuniziert wird</w:t>
+            </w:r>
+          </w:p>
+          <w:p>
+            <w:r>
+              <w:rPr>
+                <w:sz w:val="18"/>
+              </w:rPr>
+              <w:t>—  Tier-Bildwelt: Raubtierfotos (Kraft, Präzision, Würde) alternierend mit FourGive-Momenten (Fürsorge, Wirkung)</w:t>
+            </w:r>
+          </w:p>
+          <w:p>
+            <w:r>
+              <w:rPr>
+                <w:sz w:val="18"/>
+              </w:rPr>
+              <w:t>—  Wirkungsgeschichten: Was passiert mit dem investierten Geld? Welches Tier wurde behandelt?</w:t>
+            </w:r>
+          </w:p>
+          <w:p>
+            <w:r>
+              <w:rPr>
+                <w:sz w:val="18"/>
+              </w:rPr>
+              <w:t>—  Viktor und Lydia persönlich: Authentische Momentaufnahmen, keine Hochglanz-Inszenierung</w:t>
+            </w:r>
+          </w:p>
+          <w:p>
+            <w:r>
+              <w:rPr>
+                <w:sz w:val="18"/>
+              </w:rPr>
+              <w:t>—  Zitat-Cards: Kernaussagen visuell aufbereitet im Beastly-Brand-Design</w:t>
+            </w:r>
+          </w:p>
+        </w:tc>
+      </w:tr>
+    </w:tbl>
+    <w:tbl>
+      <w:tblPr>
+        <w:tblLook w:firstColumn="1" w:firstRow="1" w:lastColumn="0" w:lastRow="0" w:noHBand="0" w:noVBand="1" w:val="04A0"/>
+        <w:tblBorders>
+          <w:top w:val="none"/>
+          <w:left w:val="none"/>
+          <w:bottom w:val="none"/>
+          <w:right w:val="none"/>
+          <w:insideH w:val="none"/>
+          <w:insideV w:val="none"/>
+        </w:tblBorders>
+        <w:tblW w:w="5000" w:type="pct"/>
+      </w:tblPr>
+      <w:tblGrid>
+        <w:gridCol w:w="8612"/>
+      </w:tblGrid>
+      <w:tr>
+        <w:tc>
+          <w:tcPr>
+            <w:tcW w:type="dxa" w:w="8612"/>
+            <w:shd w:val="clear" w:color="auto" w:fill="142233"/>
+            <w:tcMar>
+              <w:top w:w="100" w:type="dxa"/>
+              <w:bottom w:w="100" w:type="dxa"/>
+              <w:left w:w="150" w:type="dxa"/>
+              <w:right w:w="150" w:type="dxa"/>
+            </w:tcMar>
+          </w:tcPr>
+          <w:p>
+            <w:r>
+              <w:rPr>
+                <w:b/>
+                <w:color w:val="FFFFFF"/>
+                <w:sz w:val="20"/>
+              </w:rPr>
+              <w:t>TIKTOK — WAS DIESER KANAL FÜR BEASTLY BEWIRKT</w:t>
+            </w:r>
+          </w:p>
+        </w:tc>
+      </w:tr>
+      <w:tr>
+        <w:tc>
+          <w:tcPr>
+            <w:tcW w:type="dxa" w:w="8612"/>
+            <w:shd w:val="clear" w:color="auto" w:fill="EEE8F7"/>
+            <w:tcMar>
+              <w:top w:w="85" w:type="dxa"/>
+              <w:bottom w:w="90" w:type="dxa"/>
+              <w:left w:w="150" w:type="dxa"/>
+              <w:right w:w="150" w:type="dxa"/>
+            </w:tcMar>
+          </w:tcPr>
+          <w:p>
+            <w:r>
+              <w:rPr>
+                <w:b/>
+                <w:color w:val="4B319B"/>
+                <w:sz w:val="18"/>
+              </w:rPr>
+              <w:t>Warum TikTok</w:t>
+            </w:r>
+          </w:p>
+          <w:p>
+            <w:r>
+              <w:rPr>
+                <w:sz w:val="18"/>
+              </w:rPr>
+              <w:t>TikTok ist der einzige Kanal, auf dem unbekannte Accounts durch den Algorithmus grosse Reichweite erreichen können. Viktors Geschichte — vom Moment in Ägypten zur FINMA-Bewilligung — hat dieses Potenzial. Gleichzeitig erschliesst TikTok eine jüngere Retail-Zielgruppe (Millennials, Gen Z), die auf LinkedIn nicht erreichbar ist und Investieren als Alltagsthema wahrnimmt.</w:t>
+            </w:r>
+          </w:p>
+        </w:tc>
+      </w:tr>
+      <w:tr>
+        <w:tc>
+          <w:tcPr>
+            <w:tcW w:type="dxa" w:w="8612"/>
+            <w:shd w:val="clear" w:color="auto" w:fill="F5F0FC"/>
+            <w:tcMar>
+              <w:top w:w="85" w:type="dxa"/>
+              <w:bottom w:w="90" w:type="dxa"/>
+              <w:left w:w="150" w:type="dxa"/>
+              <w:right w:w="150" w:type="dxa"/>
+            </w:tcMar>
+          </w:tcPr>
+          <w:p>
+            <w:r>
+              <w:rPr>
+                <w:b/>
+                <w:color w:val="4B319B"/>
+                <w:sz w:val="18"/>
+              </w:rPr>
+              <w:t>Keine Hochglanz-Produktion — Authentizität gewinnt</w:t>
+            </w:r>
+          </w:p>
+          <w:p>
+            <w:r>
+              <w:rPr>
+                <w:sz w:val="18"/>
+              </w:rPr>
+              <w:t>Ein ehrlicher 60-Sekunden-Clip von Viktor, der erklärt warum er Beastly gegründet hat, ist wirkungsvoller als jedes produzierte Markenvideo. TikTok belohnt Echtheit und bestraft Inszenierung sofort.</w:t>
+            </w:r>
+          </w:p>
+        </w:tc>
+      </w:tr>
+      <w:tr>
+        <w:tc>
+          <w:tcPr>
+            <w:tcW w:type="dxa" w:w="8612"/>
+            <w:shd w:val="clear" w:color="auto" w:fill="EEE8F7"/>
+            <w:tcMar>
+              <w:top w:w="85" w:type="dxa"/>
+              <w:bottom w:w="90" w:type="dxa"/>
+              <w:left w:w="150" w:type="dxa"/>
+              <w:right w:w="150" w:type="dxa"/>
+            </w:tcMar>
+          </w:tcPr>
+          <w:p>
+            <w:r>
+              <w:rPr>
+                <w:b/>
+                <w:color w:val="4B319B"/>
+                <w:sz w:val="18"/>
+              </w:rPr>
+              <w:t>Was auf TikTok kommuniziert wird</w:t>
+            </w:r>
+          </w:p>
+          <w:p>
+            <w:r>
+              <w:rPr>
+                <w:sz w:val="18"/>
+              </w:rPr>
+              <w:t>—  Viktor erklärt in 60 Sekunden, warum Beastly existiert — kein Skript, kein Teleprompter</w:t>
+            </w:r>
+          </w:p>
+          <w:p>
+            <w:r>
+              <w:rPr>
+                <w:sz w:val="18"/>
+              </w:rPr>
+              <w:t>—  Momente aus der FourGive-Tierklinik in Ägypten: Was passiert dort, wen helfen wir?</w:t>
+            </w:r>
+          </w:p>
+          <w:p>
+            <w:r>
+              <w:rPr>
+                <w:sz w:val="18"/>
+              </w:rPr>
+              <w:t>—  Ehrliche Reflexionen: «Was ich über Investieren und Tierschutz gelernt habe»</w:t>
+            </w:r>
+          </w:p>
+          <w:p>
+            <w:r>
+              <w:rPr>
+                <w:sz w:val="18"/>
+              </w:rPr>
+              <w:t>—  Behind-the-Scenes: Wie baut man einen Fonds auf? Was macht die FINMA?</w:t>
+            </w:r>
+          </w:p>
+        </w:tc>
+      </w:tr>
+      <w:tr>
+        <w:tc>
+          <w:tcPr>
+            <w:tcW w:type="dxa" w:w="8612"/>
+            <w:shd w:val="clear" w:color="auto" w:fill="F5F0FC"/>
+            <w:tcMar>
+              <w:top w:w="85" w:type="dxa"/>
+              <w:bottom w:w="90" w:type="dxa"/>
+              <w:left w:w="150" w:type="dxa"/>
+              <w:right w:w="150" w:type="dxa"/>
+            </w:tcMar>
+          </w:tcPr>
+          <w:p>
+            <w:r>
+              <w:rPr>
+                <w:b/>
+                <w:color w:val="4B319B"/>
+                <w:sz w:val="18"/>
+              </w:rPr>
+              <w:t>Wichtige Bedingung</w:t>
+            </w:r>
+          </w:p>
+          <w:p>
+            <w:r>
+              <w:rPr>
+                <w:sz w:val="18"/>
+              </w:rPr>
+              <w:t>TikTok entfaltet Wirkung nur, wenn Viktor wirklich bereit ist, sich authentisch zu zeigen. Ein halbherziger Auftritt schadet mehr als er nützt. Wenn die Bereitschaft da ist, kann TikTok Beastly schneller bekannt machen als jeder andere Kanal.</w:t>
+            </w:r>
+          </w:p>
+        </w:tc>
+      </w:tr>
+    </w:tbl>
+    <w:p/>
+    <w:p>
+      <w:r>
+        <w:rPr>
+          <w:b/>
+          <w:color w:val="4B319B"/>
+          <w:sz w:val="20"/>
+        </w:rPr>
+        <w:t>Empfohlene Kombinationslogik</w:t>
+      </w:r>
+    </w:p>
+    <w:tbl>
+      <w:tblPr>
+        <w:tblStyle w:val="TableGrid"/>
+        <w:tblW w:type="auto" w:w="0"/>
+        <w:tblLook w:firstColumn="1" w:firstRow="1" w:lastColumn="0" w:lastRow="0" w:noHBand="0" w:noVBand="1" w:val="04A0"/>
+      </w:tblPr>
+      <w:tblGrid>
+        <w:gridCol w:w="4306"/>
+        <w:gridCol w:w="4306"/>
+      </w:tblGrid>
+      <w:tr>
+        <w:tc>
+          <w:tcPr>
+            <w:tcW w:type="dxa" w:w="4306"/>
+            <w:shd w:val="clear" w:color="auto" w:fill="142233"/>
+            <w:tcMar>
+              <w:top w:w="70" w:type="dxa"/>
+              <w:bottom w:w="70" w:type="dxa"/>
+              <w:left w:w="100" w:type="dxa"/>
+              <w:right w:w="100" w:type="dxa"/>
+            </w:tcMar>
+          </w:tcPr>
+          <w:p>
+            <w:r>
+              <w:rPr>
+                <w:rFonts w:ascii="Calibri" w:hAnsi="Calibri"/>
+                <w:b/>
+                <w:i w:val="0"/>
+                <w:color w:val="A176F4"/>
+                <w:sz w:val="18"/>
+              </w:rPr>
+              <w:t>RESSOURCEN / SITUATION</w:t>
+            </w:r>
+          </w:p>
+        </w:tc>
+        <w:tc>
+          <w:tcPr>
+            <w:tcW w:type="dxa" w:w="4306"/>
+            <w:shd w:val="clear" w:color="auto" w:fill="142233"/>
+            <w:tcMar>
+              <w:top w:w="70" w:type="dxa"/>
+              <w:bottom w:w="70" w:type="dxa"/>
+              <w:left w:w="100" w:type="dxa"/>
+              <w:right w:w="100" w:type="dxa"/>
+            </w:tcMar>
+          </w:tcPr>
+          <w:p>
+            <w:r>
+              <w:rPr>
+                <w:rFonts w:ascii="Calibri" w:hAnsi="Calibri"/>
+                <w:b/>
+                <w:i w:val="0"/>
+                <w:color w:val="A176F4"/>
+                <w:sz w:val="18"/>
+              </w:rPr>
+              <w:t>EMPFEHLUNG</w:t>
+            </w:r>
+          </w:p>
+        </w:tc>
+      </w:tr>
+      <w:tr>
+        <w:tc>
+          <w:tcPr>
+            <w:tcW w:type="dxa" w:w="4306"/>
+            <w:shd w:val="clear" w:color="auto" w:fill="F5F3FF"/>
+            <w:tcMar>
+              <w:top w:w="80" w:type="dxa"/>
+              <w:bottom w:w="80" w:type="dxa"/>
+              <w:left w:w="100" w:type="dxa"/>
+              <w:right w:w="100" w:type="dxa"/>
+            </w:tcMar>
+          </w:tcPr>
+          <w:p>
+            <w:r>
+              <w:rPr>
+                <w:rFonts w:ascii="Calibri" w:hAnsi="Calibri"/>
+                <w:b/>
+                <w:i w:val="0"/>
+                <w:color w:val="1A1033"/>
+                <w:sz w:val="19"/>
+              </w:rPr>
+              <w:t>Minimale Ressourcen / Startphase</w:t>
+            </w:r>
+          </w:p>
+        </w:tc>
+        <w:tc>
+          <w:tcPr>
+            <w:tcW w:type="dxa" w:w="4306"/>
+            <w:shd w:val="clear" w:color="auto" w:fill="F5F3FF"/>
+            <w:tcMar>
+              <w:top w:w="80" w:type="dxa"/>
+              <w:bottom w:w="80" w:type="dxa"/>
+              <w:left w:w="100" w:type="dxa"/>
+              <w:right w:w="100" w:type="dxa"/>
+            </w:tcMar>
+          </w:tcPr>
+          <w:p>
+            <w:r>
+              <w:rPr>
+                <w:rFonts w:ascii="Calibri" w:hAnsi="Calibri"/>
+                <w:b w:val="0"/>
+                <w:i w:val="0"/>
+                <w:color w:val="333333"/>
+                <w:sz w:val="19"/>
+              </w:rPr>
+              <w:t>LinkedIn allein (Viktor Profil + Beastly Markenkanal) — Fokus, Konsistenz, Qualität über Quantität.</w:t>
+            </w:r>
+          </w:p>
+        </w:tc>
+      </w:tr>
+      <w:tr>
+        <w:tc>
+          <w:tcPr>
+            <w:tcW w:type="dxa" w:w="4306"/>
+            <w:shd w:val="clear" w:color="auto" w:fill="EEF0FF"/>
+            <w:tcMar>
+              <w:top w:w="80" w:type="dxa"/>
+              <w:bottom w:w="80" w:type="dxa"/>
+              <w:left w:w="100" w:type="dxa"/>
+              <w:right w:w="100" w:type="dxa"/>
+            </w:tcMar>
+          </w:tcPr>
+          <w:p>
+            <w:r>
+              <w:rPr>
+                <w:rFonts w:ascii="Calibri" w:hAnsi="Calibri"/>
+                <w:b/>
+                <w:i w:val="0"/>
+                <w:color w:val="1A1033"/>
+                <w:sz w:val="19"/>
+              </w:rPr>
+              <w:t>Moderate Ressourcen / visueller Content vorhanden</w:t>
+            </w:r>
+          </w:p>
+        </w:tc>
+        <w:tc>
+          <w:tcPr>
+            <w:tcW w:type="dxa" w:w="4306"/>
+            <w:shd w:val="clear" w:color="auto" w:fill="EEF0FF"/>
+            <w:tcMar>
+              <w:top w:w="80" w:type="dxa"/>
+              <w:bottom w:w="80" w:type="dxa"/>
+              <w:left w:w="100" w:type="dxa"/>
+              <w:right w:w="100" w:type="dxa"/>
+            </w:tcMar>
+          </w:tcPr>
+          <w:p>
+            <w:r>
+              <w:rPr>
+                <w:rFonts w:ascii="Calibri" w:hAnsi="Calibri"/>
+                <w:b w:val="0"/>
+                <w:i w:val="0"/>
+                <w:color w:val="333333"/>
+                <w:sz w:val="19"/>
+              </w:rPr>
+              <w:t>LinkedIn + Instagram — visuelle Tierwohl-Inhalte ergänzen den textlastigen LinkedIn-Auftritt. Synergie mit Meta-Ads.</w:t>
+            </w:r>
+          </w:p>
+        </w:tc>
+      </w:tr>
+      <w:tr>
+        <w:tc>
+          <w:tcPr>
+            <w:tcW w:type="dxa" w:w="4306"/>
+            <w:shd w:val="clear" w:color="auto" w:fill="F5F3FF"/>
+            <w:tcMar>
+              <w:top w:w="80" w:type="dxa"/>
+              <w:bottom w:w="80" w:type="dxa"/>
+              <w:left w:w="100" w:type="dxa"/>
+              <w:right w:w="100" w:type="dxa"/>
+            </w:tcMar>
+          </w:tcPr>
+          <w:p>
+            <w:r>
+              <w:rPr>
+                <w:rFonts w:ascii="Calibri" w:hAnsi="Calibri"/>
+                <w:b/>
+                <w:i w:val="0"/>
+                <w:color w:val="1A1033"/>
+                <w:sz w:val="19"/>
+              </w:rPr>
+              <w:t>Volle Kapazität / nach erstem Fundament</w:t>
+            </w:r>
+          </w:p>
+        </w:tc>
+        <w:tc>
+          <w:tcPr>
+            <w:tcW w:type="dxa" w:w="4306"/>
+            <w:shd w:val="clear" w:color="auto" w:fill="F5F3FF"/>
+            <w:tcMar>
+              <w:top w:w="80" w:type="dxa"/>
+              <w:bottom w:w="80" w:type="dxa"/>
+              <w:left w:w="100" w:type="dxa"/>
+              <w:right w:w="100" w:type="dxa"/>
+            </w:tcMar>
+          </w:tcPr>
+          <w:p>
+            <w:r>
+              <w:rPr>
+                <w:rFonts w:ascii="Calibri" w:hAnsi="Calibri"/>
+                <w:b w:val="0"/>
+                <w:i w:val="0"/>
+                <w:color w:val="333333"/>
+                <w:sz w:val="19"/>
+              </w:rPr>
+              <w:t>LinkedIn + Instagram + TikTok — erst wenn das Fundament steht, die Botschaften klar sind und Produktionskapazität vorhanden ist.</w:t>
+            </w:r>
+          </w:p>
+        </w:tc>
+      </w:tr>
+    </w:tbl>
+    <w:tbl>
+      <w:tblPr>
+        <w:tblLook w:firstColumn="1" w:firstRow="1" w:lastColumn="0" w:lastRow="0" w:noHBand="0" w:noVBand="1" w:val="04A0"/>
+        <w:tblBorders>
+          <w:top w:val="none"/>
+          <w:left w:val="none"/>
+          <w:bottom w:val="none"/>
+          <w:right w:val="none"/>
+          <w:insideH w:val="none"/>
+          <w:insideV w:val="none"/>
+        </w:tblBorders>
+        <w:tblW w:w="5000" w:type="pct"/>
+      </w:tblPr>
+      <w:tblGrid>
+        <w:gridCol w:w="8612"/>
+      </w:tblGrid>
+      <w:tr>
+        <w:tc>
+          <w:tcPr>
+            <w:tcW w:type="dxa" w:w="8612"/>
+            <w:shd w:val="clear" w:color="auto" w:fill="E3F2FD"/>
+            <w:tcMar>
+              <w:top w:w="120" w:type="dxa"/>
+              <w:bottom w:w="120" w:type="dxa"/>
+              <w:left w:w="160" w:type="dxa"/>
+              <w:right w:w="160" w:type="dxa"/>
+            </w:tcMar>
+          </w:tcPr>
+          <w:p>
+            <w:r>
+              <w:rPr>
+                <w:b/>
+                <w:color w:val="1A237E"/>
+                <w:sz w:val="18"/>
+              </w:rPr>
+              <w:t xml:space="preserve">WARUM  </w:t>
+            </w:r>
+            <w:r>
+              <w:rPr>
+                <w:sz w:val="18"/>
+              </w:rPr>
+              <w:t>Mehr Kanäle bedeuten mehr Komplexität — nicht automatisch mehr Reichweite. Jeder Kanal braucht eigene Energie, eigenes Format und eigene Kadenz. Wer sich verteilt ohne Substanz, wirkt überall schwach statt auf einem Kanal stark.</w:t>
+            </w:r>
+          </w:p>
+          <w:p>
+            <w:r>
+              <w:rPr>
+                <w:sz w:val="18"/>
+              </w:rPr>
+              <w:t>LinkedIn ist gesetzt, weil er die Kernzielgruppe direkt trifft und gleichzeitig die nötige Tiefe erlaubt. Instagram und TikTok kommen hinzu, wenn das LinkedIn-Fundament steht — nicht davor. Die Entscheidung für Instagram oder TikTok hängt davon ab, welches Format Viktor und Lydia wirklich konsequent bespielen können und wollen.</w:t>
+            </w:r>
+          </w:p>
+        </w:tc>
+      </w:tr>
+    </w:tbl>
+    <w:p>
       <w:pPr>
         <w:pStyle w:val="ListBullet"/>
         <w:spacing w:after="60"/>
@@ -330,6 +1544,524 @@
         <w:t xml:space="preserve">    6.8  Social Media Ads</w:t>
       </w:r>
     </w:p>
+    <w:p>
+      <w:r>
+        <w:rPr>
+          <w:b w:val="0"/>
+          <w:sz w:val="18"/>
+        </w:rPr>
+        <w:t>Die Ads-Strategie folgt dem organischen Aufbau — nicht umgekehrt. Awareness-Ads verstärken, was organisch bereits resoniert. Conversion-Ads werden erst eingesetzt, wenn das Grundrauschen steht. Die Sequenz ist entscheidend: Fundament organisch aufbauen → Awareness-Ads schalten → Conversion-Ads einsetzen.</w:t>
+      </w:r>
+    </w:p>
+    <w:tbl>
+      <w:tblPr>
+        <w:tblLook w:firstColumn="1" w:firstRow="1" w:lastColumn="0" w:lastRow="0" w:noHBand="0" w:noVBand="1" w:val="04A0"/>
+        <w:tblBorders>
+          <w:top w:val="none"/>
+          <w:left w:val="none"/>
+          <w:bottom w:val="none"/>
+          <w:right w:val="none"/>
+          <w:insideH w:val="none"/>
+          <w:insideV w:val="none"/>
+        </w:tblBorders>
+        <w:tblW w:w="5000" w:type="pct"/>
+      </w:tblPr>
+      <w:tblGrid>
+        <w:gridCol w:w="8612"/>
+      </w:tblGrid>
+      <w:tr>
+        <w:tc>
+          <w:tcPr>
+            <w:tcW w:type="dxa" w:w="8612"/>
+            <w:shd w:val="clear" w:color="auto" w:fill="4b319b"/>
+            <w:tcMar>
+              <w:top w:w="100" w:type="dxa"/>
+              <w:bottom w:w="100" w:type="dxa"/>
+              <w:left w:w="150" w:type="dxa"/>
+              <w:right w:w="150" w:type="dxa"/>
+            </w:tcMar>
+          </w:tcPr>
+          <w:p>
+            <w:r>
+              <w:rPr>
+                <w:b/>
+                <w:color w:val="FFFFFF"/>
+                <w:sz w:val="20"/>
+              </w:rPr>
+              <w:t>PHASE 1 — AWARENESS</w:t>
+            </w:r>
+          </w:p>
+        </w:tc>
+      </w:tr>
+      <w:tr>
+        <w:tc>
+          <w:tcPr>
+            <w:tcW w:type="dxa" w:w="8612"/>
+            <w:shd w:val="clear" w:color="auto" w:fill="EEE8F7"/>
+            <w:tcMar>
+              <w:top w:w="85" w:type="dxa"/>
+              <w:bottom w:w="90" w:type="dxa"/>
+              <w:left w:w="150" w:type="dxa"/>
+              <w:right w:w="150" w:type="dxa"/>
+            </w:tcMar>
+          </w:tcPr>
+          <w:p>
+            <w:r>
+              <w:rPr>
+                <w:b/>
+                <w:color w:val="4B319B"/>
+                <w:sz w:val="18"/>
+              </w:rPr>
+              <w:t>Ziel</w:t>
+            </w:r>
+          </w:p>
+          <w:p>
+            <w:r>
+              <w:rPr>
+                <w:sz w:val="18"/>
+              </w:rPr>
+              <w:t>Grundrauschen aufbauen, erste Berührungspunkte schaffen, Marke bekannt machen — bevor ein Investment-CTA sinnvoll ist. Beastly muss zuerst erkannt werden, bevor es gewählt werden kann.</w:t>
+            </w:r>
+          </w:p>
+        </w:tc>
+      </w:tr>
+      <w:tr>
+        <w:tc>
+          <w:tcPr>
+            <w:tcW w:type="dxa" w:w="8612"/>
+            <w:shd w:val="clear" w:color="auto" w:fill="F5F0FC"/>
+            <w:tcMar>
+              <w:top w:w="85" w:type="dxa"/>
+              <w:bottom w:w="90" w:type="dxa"/>
+              <w:left w:w="150" w:type="dxa"/>
+              <w:right w:w="150" w:type="dxa"/>
+            </w:tcMar>
+          </w:tcPr>
+          <w:p>
+            <w:r>
+              <w:rPr>
+                <w:b/>
+                <w:color w:val="4B319B"/>
+                <w:sz w:val="18"/>
+              </w:rPr>
+              <w:t>Targeting-Logik</w:t>
+            </w:r>
+          </w:p>
+          <w:p>
+            <w:r>
+              <w:rPr>
+                <w:sz w:val="18"/>
+              </w:rPr>
+              <w:t>—  LinkedIn: Finanz-affines Publikum (Asset Management, Private Banking, Family Office) + Tierwohl-Interesse als kombiniertes Kriterium</w:t>
+            </w:r>
+          </w:p>
+          <w:p>
+            <w:r>
+              <w:rPr>
+                <w:sz w:val="18"/>
+              </w:rPr>
+              <w:t>—  Meta: Lookalike Audiences basierend auf ersten Website-Besuchern; Interessen-Targeting (Tierschutz + Geldanlage kombiniert)</w:t>
+            </w:r>
+          </w:p>
+          <w:p>
+            <w:r>
+              <w:rPr>
+                <w:sz w:val="18"/>
+              </w:rPr>
+              <w:t>—  Retargeting: Website-Besucher ohne Conversion, Video-Viewer mit &gt;75% Completion</w:t>
+            </w:r>
+          </w:p>
+        </w:tc>
+      </w:tr>
+      <w:tr>
+        <w:tc>
+          <w:tcPr>
+            <w:tcW w:type="dxa" w:w="8612"/>
+            <w:shd w:val="clear" w:color="auto" w:fill="EEE8F7"/>
+            <w:tcMar>
+              <w:top w:w="85" w:type="dxa"/>
+              <w:bottom w:w="90" w:type="dxa"/>
+              <w:left w:w="150" w:type="dxa"/>
+              <w:right w:w="150" w:type="dxa"/>
+            </w:tcMar>
+          </w:tcPr>
+          <w:p>
+            <w:r>
+              <w:rPr>
+                <w:b/>
+                <w:color w:val="4B319B"/>
+                <w:sz w:val="18"/>
+              </w:rPr>
+              <w:t>Creative-Prinzip</w:t>
+            </w:r>
+          </w:p>
+          <w:p>
+            <w:r>
+              <w:rPr>
+                <w:sz w:val="18"/>
+              </w:rPr>
+              <w:t>Emotion führt. Kein Produktpitch, keine Rendite-Zahlen, keine Gebühren-Listen. Die Geschichte steht im Vordergrund:</w:t>
+            </w:r>
+          </w:p>
+          <w:p>
+            <w:r>
+              <w:rPr>
+                <w:i/>
+                <w:sz w:val="18"/>
+              </w:rPr>
+              <w:t>«Wir haben eine Tierklinik in Ägypten gebaut. Daraus ist ein Investmentfonds geworden.»</w:t>
+            </w:r>
+          </w:p>
+          <w:p>
+            <w:r>
+              <w:rPr>
+                <w:sz w:val="18"/>
+              </w:rPr>
+              <w:t>Beide Bildwelten aktivieren: Raubtier-Codes für Investment-affines Publikum, Tiergeschichten für emotionalen Einstieg.</w:t>
+            </w:r>
+          </w:p>
+        </w:tc>
+      </w:tr>
+      <w:tr>
+        <w:tc>
+          <w:tcPr>
+            <w:tcW w:type="dxa" w:w="8612"/>
+            <w:shd w:val="clear" w:color="auto" w:fill="F5F0FC"/>
+            <w:tcMar>
+              <w:top w:w="85" w:type="dxa"/>
+              <w:bottom w:w="90" w:type="dxa"/>
+              <w:left w:w="150" w:type="dxa"/>
+              <w:right w:w="150" w:type="dxa"/>
+            </w:tcMar>
+          </w:tcPr>
+          <w:p>
+            <w:r>
+              <w:rPr>
+                <w:b/>
+                <w:color w:val="4B319B"/>
+                <w:sz w:val="18"/>
+              </w:rPr>
+              <w:t>Was gemessen wird</w:t>
+            </w:r>
+          </w:p>
+          <w:p>
+            <w:r>
+              <w:rPr>
+                <w:sz w:val="18"/>
+              </w:rPr>
+              <w:t>Reichweite, Klickrate auf Website, Bounce Rate, Follower-Wachstum Viktor LinkedIn, Video-Completion-Rate (Ziel: &gt;75%)</w:t>
+            </w:r>
+          </w:p>
+        </w:tc>
+      </w:tr>
+    </w:tbl>
+    <w:p/>
+    <w:tbl>
+      <w:tblPr>
+        <w:tblLook w:firstColumn="1" w:firstRow="1" w:lastColumn="0" w:lastRow="0" w:noHBand="0" w:noVBand="1" w:val="04A0"/>
+        <w:tblBorders>
+          <w:top w:val="none"/>
+          <w:left w:val="none"/>
+          <w:bottom w:val="none"/>
+          <w:right w:val="none"/>
+          <w:insideH w:val="none"/>
+          <w:insideV w:val="none"/>
+        </w:tblBorders>
+        <w:tblW w:w="5000" w:type="pct"/>
+      </w:tblPr>
+      <w:tblGrid>
+        <w:gridCol w:w="8612"/>
+      </w:tblGrid>
+      <w:tr>
+        <w:tc>
+          <w:tcPr>
+            <w:tcW w:type="dxa" w:w="8612"/>
+            <w:shd w:val="clear" w:color="auto" w:fill="142233"/>
+            <w:tcMar>
+              <w:top w:w="100" w:type="dxa"/>
+              <w:bottom w:w="100" w:type="dxa"/>
+              <w:left w:w="150" w:type="dxa"/>
+              <w:right w:w="150" w:type="dxa"/>
+            </w:tcMar>
+          </w:tcPr>
+          <w:p>
+            <w:r>
+              <w:rPr>
+                <w:b/>
+                <w:color w:val="FFFFFF"/>
+                <w:sz w:val="20"/>
+              </w:rPr>
+              <w:t>PHASE 2 — CONVERSION</w:t>
+            </w:r>
+          </w:p>
+        </w:tc>
+      </w:tr>
+      <w:tr>
+        <w:tc>
+          <w:tcPr>
+            <w:tcW w:type="dxa" w:w="8612"/>
+            <w:shd w:val="clear" w:color="auto" w:fill="EEE8F7"/>
+            <w:tcMar>
+              <w:top w:w="85" w:type="dxa"/>
+              <w:bottom w:w="90" w:type="dxa"/>
+              <w:left w:w="150" w:type="dxa"/>
+              <w:right w:w="150" w:type="dxa"/>
+            </w:tcMar>
+          </w:tcPr>
+          <w:p>
+            <w:r>
+              <w:rPr>
+                <w:b/>
+                <w:color w:val="4B319B"/>
+                <w:sz w:val="18"/>
+              </w:rPr>
+              <w:t>Wann</w:t>
+            </w:r>
+          </w:p>
+          <w:p>
+            <w:r>
+              <w:rPr>
+                <w:sz w:val="18"/>
+              </w:rPr>
+              <w:t>Wenn das organische Fundament steht: aktiver LinkedIn-Auftritt, Website live, erstes Grundrauschen aufgebaut. Conversion-Ads die vor dem Fundament geschaltet werden, verpuffen ohne Echo.</w:t>
+            </w:r>
+          </w:p>
+        </w:tc>
+      </w:tr>
+      <w:tr>
+        <w:tc>
+          <w:tcPr>
+            <w:tcW w:type="dxa" w:w="8612"/>
+            <w:shd w:val="clear" w:color="auto" w:fill="F5F0FC"/>
+            <w:tcMar>
+              <w:top w:w="85" w:type="dxa"/>
+              <w:bottom w:w="90" w:type="dxa"/>
+              <w:left w:w="150" w:type="dxa"/>
+              <w:right w:w="150" w:type="dxa"/>
+            </w:tcMar>
+          </w:tcPr>
+          <w:p>
+            <w:r>
+              <w:rPr>
+                <w:b/>
+                <w:color w:val="4B319B"/>
+                <w:sz w:val="18"/>
+              </w:rPr>
+              <w:t>Ziel</w:t>
+            </w:r>
+          </w:p>
+          <w:p>
+            <w:r>
+              <w:rPr>
+                <w:sz w:val="18"/>
+              </w:rPr>
+              <w:t>—  Retail-Anleger: direkt auf die Website → CHF 50 Mindestanlage → Depot-Eröffnung via Bank oder App</w:t>
+            </w:r>
+          </w:p>
+          <w:p>
+            <w:r>
+              <w:rPr>
+                <w:sz w:val="18"/>
+              </w:rPr>
+              <w:t>—  Professionelle Investoren: Kontaktaufnahme Viktor / Lydia → direktes Gespräch → Abschluss</w:t>
+            </w:r>
+          </w:p>
+        </w:tc>
+      </w:tr>
+      <w:tr>
+        <w:tc>
+          <w:tcPr>
+            <w:tcW w:type="dxa" w:w="8612"/>
+            <w:shd w:val="clear" w:color="auto" w:fill="EEE8F7"/>
+            <w:tcMar>
+              <w:top w:w="85" w:type="dxa"/>
+              <w:bottom w:w="90" w:type="dxa"/>
+              <w:left w:w="150" w:type="dxa"/>
+              <w:right w:w="150" w:type="dxa"/>
+            </w:tcMar>
+          </w:tcPr>
+          <w:p>
+            <w:r>
+              <w:rPr>
+                <w:b/>
+                <w:color w:val="4B319B"/>
+                <w:sz w:val="18"/>
+              </w:rPr>
+              <w:t>Targeting-Logik</w:t>
+            </w:r>
+          </w:p>
+          <w:p>
+            <w:r>
+              <w:rPr>
+                <w:sz w:val="18"/>
+              </w:rPr>
+              <w:t>—  Retargeting: Personen die die Website besucht haben, aber nicht konvertiert sind</w:t>
+            </w:r>
+          </w:p>
+          <w:p>
+            <w:r>
+              <w:rPr>
+                <w:sz w:val="18"/>
+              </w:rPr>
+              <w:t>—  Warme Audiences: Engagement mit Viktor's LinkedIn und dem Beastly-Unternehmenskanal</w:t>
+            </w:r>
+          </w:p>
+          <w:p>
+            <w:r>
+              <w:rPr>
+                <w:sz w:val="18"/>
+              </w:rPr>
+              <w:t>—  Lookalike-Erweiterung: Basierend auf ersten Investoren, sobald diese vorhanden sind</w:t>
+            </w:r>
+          </w:p>
+        </w:tc>
+      </w:tr>
+      <w:tr>
+        <w:tc>
+          <w:tcPr>
+            <w:tcW w:type="dxa" w:w="8612"/>
+            <w:shd w:val="clear" w:color="auto" w:fill="F5F0FC"/>
+            <w:tcMar>
+              <w:top w:w="85" w:type="dxa"/>
+              <w:bottom w:w="90" w:type="dxa"/>
+              <w:left w:w="150" w:type="dxa"/>
+              <w:right w:w="150" w:type="dxa"/>
+            </w:tcMar>
+          </w:tcPr>
+          <w:p>
+            <w:r>
+              <w:rPr>
+                <w:b/>
+                <w:color w:val="4B319B"/>
+                <w:sz w:val="18"/>
+              </w:rPr>
+              <w:t>Creative-Prinzip</w:t>
+            </w:r>
+          </w:p>
+          <w:p>
+            <w:r>
+              <w:rPr>
+                <w:sz w:val="18"/>
+              </w:rPr>
+              <w:t>Die Substanz ist bekannt — jetzt kommt die klare Aufforderung. Konkret, niedrigschwellig, direkt:</w:t>
+            </w:r>
+          </w:p>
+          <w:p>
+            <w:r>
+              <w:rPr>
+                <w:i/>
+                <w:sz w:val="18"/>
+              </w:rPr>
+              <w:t>«Tierschutz und Rendite. Ab CHF 50.» oder «Der einzige Asset Manager, der seine Löhne zeigt.»</w:t>
+            </w:r>
+          </w:p>
+          <w:p>
+            <w:r>
+              <w:rPr>
+                <w:sz w:val="18"/>
+              </w:rPr>
+              <w:t>Call-to-Action eindeutig, ohne Umwege.</w:t>
+            </w:r>
+          </w:p>
+        </w:tc>
+      </w:tr>
+      <w:tr>
+        <w:tc>
+          <w:tcPr>
+            <w:tcW w:type="dxa" w:w="8612"/>
+            <w:shd w:val="clear" w:color="auto" w:fill="EEE8F7"/>
+            <w:tcMar>
+              <w:top w:w="85" w:type="dxa"/>
+              <w:bottom w:w="90" w:type="dxa"/>
+              <w:left w:w="150" w:type="dxa"/>
+              <w:right w:w="150" w:type="dxa"/>
+            </w:tcMar>
+          </w:tcPr>
+          <w:p>
+            <w:r>
+              <w:rPr>
+                <w:b/>
+                <w:color w:val="4B319B"/>
+                <w:sz w:val="18"/>
+              </w:rPr>
+              <w:t>Plattform-Split</w:t>
+            </w:r>
+          </w:p>
+          <w:p>
+            <w:r>
+              <w:rPr>
+                <w:sz w:val="18"/>
+              </w:rPr>
+              <w:t>—  LinkedIn primär: Professionelle Zielgruppe im Entscheidungsmodus, höhere Konvertierungsqualität</w:t>
+            </w:r>
+          </w:p>
+          <w:p>
+            <w:r>
+              <w:rPr>
+                <w:sz w:val="18"/>
+              </w:rPr>
+              <w:t>—  Meta sekundär: Retail-Reichweite, emotionaler Abschluss für Kleinanleger</w:t>
+            </w:r>
+          </w:p>
+        </w:tc>
+      </w:tr>
+    </w:tbl>
+    <w:p/>
+    <w:tbl>
+      <w:tblPr>
+        <w:tblLook w:firstColumn="1" w:firstRow="1" w:lastColumn="0" w:lastRow="0" w:noHBand="0" w:noVBand="1" w:val="04A0"/>
+        <w:tblBorders>
+          <w:top w:val="none"/>
+          <w:left w:val="none"/>
+          <w:bottom w:val="none"/>
+          <w:right w:val="none"/>
+          <w:insideH w:val="none"/>
+          <w:insideV w:val="none"/>
+        </w:tblBorders>
+        <w:tblW w:w="5000" w:type="pct"/>
+      </w:tblPr>
+      <w:tblGrid>
+        <w:gridCol w:w="8612"/>
+      </w:tblGrid>
+      <w:tr>
+        <w:tc>
+          <w:tcPr>
+            <w:tcW w:type="dxa" w:w="8612"/>
+            <w:shd w:val="clear" w:color="auto" w:fill="E3F2FD"/>
+            <w:tcMar>
+              <w:top w:w="120" w:type="dxa"/>
+              <w:bottom w:w="120" w:type="dxa"/>
+              <w:left w:w="160" w:type="dxa"/>
+              <w:right w:w="160" w:type="dxa"/>
+            </w:tcMar>
+          </w:tcPr>
+          <w:p>
+            <w:r>
+              <w:rPr>
+                <w:b/>
+                <w:color w:val="1A237E"/>
+                <w:sz w:val="18"/>
+              </w:rPr>
+              <w:t xml:space="preserve">WARUM  </w:t>
+            </w:r>
+            <w:r>
+              <w:rPr>
+                <w:sz w:val="18"/>
+              </w:rPr>
+              <w:t>LinkedIn führt in beiden Phasen, weil die Kaufbereitschaft hier am höchsten ist: Die Zielgruppe befindet sich auf LinkedIn im professionellen Entscheidungsmodus. Meta ergänzt als emotionale Reichweitenplattform — besonders im Retail-Segment, wo der Einstieg unter CHF 100 liegt und der emotionale Impuls kaufentscheidend ist.</w:t>
+            </w:r>
+          </w:p>
+          <w:p>
+            <w:r>
+              <w:rPr>
+                <w:sz w:val="18"/>
+              </w:rPr>
+              <w:t>Die klare Trennung in zwei Phasen verhindert, dass Conversion-Budget verpufft, bevor die Marke bekannt ist. Awareness zuerst, Conversion danach — das ist die Sequenz.</w:t>
+            </w:r>
+          </w:p>
+        </w:tc>
+      </w:tr>
+    </w:tbl>
     <w:p>
       <w:pPr>
         <w:pStyle w:val="ListBullet"/>
@@ -3812,666 +5544,6 @@
     </w:p>
     <w:p>
       <w:pPr>
-        <w:spacing w:after="140"/>
-      </w:pPr>
-      <w:r>
-        <w:rPr>
-          <w:rFonts w:ascii="Calibri" w:hAnsi="Calibri"/>
-          <w:b w:val="0"/>
-          <w:i w:val="0"/>
-          <w:color w:val="333333"/>
-          <w:sz w:val="21"/>
-        </w:rPr>
-        <w:t>Beastly startet mit LinkedIn — das ist gesetzt. Alle weiteren Kanäle sind kombinierbare Optionen, die zur bestehenden LinkedIn-Basis hinzugenommen werden können, wenn Kapazität und Bereitschaft vorhanden sind.</w:t>
-      </w:r>
-    </w:p>
-    <w:tbl>
-      <w:tblPr>
-        <w:tblStyle w:val="TableGrid"/>
-        <w:tblW w:type="auto" w:w="0"/>
-        <w:tblLook w:firstColumn="1" w:firstRow="1" w:lastColumn="0" w:lastRow="0" w:noHBand="0" w:noVBand="1" w:val="04A0"/>
-      </w:tblPr>
-      <w:tblGrid>
-        <w:gridCol w:w="8612"/>
-      </w:tblGrid>
-      <w:tr>
-        <w:tc>
-          <w:tcPr>
-            <w:tcW w:type="dxa" w:w="8612"/>
-            <w:shd w:val="clear" w:color="auto" w:fill="0A66C2"/>
-            <w:tcMar>
-              <w:top w:w="100" w:type="dxa"/>
-              <w:bottom w:w="100" w:type="dxa"/>
-              <w:left w:w="140" w:type="dxa"/>
-              <w:right w:w="140" w:type="dxa"/>
-            </w:tcMar>
-          </w:tcPr>
-          <w:p>
-            <w:r>
-              <w:rPr>
-                <w:rFonts w:ascii="Calibri" w:hAnsi="Calibri"/>
-                <w:b/>
-                <w:i w:val="0"/>
-                <w:color w:val="FFFFFF"/>
-                <w:sz w:val="22"/>
-              </w:rPr>
-              <w:t>LINKEDIN — Gesetzter Ausgangspunkt (nicht verhandelbar)</w:t>
-            </w:r>
-          </w:p>
-          <w:p>
-            <w:r>
-              <w:rPr>
-                <w:rFonts w:ascii="Calibri" w:hAnsi="Calibri"/>
-                <w:b w:val="0"/>
-                <w:i w:val="0"/>
-                <w:color w:val="FFFFFF"/>
-                <w:sz w:val="19"/>
-              </w:rPr>
-              <w:t>→  Professionelle Zielgruppe ist hier präsent — sowohl Retail-affine als auch institutionelle Investoren</w:t>
-            </w:r>
-          </w:p>
-          <w:p>
-            <w:r>
-              <w:rPr>
-                <w:rFonts w:ascii="Calibri" w:hAnsi="Calibri"/>
-                <w:b w:val="0"/>
-                <w:i w:val="0"/>
-                <w:color w:val="FFFFFF"/>
-                <w:sz w:val="19"/>
-              </w:rPr>
-              <w:t>→  Plattform erlaubt tiefe, substanzielle Inhalte — ideal für Vertrauen und Erklärung</w:t>
-            </w:r>
-          </w:p>
-          <w:p>
-            <w:r>
-              <w:rPr>
-                <w:rFonts w:ascii="Calibri" w:hAnsi="Calibri"/>
-                <w:b w:val="0"/>
-                <w:i w:val="0"/>
-                <w:color w:val="FFFFFF"/>
-                <w:sz w:val="19"/>
-              </w:rPr>
-              <w:t>→  Viktors persönliches Profil und Beastlys Markenkanal sind auf derselben Plattform</w:t>
-            </w:r>
-          </w:p>
-          <w:p>
-            <w:r>
-              <w:rPr>
-                <w:rFonts w:ascii="Calibri" w:hAnsi="Calibri"/>
-                <w:b w:val="0"/>
-                <w:i w:val="0"/>
-                <w:color w:val="FFFFFF"/>
-                <w:sz w:val="19"/>
-              </w:rPr>
-              <w:t>→  Höchste Qualität der Engagements im Vergleich zu anderen Kanälen</w:t>
-            </w:r>
-          </w:p>
-        </w:tc>
-      </w:tr>
-    </w:tbl>
-    <w:p>
-      <w:pPr>
-        <w:spacing w:after="120"/>
-      </w:pPr>
-    </w:p>
-    <w:p>
-      <w:pPr>
-        <w:spacing w:before="160" w:after="60"/>
-      </w:pPr>
-      <w:r>
-        <w:rPr>
-          <w:rFonts w:ascii="Calibri" w:hAnsi="Calibri"/>
-          <w:b/>
-          <w:i w:val="0"/>
-          <w:color w:val="142233"/>
-          <w:sz w:val="21"/>
-        </w:rPr>
-        <w:t>Kombinierbare Erweiterungsoptionen</w:t>
-      </w:r>
-    </w:p>
-    <w:tbl>
-      <w:tblPr>
-        <w:tblStyle w:val="TableGrid"/>
-        <w:tblW w:type="auto" w:w="0"/>
-        <w:tblLook w:firstColumn="1" w:firstRow="1" w:lastColumn="0" w:lastRow="0" w:noHBand="0" w:noVBand="1" w:val="04A0"/>
-      </w:tblPr>
-      <w:tblGrid>
-        <w:gridCol w:w="2871"/>
-        <w:gridCol w:w="2871"/>
-        <w:gridCol w:w="2871"/>
-      </w:tblGrid>
-      <w:tr>
-        <w:tc>
-          <w:tcPr>
-            <w:tcW w:type="dxa" w:w="2871"/>
-            <w:shd w:val="clear" w:color="auto" w:fill="1a1033"/>
-            <w:tcMar>
-              <w:top w:w="80" w:type="dxa"/>
-              <w:bottom w:w="80" w:type="dxa"/>
-              <w:left w:w="100" w:type="dxa"/>
-              <w:right w:w="100" w:type="dxa"/>
-            </w:tcMar>
-          </w:tcPr>
-          <w:p>
-            <w:r>
-              <w:rPr>
-                <w:rFonts w:ascii="Calibri" w:hAnsi="Calibri"/>
-                <w:b/>
-                <w:i w:val="0"/>
-                <w:color w:val="A176F4"/>
-                <w:sz w:val="18"/>
-              </w:rPr>
-              <w:t>KANAL</w:t>
-            </w:r>
-          </w:p>
-        </w:tc>
-        <w:tc>
-          <w:tcPr>
-            <w:tcW w:type="dxa" w:w="2871"/>
-            <w:shd w:val="clear" w:color="auto" w:fill="1a1033"/>
-            <w:tcMar>
-              <w:top w:w="80" w:type="dxa"/>
-              <w:bottom w:w="80" w:type="dxa"/>
-              <w:left w:w="100" w:type="dxa"/>
-              <w:right w:w="100" w:type="dxa"/>
-            </w:tcMar>
-          </w:tcPr>
-          <w:p>
-            <w:r>
-              <w:rPr>
-                <w:rFonts w:ascii="Calibri" w:hAnsi="Calibri"/>
-                <w:b/>
-                <w:i w:val="0"/>
-                <w:color w:val="A176F4"/>
-                <w:sz w:val="18"/>
-              </w:rPr>
-              <w:t>SCHWERPUNKT &amp; INHALT</w:t>
-            </w:r>
-          </w:p>
-        </w:tc>
-        <w:tc>
-          <w:tcPr>
-            <w:tcW w:type="dxa" w:w="2871"/>
-            <w:shd w:val="clear" w:color="auto" w:fill="1a1033"/>
-            <w:tcMar>
-              <w:top w:w="80" w:type="dxa"/>
-              <w:bottom w:w="80" w:type="dxa"/>
-              <w:left w:w="100" w:type="dxa"/>
-              <w:right w:w="100" w:type="dxa"/>
-            </w:tcMar>
-          </w:tcPr>
-          <w:p>
-            <w:r>
-              <w:rPr>
-                <w:rFonts w:ascii="Calibri" w:hAnsi="Calibri"/>
-                <w:b/>
-                <w:i w:val="0"/>
-                <w:color w:val="A176F4"/>
-                <w:sz w:val="18"/>
-              </w:rPr>
-              <w:t>WANN SINNVOLL</w:t>
-            </w:r>
-          </w:p>
-        </w:tc>
-      </w:tr>
-      <w:tr>
-        <w:tc>
-          <w:tcPr>
-            <w:tcW w:type="dxa" w:w="2871"/>
-            <w:shd w:val="clear" w:color="auto" w:fill="EDE8FF"/>
-            <w:tcMar>
-              <w:top w:w="80" w:type="dxa"/>
-              <w:bottom w:w="80" w:type="dxa"/>
-              <w:left w:w="100" w:type="dxa"/>
-              <w:right w:w="100" w:type="dxa"/>
-            </w:tcMar>
-          </w:tcPr>
-          <w:p>
-            <w:r>
-              <w:rPr>
-                <w:rFonts w:ascii="Calibri" w:hAnsi="Calibri"/>
-                <w:b/>
-                <w:i w:val="0"/>
-                <w:color w:val="4B319B"/>
-                <w:sz w:val="20"/>
-              </w:rPr>
-              <w:t>+  INSTAGRAM / META</w:t>
-            </w:r>
-          </w:p>
-        </w:tc>
-        <w:tc>
-          <w:tcPr>
-            <w:tcW w:type="dxa" w:w="2871"/>
-            <w:shd w:val="clear" w:color="auto" w:fill="F8F6FF"/>
-            <w:tcMar>
-              <w:top w:w="80" w:type="dxa"/>
-              <w:bottom w:w="80" w:type="dxa"/>
-              <w:left w:w="100" w:type="dxa"/>
-              <w:right w:w="100" w:type="dxa"/>
-            </w:tcMar>
-          </w:tcPr>
-          <w:p>
-            <w:r>
-              <w:rPr>
-                <w:rFonts w:ascii="Calibri" w:hAnsi="Calibri"/>
-                <w:b w:val="0"/>
-                <w:i w:val="0"/>
-                <w:color w:val="333333"/>
-                <w:sz w:val="19"/>
-              </w:rPr>
-              <w:t>Visueller Schwerpunkt: Dual-Bildwelt, Tierwohl-Momente, FourGive-Geschichten, emotionale Momentaufnahmen. Beide Botschaften (Invest + Tierwohl) — Emotion führt.</w:t>
-            </w:r>
-          </w:p>
-        </w:tc>
-        <w:tc>
-          <w:tcPr>
-            <w:tcW w:type="dxa" w:w="2871"/>
-            <w:shd w:val="clear" w:color="auto" w:fill="F8F6FF"/>
-            <w:tcMar>
-              <w:top w:w="80" w:type="dxa"/>
-              <w:bottom w:w="80" w:type="dxa"/>
-              <w:left w:w="100" w:type="dxa"/>
-              <w:right w:w="100" w:type="dxa"/>
-            </w:tcMar>
-          </w:tcPr>
-          <w:p>
-            <w:r>
-              <w:rPr>
-                <w:rFonts w:ascii="Calibri" w:hAnsi="Calibri"/>
-                <w:b w:val="0"/>
-                <w:i w:val="0"/>
-                <w:color w:val="555555"/>
-                <w:sz w:val="19"/>
-              </w:rPr>
-              <w:t>Wenn visueller Content (Tierbilder, FourGive-Momente) produziert werden kann. Synergie mit Meta-Ads.</w:t>
-            </w:r>
-          </w:p>
-        </w:tc>
-      </w:tr>
-      <w:tr>
-        <w:tc>
-          <w:tcPr>
-            <w:tcW w:type="dxa" w:w="2871"/>
-            <w:shd w:val="clear" w:color="auto" w:fill="EDE8FF"/>
-            <w:tcMar>
-              <w:top w:w="80" w:type="dxa"/>
-              <w:bottom w:w="80" w:type="dxa"/>
-              <w:left w:w="100" w:type="dxa"/>
-              <w:right w:w="100" w:type="dxa"/>
-            </w:tcMar>
-          </w:tcPr>
-          <w:p>
-            <w:r>
-              <w:rPr>
-                <w:rFonts w:ascii="Calibri" w:hAnsi="Calibri"/>
-                <w:b/>
-                <w:i w:val="0"/>
-                <w:color w:val="4B319B"/>
-                <w:sz w:val="20"/>
-              </w:rPr>
-              <w:t>+  TIKTOK</w:t>
-            </w:r>
-          </w:p>
-        </w:tc>
-        <w:tc>
-          <w:tcPr>
-            <w:tcW w:type="dxa" w:w="2871"/>
-            <w:shd w:val="clear" w:color="auto" w:fill="F0EDFF"/>
-            <w:tcMar>
-              <w:top w:w="80" w:type="dxa"/>
-              <w:bottom w:w="80" w:type="dxa"/>
-              <w:left w:w="100" w:type="dxa"/>
-              <w:right w:w="100" w:type="dxa"/>
-            </w:tcMar>
-          </w:tcPr>
-          <w:p>
-            <w:r>
-              <w:rPr>
-                <w:rFonts w:ascii="Calibri" w:hAnsi="Calibri"/>
-                <w:b w:val="0"/>
-                <w:i w:val="0"/>
-                <w:color w:val="333333"/>
-                <w:sz w:val="19"/>
-              </w:rPr>
-              <w:t>Persönlichkeit und Gesichter: kurze, authentische Video-Formate. Viktor erklärt etwas. Ein Moment bei FourGive. Eine ehrliche Reflexion. Roher als LinkedIn.</w:t>
-            </w:r>
-          </w:p>
-        </w:tc>
-        <w:tc>
-          <w:tcPr>
-            <w:tcW w:type="dxa" w:w="2871"/>
-            <w:shd w:val="clear" w:color="auto" w:fill="F0EDFF"/>
-            <w:tcMar>
-              <w:top w:w="80" w:type="dxa"/>
-              <w:bottom w:w="80" w:type="dxa"/>
-              <w:left w:w="100" w:type="dxa"/>
-              <w:right w:w="100" w:type="dxa"/>
-            </w:tcMar>
-          </w:tcPr>
-          <w:p>
-            <w:r>
-              <w:rPr>
-                <w:rFonts w:ascii="Calibri" w:hAnsi="Calibri"/>
-                <w:b w:val="0"/>
-                <w:i w:val="0"/>
-                <w:color w:val="555555"/>
-                <w:sz w:val="19"/>
-              </w:rPr>
-              <w:t>Wenn Viktor bereit ist, sich selbst vor der Kamera zu zeigen. Höchster Produktionsaufwand per Kanal — aber stärkste Persönlichkeitswirkung.</w:t>
-            </w:r>
-          </w:p>
-        </w:tc>
-      </w:tr>
-      <w:tr>
-        <w:tc>
-          <w:tcPr>
-            <w:tcW w:type="dxa" w:w="2871"/>
-          </w:tcPr>
-          <w:p/>
-        </w:tc>
-        <w:tc>
-          <w:tcPr>
-            <w:tcW w:type="dxa" w:w="2871"/>
-          </w:tcPr>
-          <w:p/>
-        </w:tc>
-        <w:tc>
-          <w:tcPr>
-            <w:tcW w:type="dxa" w:w="2871"/>
-          </w:tcPr>
-          <w:p/>
-        </w:tc>
-      </w:tr>
-    </w:tbl>
-    <w:p>
-      <w:pPr>
-        <w:spacing w:after="120"/>
-      </w:pPr>
-    </w:p>
-    <w:p>
-      <w:pPr>
-        <w:spacing w:before="160" w:after="60"/>
-      </w:pPr>
-      <w:r>
-        <w:rPr>
-          <w:rFonts w:ascii="Calibri" w:hAnsi="Calibri"/>
-          <w:b/>
-          <w:i w:val="0"/>
-          <w:color w:val="142233"/>
-          <w:sz w:val="21"/>
-        </w:rPr>
-        <w:t>Empfohlene Kombinationslogik</w:t>
-      </w:r>
-    </w:p>
-    <w:tbl>
-      <w:tblPr>
-        <w:tblStyle w:val="TableGrid"/>
-        <w:tblW w:type="auto" w:w="0"/>
-        <w:tblLook w:firstColumn="1" w:firstRow="1" w:lastColumn="0" w:lastRow="0" w:noHBand="0" w:noVBand="1" w:val="04A0"/>
-      </w:tblPr>
-      <w:tblGrid>
-        <w:gridCol w:w="4306"/>
-        <w:gridCol w:w="4306"/>
-      </w:tblGrid>
-      <w:tr>
-        <w:tc>
-          <w:tcPr>
-            <w:tcW w:type="dxa" w:w="4306"/>
-            <w:shd w:val="clear" w:color="auto" w:fill="142233"/>
-            <w:tcMar>
-              <w:top w:w="70" w:type="dxa"/>
-              <w:bottom w:w="70" w:type="dxa"/>
-              <w:left w:w="100" w:type="dxa"/>
-              <w:right w:w="100" w:type="dxa"/>
-            </w:tcMar>
-          </w:tcPr>
-          <w:p>
-            <w:r>
-              <w:rPr>
-                <w:rFonts w:ascii="Calibri" w:hAnsi="Calibri"/>
-                <w:b/>
-                <w:i w:val="0"/>
-                <w:color w:val="A176F4"/>
-                <w:sz w:val="18"/>
-              </w:rPr>
-              <w:t>RESSOURCEN / SITUATION</w:t>
-            </w:r>
-          </w:p>
-        </w:tc>
-        <w:tc>
-          <w:tcPr>
-            <w:tcW w:type="dxa" w:w="4306"/>
-            <w:shd w:val="clear" w:color="auto" w:fill="142233"/>
-            <w:tcMar>
-              <w:top w:w="70" w:type="dxa"/>
-              <w:bottom w:w="70" w:type="dxa"/>
-              <w:left w:w="100" w:type="dxa"/>
-              <w:right w:w="100" w:type="dxa"/>
-            </w:tcMar>
-          </w:tcPr>
-          <w:p>
-            <w:r>
-              <w:rPr>
-                <w:rFonts w:ascii="Calibri" w:hAnsi="Calibri"/>
-                <w:b/>
-                <w:i w:val="0"/>
-                <w:color w:val="A176F4"/>
-                <w:sz w:val="18"/>
-              </w:rPr>
-              <w:t>EMPFEHLUNG</w:t>
-            </w:r>
-          </w:p>
-        </w:tc>
-      </w:tr>
-      <w:tr>
-        <w:tc>
-          <w:tcPr>
-            <w:tcW w:type="dxa" w:w="4306"/>
-            <w:shd w:val="clear" w:color="auto" w:fill="F5F3FF"/>
-            <w:tcMar>
-              <w:top w:w="80" w:type="dxa"/>
-              <w:bottom w:w="80" w:type="dxa"/>
-              <w:left w:w="100" w:type="dxa"/>
-              <w:right w:w="100" w:type="dxa"/>
-            </w:tcMar>
-          </w:tcPr>
-          <w:p>
-            <w:r>
-              <w:rPr>
-                <w:rFonts w:ascii="Calibri" w:hAnsi="Calibri"/>
-                <w:b/>
-                <w:i w:val="0"/>
-                <w:color w:val="1A1033"/>
-                <w:sz w:val="19"/>
-              </w:rPr>
-              <w:t>Minimale Ressourcen / Startphase</w:t>
-            </w:r>
-          </w:p>
-        </w:tc>
-        <w:tc>
-          <w:tcPr>
-            <w:tcW w:type="dxa" w:w="4306"/>
-            <w:shd w:val="clear" w:color="auto" w:fill="F5F3FF"/>
-            <w:tcMar>
-              <w:top w:w="80" w:type="dxa"/>
-              <w:bottom w:w="80" w:type="dxa"/>
-              <w:left w:w="100" w:type="dxa"/>
-              <w:right w:w="100" w:type="dxa"/>
-            </w:tcMar>
-          </w:tcPr>
-          <w:p>
-            <w:r>
-              <w:rPr>
-                <w:rFonts w:ascii="Calibri" w:hAnsi="Calibri"/>
-                <w:b w:val="0"/>
-                <w:i w:val="0"/>
-                <w:color w:val="333333"/>
-                <w:sz w:val="19"/>
-              </w:rPr>
-              <w:t>LinkedIn allein (Viktor Profil + Beastly Markenkanal) — Fokus, Konsistenz, Qualität über Quantität.</w:t>
-            </w:r>
-          </w:p>
-        </w:tc>
-      </w:tr>
-      <w:tr>
-        <w:tc>
-          <w:tcPr>
-            <w:tcW w:type="dxa" w:w="4306"/>
-            <w:shd w:val="clear" w:color="auto" w:fill="EEF0FF"/>
-            <w:tcMar>
-              <w:top w:w="80" w:type="dxa"/>
-              <w:bottom w:w="80" w:type="dxa"/>
-              <w:left w:w="100" w:type="dxa"/>
-              <w:right w:w="100" w:type="dxa"/>
-            </w:tcMar>
-          </w:tcPr>
-          <w:p>
-            <w:r>
-              <w:rPr>
-                <w:rFonts w:ascii="Calibri" w:hAnsi="Calibri"/>
-                <w:b/>
-                <w:i w:val="0"/>
-                <w:color w:val="1A1033"/>
-                <w:sz w:val="19"/>
-              </w:rPr>
-              <w:t>Moderate Ressourcen / visueller Content vorhanden</w:t>
-            </w:r>
-          </w:p>
-        </w:tc>
-        <w:tc>
-          <w:tcPr>
-            <w:tcW w:type="dxa" w:w="4306"/>
-            <w:shd w:val="clear" w:color="auto" w:fill="EEF0FF"/>
-            <w:tcMar>
-              <w:top w:w="80" w:type="dxa"/>
-              <w:bottom w:w="80" w:type="dxa"/>
-              <w:left w:w="100" w:type="dxa"/>
-              <w:right w:w="100" w:type="dxa"/>
-            </w:tcMar>
-          </w:tcPr>
-          <w:p>
-            <w:r>
-              <w:rPr>
-                <w:rFonts w:ascii="Calibri" w:hAnsi="Calibri"/>
-                <w:b w:val="0"/>
-                <w:i w:val="0"/>
-                <w:color w:val="333333"/>
-                <w:sz w:val="19"/>
-              </w:rPr>
-              <w:t>LinkedIn + Instagram — visuelle Tierwohl-Inhalte ergänzen den textlastigen LinkedIn-Auftritt. Synergie mit Meta-Ads.</w:t>
-            </w:r>
-          </w:p>
-        </w:tc>
-      </w:tr>
-      <w:tr>
-        <w:tc>
-          <w:tcPr>
-            <w:tcW w:type="dxa" w:w="4306"/>
-            <w:shd w:val="clear" w:color="auto" w:fill="F5F3FF"/>
-            <w:tcMar>
-              <w:top w:w="80" w:type="dxa"/>
-              <w:bottom w:w="80" w:type="dxa"/>
-              <w:left w:w="100" w:type="dxa"/>
-              <w:right w:w="100" w:type="dxa"/>
-            </w:tcMar>
-          </w:tcPr>
-          <w:p>
-            <w:r>
-              <w:rPr>
-                <w:rFonts w:ascii="Calibri" w:hAnsi="Calibri"/>
-                <w:b/>
-                <w:i w:val="0"/>
-                <w:color w:val="1A1033"/>
-                <w:sz w:val="19"/>
-              </w:rPr>
-              <w:t>Volle Kapazität / nach erstem Fundament</w:t>
-            </w:r>
-          </w:p>
-        </w:tc>
-        <w:tc>
-          <w:tcPr>
-            <w:tcW w:type="dxa" w:w="4306"/>
-            <w:shd w:val="clear" w:color="auto" w:fill="F5F3FF"/>
-            <w:tcMar>
-              <w:top w:w="80" w:type="dxa"/>
-              <w:bottom w:w="80" w:type="dxa"/>
-              <w:left w:w="100" w:type="dxa"/>
-              <w:right w:w="100" w:type="dxa"/>
-            </w:tcMar>
-          </w:tcPr>
-          <w:p>
-            <w:r>
-              <w:rPr>
-                <w:rFonts w:ascii="Calibri" w:hAnsi="Calibri"/>
-                <w:b w:val="0"/>
-                <w:i w:val="0"/>
-                <w:color w:val="333333"/>
-                <w:sz w:val="19"/>
-              </w:rPr>
-              <w:t>LinkedIn + Instagram + TikTok — erst wenn das Fundament steht, die Botschaften klar sind und Produktionskapazität vorhanden ist.</w:t>
-            </w:r>
-          </w:p>
-        </w:tc>
-      </w:tr>
-    </w:tbl>
-    <w:p>
-      <w:pPr>
-        <w:spacing w:after="80"/>
-      </w:pPr>
-    </w:p>
-    <w:tbl>
-      <w:tblPr>
-        <w:tblStyle w:val="TableGrid"/>
-        <w:tblW w:type="auto" w:w="0"/>
-        <w:tblLook w:firstColumn="1" w:firstRow="1" w:lastColumn="0" w:lastRow="0" w:noHBand="0" w:noVBand="1" w:val="04A0"/>
-      </w:tblPr>
-      <w:tblGrid>
-        <w:gridCol w:w="8612"/>
-      </w:tblGrid>
-      <w:tr>
-        <w:tc>
-          <w:tcPr>
-            <w:tcW w:type="dxa" w:w="8612"/>
-            <w:shd w:val="clear" w:color="auto" w:fill="EDF2FB"/>
-            <w:tcMar>
-              <w:top w:w="80" w:type="dxa"/>
-              <w:bottom w:w="80" w:type="dxa"/>
-              <w:left w:w="120" w:type="dxa"/>
-              <w:right w:w="120" w:type="dxa"/>
-            </w:tcMar>
-          </w:tcPr>
-          <w:p>
-            <w:r>
-              <w:rPr>
-                <w:rFonts w:ascii="Calibri" w:hAnsi="Calibri"/>
-                <w:b/>
-                <w:i w:val="0"/>
-                <w:color w:val="4B319B"/>
-                <w:sz w:val="17"/>
-              </w:rPr>
-              <w:t xml:space="preserve">WARUM  </w:t>
-            </w:r>
-            <w:r>
-              <w:rPr>
-                <w:rFonts w:ascii="Calibri" w:hAnsi="Calibri"/>
-                <w:b w:val="0"/>
-                <w:i w:val="0"/>
-                <w:color w:val="1A1033"/>
-                <w:sz w:val="19"/>
-              </w:rPr>
-              <w:t>Nicht «alle Kanäle, weil man dann überall präsent ist» — sondern «der richtige Kanal mit der richtigen Energie». Beastly ist ein erklärungsbedürftiges Produkt. Mehr Kanäle bedeuten mehr Komplexität, mehr Inkonsistenz-Risiko und mehr Produktionsaufwand. LinkedIn ist die einzige Plattform, wo alle Zielgruppen gleichzeitig präsent sind und wo Tiefe möglich ist. Alles andere ist Erweiterung — nicht Ersatz.</w:t>
-            </w:r>
-          </w:p>
-        </w:tc>
-      </w:tr>
-    </w:tbl>
-    <w:p>
-      <w:pPr>
-        <w:spacing w:after="80"/>
-      </w:pPr>
-    </w:p>
-    <w:p>
-      <w:pPr>
         <w:spacing w:before="240" w:after="80"/>
       </w:pPr>
       <w:r>

</xml_diff>

<commit_message>
strategy: replace PPT Anhang with structured Strategiepräsentation outline [DungeonMasterAlex]
</commit_message>
<xml_diff>
--- a/beastly-investments/strategies/2026-06-24_strategy_beastly-investments.docx
+++ b/beastly-investments/strategies/2026-06-24_strategy_beastly-investments.docx
@@ -6679,722 +6679,1888 @@
       </w:r>
     </w:p>
     <w:p>
-      <w:pPr>
-        <w:spacing w:before="360" w:after="120"/>
-      </w:pPr>
       <w:r>
         <w:rPr>
-          <w:rFonts w:ascii="Calibri" w:hAnsi="Calibri"/>
           <w:b/>
-          <w:i w:val="0"/>
           <w:color w:val="4B319B"/>
-          <w:sz w:val="32"/>
+          <w:sz w:val="26"/>
         </w:rPr>
-        <w:t>Anhang: PowerPoint-Snippets</w:t>
+        <w:t>Anhang: Strategiepräsentation — Folieninhalt</w:t>
       </w:r>
     </w:p>
     <w:p>
-      <w:pPr>
-        <w:spacing w:after="140"/>
-      </w:pPr>
       <w:r>
         <w:rPr>
-          <w:rFonts w:ascii="Calibri" w:hAnsi="Calibri"/>
-          <w:b w:val="0"/>
           <w:i/>
-          <w:color w:val="333333"/>
-          <w:sz w:val="21"/>
+          <w:color w:val="888888"/>
+          <w:sz w:val="18"/>
         </w:rPr>
-        <w:t>Folgende Folien-Inhalte können direkt in ein Präsentations-Deck übertragen werden.</w:t>
+        <w:t>Konzept: Die Präsentation verkauft unsere Denkweise. Das Strategiepapier dokumentiert die Details.</w:t>
       </w:r>
     </w:p>
     <w:p>
-      <w:pPr>
-        <w:spacing w:before="240" w:after="80"/>
-      </w:pPr>
       <w:r>
         <w:rPr>
-          <w:rFonts w:ascii="Calibri" w:hAnsi="Calibri"/>
+          <w:color w:val="888888"/>
+          <w:sz w:val="18"/>
+        </w:rPr>
+        <w:t>Dauer: 30 Min. Präsentation + 15–30 Min. Diskussion  ·  Umfang: 10–12 Folien (max. 15)</w:t>
+      </w:r>
+    </w:p>
+    <w:p/>
+    <w:p>
+      <w:pPr>
+        <w:spacing w:before="200" w:after="40"/>
+      </w:pPr>
+      <w:r>
+        <w:rPr>
           <w:b/>
-          <w:i w:val="0"/>
-          <w:color w:val="1A1033"/>
-          <w:sz w:val="24"/>
+          <w:color w:val="4B319B"/>
+          <w:sz w:val="20"/>
         </w:rPr>
-        <w:t>Folie 1 — Ausgangslage</w:t>
+        <w:t xml:space="preserve">Folie 1  </w:t>
+      </w:r>
+      <w:r>
+        <w:rPr>
+          <w:b/>
+          <w:color w:val="142233"/>
+          <w:sz w:val="20"/>
+        </w:rPr>
+        <w:t>— WARUM — Die Ausgangsfrage</w:t>
       </w:r>
     </w:p>
     <w:p>
       <w:pPr>
-        <w:pStyle w:val="ListBullet"/>
         <w:spacing w:after="60"/>
       </w:pPr>
       <w:r>
         <w:rPr>
-          <w:rFonts w:ascii="Calibri" w:hAnsi="Calibri"/>
-          <w:b w:val="0"/>
-          <w:i w:val="0"/>
-          <w:color w:val="333333"/>
-          <w:sz w:val="21"/>
+          <w:i/>
+          <w:color w:val="888888"/>
+          <w:sz w:val="18"/>
         </w:rPr>
-        <w:t>Beastly = erstes Produkt der Non-Profit Chipiron AG</w:t>
+        <w:t>Nicht mit der Ausgangslage beginnen — sondern mit der Frage, die Beastly stellt.</w:t>
       </w:r>
     </w:p>
     <w:p>
       <w:pPr>
-        <w:pStyle w:val="ListBullet"/>
-        <w:spacing w:after="60"/>
+        <w:spacing w:after="20"/>
       </w:pPr>
       <w:r>
         <w:rPr>
-          <w:rFonts w:ascii="Calibri" w:hAnsi="Calibri"/>
-          <w:b w:val="0"/>
-          <w:i w:val="0"/>
-          <w:color w:val="333333"/>
-          <w:sz w:val="21"/>
+          <w:sz w:val="18"/>
         </w:rPr>
-        <w:t>Gründer Viktor &amp; Lydia Ackermann — FourGive Tierklinik Ägypten als Ursprung</w:t>
+        <w:t>—  Tierschutz ist eines der grössten gesellschaftlichen Anliegen. Kapital fliesst dorthin, wo Rendite lockt — aber nicht in Tierschutz. Beastly schafft diesen Kanal.</w:t>
       </w:r>
     </w:p>
     <w:p>
       <w:pPr>
-        <w:pStyle w:val="ListBullet"/>
-        <w:spacing w:after="60"/>
+        <w:spacing w:after="20"/>
       </w:pPr>
       <w:r>
         <w:rPr>
-          <w:rFonts w:ascii="Calibri" w:hAnsi="Calibri"/>
-          <w:b w:val="0"/>
-          <w:i w:val="0"/>
-          <w:color w:val="333333"/>
-          <w:sz w:val="21"/>
+          <w:sz w:val="18"/>
         </w:rPr>
-        <w:t>Animal Cruelty Free Portfolio, KI-basierte Bewertung</w:t>
+        <w:t>—  Viktor und Lydia haben eine Tierklinik in Ägypten gebaut. Daraus wurde ein Investmentfonds.</w:t>
       </w:r>
     </w:p>
     <w:p>
       <w:pPr>
-        <w:pStyle w:val="ListBullet"/>
-        <w:spacing w:after="60"/>
+        <w:spacing w:after="20"/>
       </w:pPr>
       <w:r>
         <w:rPr>
-          <w:rFonts w:ascii="Calibri" w:hAnsi="Calibri"/>
-          <w:b w:val="0"/>
-          <w:i w:val="0"/>
-          <w:color w:val="333333"/>
-          <w:sz w:val="21"/>
+          <w:sz w:val="18"/>
         </w:rPr>
-        <w:t>Drei Ebenen: Beastly (Emotion) · Chipiron (Vertrauen) · FourGive (Wirkung)</w:t>
+        <w:t>—  Nicht nur ein Fonds. Eine Haltung.</w:t>
+      </w:r>
+    </w:p>
+    <w:p/>
+    <w:p>
+      <w:pPr>
+        <w:spacing w:before="200" w:after="40"/>
+      </w:pPr>
+      <w:r>
+        <w:rPr>
+          <w:b/>
+          <w:color w:val="4B319B"/>
+          <w:sz w:val="20"/>
+        </w:rPr>
+        <w:t xml:space="preserve">Folie 2  </w:t>
+      </w:r>
+      <w:r>
+        <w:rPr>
+          <w:b/>
+          <w:color w:val="142233"/>
+          <w:sz w:val="20"/>
+        </w:rPr>
+        <w:t>— WOHIN — Die Positionierung</w:t>
       </w:r>
     </w:p>
     <w:p>
       <w:pPr>
-        <w:spacing w:after="40"/>
-      </w:pPr>
-    </w:p>
-    <w:p>
-      <w:pPr>
-        <w:spacing w:before="240" w:after="80"/>
+        <w:spacing w:after="60"/>
       </w:pPr>
       <w:r>
         <w:rPr>
-          <w:rFonts w:ascii="Calibri" w:hAnsi="Calibri"/>
-          <w:b/>
-          <w:i w:val="0"/>
-          <w:color w:val="1A1033"/>
-          <w:sz w:val="24"/>
+          <w:i/>
+          <w:color w:val="888888"/>
+          <w:sz w:val="18"/>
         </w:rPr>
-        <w:t>Folie 2 — Strategische Positionierung</w:t>
+        <w:t>Wo wollen wir Beastly hinbringen? Was ist das Ziel dieser Kommunikationsarbeit?</w:t>
       </w:r>
     </w:p>
     <w:p>
       <w:pPr>
-        <w:pStyle w:val="ListBullet"/>
-        <w:spacing w:after="60"/>
+        <w:spacing w:after="20"/>
       </w:pPr>
       <w:r>
         <w:rPr>
-          <w:rFonts w:ascii="Calibri" w:hAnsi="Calibri"/>
-          <w:b w:val="0"/>
-          <w:i w:val="0"/>
-          <w:color w:val="333333"/>
-          <w:sz w:val="21"/>
+          <w:sz w:val="18"/>
         </w:rPr>
-        <w:t>Beastly führt — Chipiron bleibt diskret</w:t>
+        <w:t>—  Der bekannteste ethische Investmentfonds der Schweiz — kein Nischenprodukt, sondern erste Wahl</w:t>
       </w:r>
     </w:p>
     <w:p>
       <w:pPr>
-        <w:pStyle w:val="ListBullet"/>
-        <w:spacing w:after="60"/>
+        <w:spacing w:after="20"/>
       </w:pPr>
       <w:r>
         <w:rPr>
-          <w:rFonts w:ascii="Calibri" w:hAnsi="Calibri"/>
-          <w:b w:val="0"/>
-          <w:i w:val="0"/>
-          <w:color w:val="333333"/>
-          <w:sz w:val="21"/>
+          <w:sz w:val="18"/>
         </w:rPr>
-        <w:t>Kernversprechen: Rendite · Wirkung · Keine Gewinnausschüttung</w:t>
+        <w:t>—  Viktor und Lydia als vertrauenswürdige Stimmen für verantwortungsvolles Investieren</w:t>
       </w:r>
     </w:p>
     <w:p>
       <w:pPr>
-        <w:pStyle w:val="ListBullet"/>
-        <w:spacing w:after="60"/>
+        <w:spacing w:after="20"/>
       </w:pPr>
       <w:r>
         <w:rPr>
-          <w:rFonts w:ascii="Calibri" w:hAnsi="Calibri"/>
-          <w:b w:val="0"/>
-          <w:i w:val="0"/>
-          <w:color w:val="333333"/>
-          <w:sz w:val="21"/>
+          <w:sz w:val="18"/>
         </w:rPr>
-        <w:t>Haltung ohne Aktivismus: konsequent, mutig, wertebasiert — nie belehrend</w:t>
+        <w:t>—  Eine Marke, die Tierwohl und Rendite als gleichwertige Ziele definiert — ohne Kompromiss</w:t>
+      </w:r>
+    </w:p>
+    <w:p/>
+    <w:p>
+      <w:pPr>
+        <w:spacing w:before="200" w:after="40"/>
+      </w:pPr>
+      <w:r>
+        <w:rPr>
+          <w:b/>
+          <w:color w:val="4B319B"/>
+          <w:sz w:val="20"/>
+        </w:rPr>
+        <w:t xml:space="preserve">Folie 3  </w:t>
+      </w:r>
+      <w:r>
+        <w:rPr>
+          <w:b/>
+          <w:color w:val="142233"/>
+          <w:sz w:val="20"/>
+        </w:rPr>
+        <w:t>— WIE — Das Kommunikationssystem</w:t>
       </w:r>
     </w:p>
     <w:p>
       <w:pPr>
-        <w:pStyle w:val="ListBullet"/>
         <w:spacing w:after="60"/>
       </w:pPr>
       <w:r>
         <w:rPr>
-          <w:rFonts w:ascii="Calibri" w:hAnsi="Calibri"/>
-          <w:b w:val="0"/>
-          <w:i w:val="0"/>
-          <w:color w:val="333333"/>
-          <w:sz w:val="21"/>
+          <w:i/>
+          <w:color w:val="888888"/>
+          <w:sz w:val="18"/>
         </w:rPr>
-        <w:t>Radikale Transparenz als Differenzierungshebel</w:t>
+        <w:t>Nicht: Instagram, LinkedIn, Newsletter. Sondern: ein Kommunikationssystem.</w:t>
       </w:r>
     </w:p>
     <w:p>
       <w:pPr>
-        <w:spacing w:after="40"/>
-      </w:pPr>
-    </w:p>
-    <w:p>
-      <w:pPr>
-        <w:spacing w:before="240" w:after="80"/>
+        <w:spacing w:after="20"/>
       </w:pPr>
       <w:r>
         <w:rPr>
-          <w:rFonts w:ascii="Calibri" w:hAnsi="Calibri"/>
-          <w:b/>
-          <w:i w:val="0"/>
-          <w:color w:val="1A1033"/>
-          <w:sz w:val="24"/>
+          <w:sz w:val="18"/>
         </w:rPr>
-        <w:t>Folie 3 — Zielgruppen</w:t>
+        <w:t>—  Jeder Kanal erfüllt eine eigene, klare Aufgabe — nicht mehr und nicht weniger</w:t>
       </w:r>
     </w:p>
     <w:p>
       <w:pPr>
-        <w:pStyle w:val="ListBullet"/>
-        <w:spacing w:after="60"/>
+        <w:spacing w:after="20"/>
       </w:pPr>
       <w:r>
         <w:rPr>
-          <w:rFonts w:ascii="Calibri" w:hAnsi="Calibri"/>
-          <w:b w:val="0"/>
-          <w:i w:val="0"/>
-          <w:color w:val="333333"/>
-          <w:sz w:val="21"/>
+          <w:sz w:val="18"/>
         </w:rPr>
-        <w:t>Beide brauchen Herz — Institutionelle brauchen zusätzlich Beweisführung</w:t>
+        <w:t>—  Gemeinsame Geschichte, verschiedene Räume: LinkedIn baut Vertrauen, Instagram schafft Emotion, Ads skalieren was funktioniert</w:t>
       </w:r>
     </w:p>
     <w:p>
       <w:pPr>
-        <w:pStyle w:val="ListBullet"/>
-        <w:spacing w:after="60"/>
+        <w:spacing w:after="20"/>
       </w:pPr>
       <w:r>
         <w:rPr>
-          <w:rFonts w:ascii="Calibri" w:hAnsi="Calibri"/>
-          <w:b w:val="0"/>
-          <w:i w:val="0"/>
-          <w:color w:val="333333"/>
-          <w:sz w:val="21"/>
+          <w:sz w:val="18"/>
         </w:rPr>
-        <w:t>Retail: ab CHF 50, emotionaler Einstieg, niedrige Hürde</w:t>
+        <w:t>—  Alle Kanäle kommunizieren dasselbe: investieren UND Tierwohl — in der Sprache des jeweiligen Kanals</w:t>
+      </w:r>
+    </w:p>
+    <w:p/>
+    <w:p>
+      <w:pPr>
+        <w:spacing w:before="200" w:after="40"/>
+      </w:pPr>
+      <w:r>
+        <w:rPr>
+          <w:b/>
+          <w:color w:val="4B319B"/>
+          <w:sz w:val="20"/>
+        </w:rPr>
+        <w:t xml:space="preserve">Folie 4  </w:t>
+      </w:r>
+      <w:r>
+        <w:rPr>
+          <w:b/>
+          <w:color w:val="142233"/>
+          <w:sz w:val="20"/>
+        </w:rPr>
+        <w:t>— DIE CUSTOMER JOURNEY</w:t>
       </w:r>
     </w:p>
     <w:p>
       <w:pPr>
-        <w:pStyle w:val="ListBullet"/>
         <w:spacing w:after="60"/>
       </w:pPr>
       <w:r>
         <w:rPr>
-          <w:rFonts w:ascii="Calibri" w:hAnsi="Calibri"/>
-          <w:b w:val="0"/>
-          <w:i w:val="0"/>
-          <w:color w:val="333333"/>
-          <w:sz w:val="21"/>
+          <w:i/>
+          <w:color w:val="888888"/>
+          <w:sz w:val="18"/>
         </w:rPr>
-        <w:t>Professionell: Struktur, Governance, Track Record, Risiko-Rendite</w:t>
+        <w:t>Erst jetzt erklären wir den Funnel. Wie wächst der Kreis der Investoren?</w:t>
       </w:r>
     </w:p>
     <w:p>
       <w:pPr>
-        <w:pStyle w:val="ListBullet"/>
-        <w:spacing w:after="60"/>
+        <w:spacing w:after="20"/>
       </w:pPr>
       <w:r>
         <w:rPr>
-          <w:rFonts w:ascii="Calibri" w:hAnsi="Calibri"/>
-          <w:b w:val="0"/>
-          <w:i w:val="0"/>
-          <w:color w:val="333333"/>
-          <w:sz w:val="21"/>
+          <w:sz w:val="18"/>
         </w:rPr>
-        <w:t>Entscheidungslogik: Emotion → Vertrauen → Performance → Investment</w:t>
+        <w:t>—  Aufmerksamkeit: Viktor LinkedIn, Beastly Social Media, Awareness-Ads</w:t>
       </w:r>
     </w:p>
     <w:p>
       <w:pPr>
-        <w:spacing w:after="40"/>
-      </w:pPr>
-    </w:p>
-    <w:p>
-      <w:pPr>
-        <w:spacing w:before="240" w:after="80"/>
+        <w:spacing w:after="20"/>
       </w:pPr>
       <w:r>
         <w:rPr>
-          <w:rFonts w:ascii="Calibri" w:hAnsi="Calibri"/>
-          <w:b/>
-          <w:i w:val="0"/>
-          <w:color w:val="1A1033"/>
-          <w:sz w:val="24"/>
+          <w:sz w:val="18"/>
         </w:rPr>
-        <w:t>Folie 4 — Kommunikationsfunnel</w:t>
+        <w:t>—  Neugier &amp; Vertrauen: Gründerstory, Dual-Bildwelt, FourGive-Momente, Website</w:t>
       </w:r>
     </w:p>
     <w:p>
       <w:pPr>
-        <w:pStyle w:val="ListBullet"/>
-        <w:spacing w:after="60"/>
+        <w:spacing w:after="20"/>
       </w:pPr>
       <w:r>
         <w:rPr>
-          <w:rFonts w:ascii="Calibri" w:hAnsi="Calibri"/>
-          <w:b w:val="0"/>
-          <w:i w:val="0"/>
-          <w:color w:val="333333"/>
-          <w:sz w:val="21"/>
+          <w:sz w:val="18"/>
         </w:rPr>
-        <w:t>Aufmerksamkeit: Viktor LinkedIn + Beastly Social + Awareness-Ads</w:t>
+        <w:t>—  Erklärung &amp; Entscheidung: Pitch Deck, Direktgespräch, Investment-CTA ab CHF 50</w:t>
       </w:r>
     </w:p>
     <w:p>
       <w:pPr>
-        <w:pStyle w:val="ListBullet"/>
-        <w:spacing w:after="60"/>
+        <w:spacing w:after="20"/>
       </w:pPr>
       <w:r>
         <w:rPr>
-          <w:rFonts w:ascii="Calibri" w:hAnsi="Calibri"/>
-          <w:b w:val="0"/>
-          <w:i w:val="0"/>
-          <w:color w:val="333333"/>
-          <w:sz w:val="21"/>
+          <w:sz w:val="18"/>
         </w:rPr>
-        <w:t>Neugier: Gründerstory, Dual-Bildwelt, Website-Einstieg</w:t>
+        <w:t>—  Bindung &amp; Weiterempfehlung: Newsletter, persönliche Gespräche, Events</w:t>
+      </w:r>
+    </w:p>
+    <w:p/>
+    <w:p>
+      <w:pPr>
+        <w:spacing w:before="200" w:after="40"/>
+      </w:pPr>
+      <w:r>
+        <w:rPr>
+          <w:b/>
+          <w:color w:val="4B319B"/>
+          <w:sz w:val="20"/>
+        </w:rPr>
+        <w:t xml:space="preserve">Folie 5  </w:t>
+      </w:r>
+      <w:r>
+        <w:rPr>
+          <w:b/>
+          <w:color w:val="142233"/>
+          <w:sz w:val="20"/>
+        </w:rPr>
+        <w:t>— BAUSTEIN: LinkedIn</w:t>
       </w:r>
     </w:p>
     <w:p>
       <w:pPr>
-        <w:pStyle w:val="ListBullet"/>
         <w:spacing w:after="60"/>
       </w:pPr>
       <w:r>
         <w:rPr>
-          <w:rFonts w:ascii="Calibri" w:hAnsi="Calibri"/>
-          <w:b w:val="0"/>
-          <w:i w:val="0"/>
-          <w:color w:val="333333"/>
-          <w:sz w:val="21"/>
+          <w:i/>
+          <w:color w:val="888888"/>
+          <w:sz w:val="18"/>
         </w:rPr>
-        <w:t>Vertrauen: Transparenz, FourGive-Momente, Viktor &amp; Lydia als Menschen</w:t>
+        <w:t>Gesetzter Ausgangspunkt. Viktor persönliches Profil + Beastly Unternehmenskanal.</w:t>
+      </w:r>
+    </w:p>
+    <w:tbl>
+      <w:tblPr>
+        <w:tblLook w:firstColumn="1" w:firstRow="1" w:lastColumn="0" w:lastRow="0" w:noHBand="0" w:noVBand="1" w:val="04A0"/>
+        <w:tblBorders>
+          <w:top w:val="none"/>
+          <w:left w:val="none"/>
+          <w:bottom w:val="none"/>
+          <w:right w:val="none"/>
+          <w:insideH w:val="none"/>
+          <w:insideV w:val="none"/>
+        </w:tblBorders>
+        <w:tblW w:w="5000" w:type="pct"/>
+      </w:tblPr>
+      <w:tblGrid>
+        <w:gridCol w:w="4306"/>
+        <w:gridCol w:w="4306"/>
+      </w:tblGrid>
+      <w:tr>
+        <w:tc>
+          <w:tcPr>
+            <w:tcW w:type="dxa" w:w="4306"/>
+            <w:shd w:val="clear" w:color="auto" w:fill="EEE8F7"/>
+            <w:tcMar>
+              <w:top w:w="70" w:type="dxa"/>
+              <w:bottom w:w="70" w:type="dxa"/>
+              <w:left w:w="120" w:type="dxa"/>
+              <w:right w:w="60" w:type="dxa"/>
+            </w:tcMar>
+            <w:tcW w:w="1440" w:type="dxa"/>
+          </w:tcPr>
+          <w:p>
+            <w:r>
+              <w:rPr>
+                <w:b/>
+                <w:color w:val="4B319B"/>
+                <w:sz w:val="18"/>
+              </w:rPr>
+              <w:t>Ziel</w:t>
+            </w:r>
+          </w:p>
+        </w:tc>
+        <w:tc>
+          <w:tcPr>
+            <w:tcW w:type="dxa" w:w="4306"/>
+            <w:shd w:val="clear" w:color="auto" w:fill="EEE8F7"/>
+            <w:tcMar>
+              <w:top w:w="70" w:type="dxa"/>
+              <w:bottom w:w="70" w:type="dxa"/>
+              <w:left w:w="60" w:type="dxa"/>
+              <w:right w:w="120" w:type="dxa"/>
+            </w:tcMar>
+            <w:tcW w:w="7920" w:type="dxa"/>
+          </w:tcPr>
+          <w:p>
+            <w:r>
+              <w:rPr>
+                <w:sz w:val="18"/>
+              </w:rPr>
+              <w:t>Vertrauen bei Investitionsentscheidern und Tierwohl-affinen Personen aufbauen</w:t>
+            </w:r>
+          </w:p>
+        </w:tc>
+      </w:tr>
+      <w:tr>
+        <w:tc>
+          <w:tcPr>
+            <w:tcW w:type="dxa" w:w="4306"/>
+            <w:shd w:val="clear" w:color="auto" w:fill="F5F0FC"/>
+            <w:tcMar>
+              <w:top w:w="70" w:type="dxa"/>
+              <w:bottom w:w="70" w:type="dxa"/>
+              <w:left w:w="120" w:type="dxa"/>
+              <w:right w:w="60" w:type="dxa"/>
+            </w:tcMar>
+            <w:tcW w:w="1440" w:type="dxa"/>
+          </w:tcPr>
+          <w:p>
+            <w:r>
+              <w:rPr>
+                <w:b/>
+                <w:color w:val="4B319B"/>
+                <w:sz w:val="18"/>
+              </w:rPr>
+              <w:t>Rolle</w:t>
+            </w:r>
+          </w:p>
+        </w:tc>
+        <w:tc>
+          <w:tcPr>
+            <w:tcW w:type="dxa" w:w="4306"/>
+            <w:shd w:val="clear" w:color="auto" w:fill="F5F0FC"/>
+            <w:tcMar>
+              <w:top w:w="70" w:type="dxa"/>
+              <w:bottom w:w="70" w:type="dxa"/>
+              <w:left w:w="60" w:type="dxa"/>
+              <w:right w:w="120" w:type="dxa"/>
+            </w:tcMar>
+            <w:tcW w:w="7920" w:type="dxa"/>
+          </w:tcPr>
+          <w:p>
+            <w:r>
+              <w:rPr>
+                <w:sz w:val="18"/>
+              </w:rPr>
+              <w:t>Viktor als persönliche Stimme, Beastly als Institution — gegenseitige Verstärkung</w:t>
+            </w:r>
+          </w:p>
+        </w:tc>
+      </w:tr>
+      <w:tr>
+        <w:tc>
+          <w:tcPr>
+            <w:tcW w:type="dxa" w:w="4306"/>
+            <w:shd w:val="clear" w:color="auto" w:fill="EEE8F7"/>
+            <w:tcMar>
+              <w:top w:w="70" w:type="dxa"/>
+              <w:bottom w:w="70" w:type="dxa"/>
+              <w:left w:w="120" w:type="dxa"/>
+              <w:right w:w="60" w:type="dxa"/>
+            </w:tcMar>
+            <w:tcW w:w="1440" w:type="dxa"/>
+          </w:tcPr>
+          <w:p>
+            <w:r>
+              <w:rPr>
+                <w:b/>
+                <w:color w:val="4B319B"/>
+                <w:sz w:val="18"/>
+              </w:rPr>
+              <w:t>Warum wichtig</w:t>
+            </w:r>
+          </w:p>
+        </w:tc>
+        <w:tc>
+          <w:tcPr>
+            <w:tcW w:type="dxa" w:w="4306"/>
+            <w:shd w:val="clear" w:color="auto" w:fill="EEE8F7"/>
+            <w:tcMar>
+              <w:top w:w="70" w:type="dxa"/>
+              <w:bottom w:w="70" w:type="dxa"/>
+              <w:left w:w="60" w:type="dxa"/>
+              <w:right w:w="120" w:type="dxa"/>
+            </w:tcMar>
+            <w:tcW w:w="7920" w:type="dxa"/>
+          </w:tcPr>
+          <w:p>
+            <w:r>
+              <w:rPr>
+                <w:sz w:val="18"/>
+              </w:rPr>
+              <w:t>Einziger Kanal mit Investment-affinem Publikum und der nötigen Substanztiefe</w:t>
+            </w:r>
+          </w:p>
+        </w:tc>
+      </w:tr>
+    </w:tbl>
+    <w:p/>
+    <w:p>
+      <w:pPr>
+        <w:spacing w:before="200" w:after="40"/>
+      </w:pPr>
+      <w:r>
+        <w:rPr>
+          <w:b/>
+          <w:color w:val="BD5435"/>
+          <w:sz w:val="20"/>
+        </w:rPr>
+        <w:t xml:space="preserve">Folie 6  </w:t>
+      </w:r>
+      <w:r>
+        <w:rPr>
+          <w:b/>
+          <w:color w:val="142233"/>
+          <w:sz w:val="20"/>
+        </w:rPr>
+        <w:t>— BAUSTEIN: Instagram / Meta</w:t>
       </w:r>
     </w:p>
     <w:p>
       <w:pPr>
-        <w:pStyle w:val="ListBullet"/>
         <w:spacing w:after="60"/>
       </w:pPr>
       <w:r>
         <w:rPr>
-          <w:rFonts w:ascii="Calibri" w:hAnsi="Calibri"/>
-          <w:b w:val="0"/>
-          <w:i w:val="0"/>
-          <w:color w:val="333333"/>
-          <w:sz w:val="21"/>
+          <w:i/>
+          <w:color w:val="888888"/>
+          <w:sz w:val="18"/>
         </w:rPr>
-        <w:t>Erklärung: Pitch Deck + Direktgespräch + Website Deep Dive</w:t>
+        <w:t>Kombinierbare Erweiterung. Visueller Schwerpunkt, Meta-Ads-Synergie.</w:t>
+      </w:r>
+    </w:p>
+    <w:tbl>
+      <w:tblPr>
+        <w:tblLook w:firstColumn="1" w:firstRow="1" w:lastColumn="0" w:lastRow="0" w:noHBand="0" w:noVBand="1" w:val="04A0"/>
+        <w:tblBorders>
+          <w:top w:val="none"/>
+          <w:left w:val="none"/>
+          <w:bottom w:val="none"/>
+          <w:right w:val="none"/>
+          <w:insideH w:val="none"/>
+          <w:insideV w:val="none"/>
+        </w:tblBorders>
+        <w:tblW w:w="5000" w:type="pct"/>
+      </w:tblPr>
+      <w:tblGrid>
+        <w:gridCol w:w="4306"/>
+        <w:gridCol w:w="4306"/>
+      </w:tblGrid>
+      <w:tr>
+        <w:tc>
+          <w:tcPr>
+            <w:tcW w:type="dxa" w:w="4306"/>
+            <w:shd w:val="clear" w:color="auto" w:fill="EEE8F7"/>
+            <w:tcMar>
+              <w:top w:w="70" w:type="dxa"/>
+              <w:bottom w:w="70" w:type="dxa"/>
+              <w:left w:w="120" w:type="dxa"/>
+              <w:right w:w="60" w:type="dxa"/>
+            </w:tcMar>
+            <w:tcW w:w="1440" w:type="dxa"/>
+          </w:tcPr>
+          <w:p>
+            <w:r>
+              <w:rPr>
+                <w:b/>
+                <w:color w:val="BD5435"/>
+                <w:sz w:val="18"/>
+              </w:rPr>
+              <w:t>Ziel</w:t>
+            </w:r>
+          </w:p>
+        </w:tc>
+        <w:tc>
+          <w:tcPr>
+            <w:tcW w:type="dxa" w:w="4306"/>
+            <w:shd w:val="clear" w:color="auto" w:fill="EEE8F7"/>
+            <w:tcMar>
+              <w:top w:w="70" w:type="dxa"/>
+              <w:bottom w:w="70" w:type="dxa"/>
+              <w:left w:w="60" w:type="dxa"/>
+              <w:right w:w="120" w:type="dxa"/>
+            </w:tcMar>
+            <w:tcW w:w="7920" w:type="dxa"/>
+          </w:tcPr>
+          <w:p>
+            <w:r>
+              <w:rPr>
+                <w:sz w:val="18"/>
+              </w:rPr>
+              <w:t>Emotionaler Anker für Tierwohl-affines Publikum ausserhalb des Finanzsektors</w:t>
+            </w:r>
+          </w:p>
+        </w:tc>
+      </w:tr>
+      <w:tr>
+        <w:tc>
+          <w:tcPr>
+            <w:tcW w:type="dxa" w:w="4306"/>
+            <w:shd w:val="clear" w:color="auto" w:fill="F5F0FC"/>
+            <w:tcMar>
+              <w:top w:w="70" w:type="dxa"/>
+              <w:bottom w:w="70" w:type="dxa"/>
+              <w:left w:w="120" w:type="dxa"/>
+              <w:right w:w="60" w:type="dxa"/>
+            </w:tcMar>
+            <w:tcW w:w="1440" w:type="dxa"/>
+          </w:tcPr>
+          <w:p>
+            <w:r>
+              <w:rPr>
+                <w:b/>
+                <w:color w:val="BD5435"/>
+                <w:sz w:val="18"/>
+              </w:rPr>
+              <w:t>Rolle</w:t>
+            </w:r>
+          </w:p>
+        </w:tc>
+        <w:tc>
+          <w:tcPr>
+            <w:tcW w:type="dxa" w:w="4306"/>
+            <w:shd w:val="clear" w:color="auto" w:fill="F5F0FC"/>
+            <w:tcMar>
+              <w:top w:w="70" w:type="dxa"/>
+              <w:bottom w:w="70" w:type="dxa"/>
+              <w:left w:w="60" w:type="dxa"/>
+              <w:right w:w="120" w:type="dxa"/>
+            </w:tcMar>
+            <w:tcW w:w="7920" w:type="dxa"/>
+          </w:tcPr>
+          <w:p>
+            <w:r>
+              <w:rPr>
+                <w:sz w:val="18"/>
+              </w:rPr>
+              <w:t>Beastlys Dual-Bildwelt visuell zugänglich machen (Raubtiere + FourGive-Momente)</w:t>
+            </w:r>
+          </w:p>
+        </w:tc>
+      </w:tr>
+      <w:tr>
+        <w:tc>
+          <w:tcPr>
+            <w:tcW w:type="dxa" w:w="4306"/>
+            <w:shd w:val="clear" w:color="auto" w:fill="EEE8F7"/>
+            <w:tcMar>
+              <w:top w:w="70" w:type="dxa"/>
+              <w:bottom w:w="70" w:type="dxa"/>
+              <w:left w:w="120" w:type="dxa"/>
+              <w:right w:w="60" w:type="dxa"/>
+            </w:tcMar>
+            <w:tcW w:w="1440" w:type="dxa"/>
+          </w:tcPr>
+          <w:p>
+            <w:r>
+              <w:rPr>
+                <w:b/>
+                <w:color w:val="BD5435"/>
+                <w:sz w:val="18"/>
+              </w:rPr>
+              <w:t>Warum wichtig</w:t>
+            </w:r>
+          </w:p>
+        </w:tc>
+        <w:tc>
+          <w:tcPr>
+            <w:tcW w:type="dxa" w:w="4306"/>
+            <w:shd w:val="clear" w:color="auto" w:fill="EEE8F7"/>
+            <w:tcMar>
+              <w:top w:w="70" w:type="dxa"/>
+              <w:bottom w:w="70" w:type="dxa"/>
+              <w:left w:w="60" w:type="dxa"/>
+              <w:right w:w="120" w:type="dxa"/>
+            </w:tcMar>
+            <w:tcW w:w="7920" w:type="dxa"/>
+          </w:tcPr>
+          <w:p>
+            <w:r>
+              <w:rPr>
+                <w:sz w:val="18"/>
+              </w:rPr>
+              <w:t>Erschliesst Zielgruppen die auf LinkedIn nicht erreichbar sind — und öffnet Meta-Ads</w:t>
+            </w:r>
+          </w:p>
+        </w:tc>
+      </w:tr>
+    </w:tbl>
+    <w:p/>
+    <w:p>
+      <w:pPr>
+        <w:spacing w:before="200" w:after="40"/>
+      </w:pPr>
+      <w:r>
+        <w:rPr>
+          <w:b/>
+          <w:color w:val="4B319B"/>
+          <w:sz w:val="20"/>
+        </w:rPr>
+        <w:t xml:space="preserve">Folie 7  </w:t>
+      </w:r>
+      <w:r>
+        <w:rPr>
+          <w:b/>
+          <w:color w:val="142233"/>
+          <w:sz w:val="20"/>
+        </w:rPr>
+        <w:t>— BAUSTEIN: Newsletter</w:t>
       </w:r>
     </w:p>
     <w:p>
       <w:pPr>
-        <w:pStyle w:val="ListBullet"/>
         <w:spacing w:after="60"/>
       </w:pPr>
       <w:r>
         <w:rPr>
-          <w:rFonts w:ascii="Calibri" w:hAnsi="Calibri"/>
-          <w:b w:val="0"/>
-          <w:i w:val="0"/>
-          <w:color w:val="333333"/>
-          <w:sz w:val="21"/>
+          <w:i/>
+          <w:color w:val="888888"/>
+          <w:sz w:val="18"/>
         </w:rPr>
-        <w:t>Entscheidung: Retail Bank/App ab CHF 50 · Professionell Direktabschluss</w:t>
+        <w:t>Erst nach Grundrauschen starten. Qualität über Frequenz.</w:t>
+      </w:r>
+    </w:p>
+    <w:tbl>
+      <w:tblPr>
+        <w:tblLook w:firstColumn="1" w:firstRow="1" w:lastColumn="0" w:lastRow="0" w:noHBand="0" w:noVBand="1" w:val="04A0"/>
+        <w:tblBorders>
+          <w:top w:val="none"/>
+          <w:left w:val="none"/>
+          <w:bottom w:val="none"/>
+          <w:right w:val="none"/>
+          <w:insideH w:val="none"/>
+          <w:insideV w:val="none"/>
+        </w:tblBorders>
+        <w:tblW w:w="5000" w:type="pct"/>
+      </w:tblPr>
+      <w:tblGrid>
+        <w:gridCol w:w="4306"/>
+        <w:gridCol w:w="4306"/>
+      </w:tblGrid>
+      <w:tr>
+        <w:tc>
+          <w:tcPr>
+            <w:tcW w:type="dxa" w:w="4306"/>
+            <w:shd w:val="clear" w:color="auto" w:fill="EEE8F7"/>
+            <w:tcMar>
+              <w:top w:w="70" w:type="dxa"/>
+              <w:bottom w:w="70" w:type="dxa"/>
+              <w:left w:w="120" w:type="dxa"/>
+              <w:right w:w="60" w:type="dxa"/>
+            </w:tcMar>
+            <w:tcW w:w="1440" w:type="dxa"/>
+          </w:tcPr>
+          <w:p>
+            <w:r>
+              <w:rPr>
+                <w:b/>
+                <w:color w:val="4B319B"/>
+                <w:sz w:val="18"/>
+              </w:rPr>
+              <w:t>Ziel</w:t>
+            </w:r>
+          </w:p>
+        </w:tc>
+        <w:tc>
+          <w:tcPr>
+            <w:tcW w:type="dxa" w:w="4306"/>
+            <w:shd w:val="clear" w:color="auto" w:fill="EEE8F7"/>
+            <w:tcMar>
+              <w:top w:w="70" w:type="dxa"/>
+              <w:bottom w:w="70" w:type="dxa"/>
+              <w:left w:w="60" w:type="dxa"/>
+              <w:right w:w="120" w:type="dxa"/>
+            </w:tcMar>
+            <w:tcW w:w="7920" w:type="dxa"/>
+          </w:tcPr>
+          <w:p>
+            <w:r>
+              <w:rPr>
+                <w:sz w:val="18"/>
+              </w:rPr>
+              <w:t>Direkte, langfristige Beziehung zu bestehenden und potentiellen Investoren aufbauen</w:t>
+            </w:r>
+          </w:p>
+        </w:tc>
+      </w:tr>
+      <w:tr>
+        <w:tc>
+          <w:tcPr>
+            <w:tcW w:type="dxa" w:w="4306"/>
+            <w:shd w:val="clear" w:color="auto" w:fill="F5F0FC"/>
+            <w:tcMar>
+              <w:top w:w="70" w:type="dxa"/>
+              <w:bottom w:w="70" w:type="dxa"/>
+              <w:left w:w="120" w:type="dxa"/>
+              <w:right w:w="60" w:type="dxa"/>
+            </w:tcMar>
+            <w:tcW w:w="1440" w:type="dxa"/>
+          </w:tcPr>
+          <w:p>
+            <w:r>
+              <w:rPr>
+                <w:b/>
+                <w:color w:val="4B319B"/>
+                <w:sz w:val="18"/>
+              </w:rPr>
+              <w:t>Rolle</w:t>
+            </w:r>
+          </w:p>
+        </w:tc>
+        <w:tc>
+          <w:tcPr>
+            <w:tcW w:type="dxa" w:w="4306"/>
+            <w:shd w:val="clear" w:color="auto" w:fill="F5F0FC"/>
+            <w:tcMar>
+              <w:top w:w="70" w:type="dxa"/>
+              <w:bottom w:w="70" w:type="dxa"/>
+              <w:left w:w="60" w:type="dxa"/>
+              <w:right w:w="120" w:type="dxa"/>
+            </w:tcMar>
+            <w:tcW w:w="7920" w:type="dxa"/>
+          </w:tcPr>
+          <w:p>
+            <w:r>
+              <w:rPr>
+                <w:sz w:val="18"/>
+              </w:rPr>
+              <w:t>Tiefe Inhalte: Wirkungsberichte, Transparenz-Updates, Hinter-den-Kulissen-Einblicke</w:t>
+            </w:r>
+          </w:p>
+        </w:tc>
+      </w:tr>
+      <w:tr>
+        <w:tc>
+          <w:tcPr>
+            <w:tcW w:type="dxa" w:w="4306"/>
+            <w:shd w:val="clear" w:color="auto" w:fill="EEE8F7"/>
+            <w:tcMar>
+              <w:top w:w="70" w:type="dxa"/>
+              <w:bottom w:w="70" w:type="dxa"/>
+              <w:left w:w="120" w:type="dxa"/>
+              <w:right w:w="60" w:type="dxa"/>
+            </w:tcMar>
+            <w:tcW w:w="1440" w:type="dxa"/>
+          </w:tcPr>
+          <w:p>
+            <w:r>
+              <w:rPr>
+                <w:b/>
+                <w:color w:val="4B319B"/>
+                <w:sz w:val="18"/>
+              </w:rPr>
+              <w:t>Warum wichtig</w:t>
+            </w:r>
+          </w:p>
+        </w:tc>
+        <w:tc>
+          <w:tcPr>
+            <w:tcW w:type="dxa" w:w="4306"/>
+            <w:shd w:val="clear" w:color="auto" w:fill="EEE8F7"/>
+            <w:tcMar>
+              <w:top w:w="70" w:type="dxa"/>
+              <w:bottom w:w="70" w:type="dxa"/>
+              <w:left w:w="60" w:type="dxa"/>
+              <w:right w:w="120" w:type="dxa"/>
+            </w:tcMar>
+            <w:tcW w:w="7920" w:type="dxa"/>
+          </w:tcPr>
+          <w:p>
+            <w:r>
+              <w:rPr>
+                <w:sz w:val="18"/>
+              </w:rPr>
+              <w:t>Einziger algorithmunabhängiger Kanal — direkte Linie zum Investor ohne Plattformrisiko</w:t>
+            </w:r>
+          </w:p>
+        </w:tc>
+      </w:tr>
+    </w:tbl>
+    <w:p/>
+    <w:p>
+      <w:pPr>
+        <w:spacing w:before="200" w:after="40"/>
+      </w:pPr>
+      <w:r>
+        <w:rPr>
+          <w:b/>
+          <w:color w:val="4B319B"/>
+          <w:sz w:val="20"/>
+        </w:rPr>
+        <w:t xml:space="preserve">Folie 8  </w:t>
+      </w:r>
+      <w:r>
+        <w:rPr>
+          <w:b/>
+          <w:color w:val="142233"/>
+          <w:sz w:val="20"/>
+        </w:rPr>
+        <w:t>— BAUSTEIN: Print &amp; Repräsentation</w:t>
       </w:r>
     </w:p>
     <w:p>
       <w:pPr>
-        <w:spacing w:after="40"/>
-      </w:pPr>
-    </w:p>
-    <w:p>
-      <w:pPr>
-        <w:spacing w:before="240" w:after="80"/>
+        <w:spacing w:after="60"/>
       </w:pPr>
       <w:r>
         <w:rPr>
-          <w:rFonts w:ascii="Calibri" w:hAnsi="Calibri"/>
+          <w:i/>
+          <w:color w:val="888888"/>
+          <w:sz w:val="18"/>
+        </w:rPr>
+        <w:t>Pitch Deck als zentrales Gesprächswerkzeug. Emotional und faktisch.</w:t>
+      </w:r>
+    </w:p>
+    <w:tbl>
+      <w:tblPr>
+        <w:tblLook w:firstColumn="1" w:firstRow="1" w:lastColumn="0" w:lastRow="0" w:noHBand="0" w:noVBand="1" w:val="04A0"/>
+        <w:tblBorders>
+          <w:top w:val="none"/>
+          <w:left w:val="none"/>
+          <w:bottom w:val="none"/>
+          <w:right w:val="none"/>
+          <w:insideH w:val="none"/>
+          <w:insideV w:val="none"/>
+        </w:tblBorders>
+        <w:tblW w:w="5000" w:type="pct"/>
+      </w:tblPr>
+      <w:tblGrid>
+        <w:gridCol w:w="4306"/>
+        <w:gridCol w:w="4306"/>
+      </w:tblGrid>
+      <w:tr>
+        <w:tc>
+          <w:tcPr>
+            <w:tcW w:type="dxa" w:w="4306"/>
+            <w:shd w:val="clear" w:color="auto" w:fill="EEE8F7"/>
+            <w:tcMar>
+              <w:top w:w="70" w:type="dxa"/>
+              <w:bottom w:w="70" w:type="dxa"/>
+              <w:left w:w="120" w:type="dxa"/>
+              <w:right w:w="60" w:type="dxa"/>
+            </w:tcMar>
+            <w:tcW w:w="1440" w:type="dxa"/>
+          </w:tcPr>
+          <w:p>
+            <w:r>
+              <w:rPr>
+                <w:b/>
+                <w:color w:val="4B319B"/>
+                <w:sz w:val="18"/>
+              </w:rPr>
+              <w:t>Ziel</w:t>
+            </w:r>
+          </w:p>
+        </w:tc>
+        <w:tc>
+          <w:tcPr>
+            <w:tcW w:type="dxa" w:w="4306"/>
+            <w:shd w:val="clear" w:color="auto" w:fill="EEE8F7"/>
+            <w:tcMar>
+              <w:top w:w="70" w:type="dxa"/>
+              <w:bottom w:w="70" w:type="dxa"/>
+              <w:left w:w="60" w:type="dxa"/>
+              <w:right w:w="120" w:type="dxa"/>
+            </w:tcMar>
+            <w:tcW w:w="7920" w:type="dxa"/>
+          </w:tcPr>
+          <w:p>
+            <w:r>
+              <w:rPr>
+                <w:sz w:val="18"/>
+              </w:rPr>
+              <w:t>Professionelle Gesprächsgrundlage für persönliche Kontakte und Erstkontakte</w:t>
+            </w:r>
+          </w:p>
+        </w:tc>
+      </w:tr>
+      <w:tr>
+        <w:tc>
+          <w:tcPr>
+            <w:tcW w:type="dxa" w:w="4306"/>
+            <w:shd w:val="clear" w:color="auto" w:fill="F5F0FC"/>
+            <w:tcMar>
+              <w:top w:w="70" w:type="dxa"/>
+              <w:bottom w:w="70" w:type="dxa"/>
+              <w:left w:w="120" w:type="dxa"/>
+              <w:right w:w="60" w:type="dxa"/>
+            </w:tcMar>
+            <w:tcW w:w="1440" w:type="dxa"/>
+          </w:tcPr>
+          <w:p>
+            <w:r>
+              <w:rPr>
+                <w:b/>
+                <w:color w:val="4B319B"/>
+                <w:sz w:val="18"/>
+              </w:rPr>
+              <w:t>Rolle</w:t>
+            </w:r>
+          </w:p>
+        </w:tc>
+        <w:tc>
+          <w:tcPr>
+            <w:tcW w:type="dxa" w:w="4306"/>
+            <w:shd w:val="clear" w:color="auto" w:fill="F5F0FC"/>
+            <w:tcMar>
+              <w:top w:w="70" w:type="dxa"/>
+              <w:bottom w:w="70" w:type="dxa"/>
+              <w:left w:w="60" w:type="dxa"/>
+              <w:right w:w="120" w:type="dxa"/>
+            </w:tcMar>
+            <w:tcW w:w="7920" w:type="dxa"/>
+          </w:tcPr>
+          <w:p>
+            <w:r>
+              <w:rPr>
+                <w:sz w:val="18"/>
+              </w:rPr>
+              <w:t>Erstbegegnung-Werkzeug für institutionelle Investoren, Partner und Events</w:t>
+            </w:r>
+          </w:p>
+        </w:tc>
+      </w:tr>
+      <w:tr>
+        <w:tc>
+          <w:tcPr>
+            <w:tcW w:type="dxa" w:w="4306"/>
+            <w:shd w:val="clear" w:color="auto" w:fill="EEE8F7"/>
+            <w:tcMar>
+              <w:top w:w="70" w:type="dxa"/>
+              <w:bottom w:w="70" w:type="dxa"/>
+              <w:left w:w="120" w:type="dxa"/>
+              <w:right w:w="60" w:type="dxa"/>
+            </w:tcMar>
+            <w:tcW w:w="1440" w:type="dxa"/>
+          </w:tcPr>
+          <w:p>
+            <w:r>
+              <w:rPr>
+                <w:b/>
+                <w:color w:val="4B319B"/>
+                <w:sz w:val="18"/>
+              </w:rPr>
+              <w:t>Warum wichtig</w:t>
+            </w:r>
+          </w:p>
+        </w:tc>
+        <w:tc>
+          <w:tcPr>
+            <w:tcW w:type="dxa" w:w="4306"/>
+            <w:shd w:val="clear" w:color="auto" w:fill="EEE8F7"/>
+            <w:tcMar>
+              <w:top w:w="70" w:type="dxa"/>
+              <w:bottom w:w="70" w:type="dxa"/>
+              <w:left w:w="60" w:type="dxa"/>
+              <w:right w:w="120" w:type="dxa"/>
+            </w:tcMar>
+            <w:tcW w:w="7920" w:type="dxa"/>
+          </w:tcPr>
+          <w:p>
+            <w:r>
+              <w:rPr>
+                <w:sz w:val="18"/>
+              </w:rPr>
+              <w:t>Beastly ist erklärungsbedürftig — gutes Material verkürzt den Vertrauensaufbau erheblich</w:t>
+            </w:r>
+          </w:p>
+        </w:tc>
+      </w:tr>
+    </w:tbl>
+    <w:p/>
+    <w:p>
+      <w:pPr>
+        <w:spacing w:before="200" w:after="40"/>
+      </w:pPr>
+      <w:r>
+        <w:rPr>
           <w:b/>
-          <w:i w:val="0"/>
-          <w:color w:val="1A1033"/>
-          <w:sz w:val="24"/>
+          <w:color w:val="142233"/>
+          <w:sz w:val="20"/>
         </w:rPr>
-        <w:t>Folie 5 — Kanalstrategie</w:t>
+        <w:t xml:space="preserve">Folie 9  </w:t>
+      </w:r>
+      <w:r>
+        <w:rPr>
+          <w:b/>
+          <w:color w:val="142233"/>
+          <w:sz w:val="20"/>
+        </w:rPr>
+        <w:t>— BAUSTEIN: Ads — Zwei Phasen</w:t>
       </w:r>
     </w:p>
     <w:p>
       <w:pPr>
-        <w:pStyle w:val="ListBullet"/>
         <w:spacing w:after="60"/>
       </w:pPr>
       <w:r>
         <w:rPr>
-          <w:rFonts w:ascii="Calibri" w:hAnsi="Calibri"/>
-          <w:b w:val="0"/>
-          <w:i w:val="0"/>
-          <w:color w:val="333333"/>
-          <w:sz w:val="21"/>
+          <w:i/>
+          <w:color w:val="888888"/>
+          <w:sz w:val="18"/>
         </w:rPr>
-        <w:t>LinkedIn: gesetzter Ausgangspunkt — immer (Viktor Profil + Beastly Marke)</w:t>
+        <w:t>Folgt dem organischen Aufbau. Awareness zuerst, Conversion danach.</w:t>
+      </w:r>
+    </w:p>
+    <w:tbl>
+      <w:tblPr>
+        <w:tblLook w:firstColumn="1" w:firstRow="1" w:lastColumn="0" w:lastRow="0" w:noHBand="0" w:noVBand="1" w:val="04A0"/>
+        <w:tblBorders>
+          <w:top w:val="none"/>
+          <w:left w:val="none"/>
+          <w:bottom w:val="none"/>
+          <w:right w:val="none"/>
+          <w:insideH w:val="none"/>
+          <w:insideV w:val="none"/>
+        </w:tblBorders>
+        <w:tblW w:w="5000" w:type="pct"/>
+      </w:tblPr>
+      <w:tblGrid>
+        <w:gridCol w:w="4306"/>
+        <w:gridCol w:w="4306"/>
+      </w:tblGrid>
+      <w:tr>
+        <w:tc>
+          <w:tcPr>
+            <w:tcW w:type="dxa" w:w="4306"/>
+            <w:shd w:val="clear" w:color="auto" w:fill="EEE8F7"/>
+            <w:tcMar>
+              <w:top w:w="70" w:type="dxa"/>
+              <w:bottom w:w="70" w:type="dxa"/>
+              <w:left w:w="120" w:type="dxa"/>
+              <w:right w:w="60" w:type="dxa"/>
+            </w:tcMar>
+            <w:tcW w:w="1440" w:type="dxa"/>
+          </w:tcPr>
+          <w:p>
+            <w:r>
+              <w:rPr>
+                <w:b/>
+                <w:color w:val="142233"/>
+                <w:sz w:val="18"/>
+              </w:rPr>
+              <w:t>Ziel</w:t>
+            </w:r>
+          </w:p>
+        </w:tc>
+        <w:tc>
+          <w:tcPr>
+            <w:tcW w:type="dxa" w:w="4306"/>
+            <w:shd w:val="clear" w:color="auto" w:fill="EEE8F7"/>
+            <w:tcMar>
+              <w:top w:w="70" w:type="dxa"/>
+              <w:bottom w:w="70" w:type="dxa"/>
+              <w:left w:w="60" w:type="dxa"/>
+              <w:right w:w="120" w:type="dxa"/>
+            </w:tcMar>
+            <w:tcW w:w="7920" w:type="dxa"/>
+          </w:tcPr>
+          <w:p>
+            <w:r>
+              <w:rPr>
+                <w:sz w:val="18"/>
+              </w:rPr>
+              <w:t>Organisches Fundament verstärken (Phase 1) und skalieren (Phase 2)</w:t>
+            </w:r>
+          </w:p>
+        </w:tc>
+      </w:tr>
+      <w:tr>
+        <w:tc>
+          <w:tcPr>
+            <w:tcW w:type="dxa" w:w="4306"/>
+            <w:shd w:val="clear" w:color="auto" w:fill="F5F0FC"/>
+            <w:tcMar>
+              <w:top w:w="70" w:type="dxa"/>
+              <w:bottom w:w="70" w:type="dxa"/>
+              <w:left w:w="120" w:type="dxa"/>
+              <w:right w:w="60" w:type="dxa"/>
+            </w:tcMar>
+            <w:tcW w:w="1440" w:type="dxa"/>
+          </w:tcPr>
+          <w:p>
+            <w:r>
+              <w:rPr>
+                <w:b/>
+                <w:color w:val="142233"/>
+                <w:sz w:val="18"/>
+              </w:rPr>
+              <w:t>Rolle</w:t>
+            </w:r>
+          </w:p>
+        </w:tc>
+        <w:tc>
+          <w:tcPr>
+            <w:tcW w:type="dxa" w:w="4306"/>
+            <w:shd w:val="clear" w:color="auto" w:fill="F5F0FC"/>
+            <w:tcMar>
+              <w:top w:w="70" w:type="dxa"/>
+              <w:bottom w:w="70" w:type="dxa"/>
+              <w:left w:w="60" w:type="dxa"/>
+              <w:right w:w="120" w:type="dxa"/>
+            </w:tcMar>
+            <w:tcW w:w="7920" w:type="dxa"/>
+          </w:tcPr>
+          <w:p>
+            <w:r>
+              <w:rPr>
+                <w:sz w:val="18"/>
+              </w:rPr>
+              <w:t>Phase 1 Awareness: Geschichte und Emotion. Phase 2 Conversion: klarer CTA ab CHF 50.</w:t>
+            </w:r>
+          </w:p>
+        </w:tc>
+      </w:tr>
+      <w:tr>
+        <w:tc>
+          <w:tcPr>
+            <w:tcW w:type="dxa" w:w="4306"/>
+            <w:shd w:val="clear" w:color="auto" w:fill="EEE8F7"/>
+            <w:tcMar>
+              <w:top w:w="70" w:type="dxa"/>
+              <w:bottom w:w="70" w:type="dxa"/>
+              <w:left w:w="120" w:type="dxa"/>
+              <w:right w:w="60" w:type="dxa"/>
+            </w:tcMar>
+            <w:tcW w:w="1440" w:type="dxa"/>
+          </w:tcPr>
+          <w:p>
+            <w:r>
+              <w:rPr>
+                <w:b/>
+                <w:color w:val="142233"/>
+                <w:sz w:val="18"/>
+              </w:rPr>
+              <w:t>Warum wichtig</w:t>
+            </w:r>
+          </w:p>
+        </w:tc>
+        <w:tc>
+          <w:tcPr>
+            <w:tcW w:type="dxa" w:w="4306"/>
+            <w:shd w:val="clear" w:color="auto" w:fill="EEE8F7"/>
+            <w:tcMar>
+              <w:top w:w="70" w:type="dxa"/>
+              <w:bottom w:w="70" w:type="dxa"/>
+              <w:left w:w="60" w:type="dxa"/>
+              <w:right w:w="120" w:type="dxa"/>
+            </w:tcMar>
+            <w:tcW w:w="7920" w:type="dxa"/>
+          </w:tcPr>
+          <w:p>
+            <w:r>
+              <w:rPr>
+                <w:sz w:val="18"/>
+              </w:rPr>
+              <w:t>LinkedIn + Meta erreichen unterschiedliche Schichten der Zielgruppe — parallel möglich</w:t>
+            </w:r>
+          </w:p>
+        </w:tc>
+      </w:tr>
+    </w:tbl>
+    <w:p/>
+    <w:p>
+      <w:pPr>
+        <w:spacing w:before="200" w:after="40"/>
+      </w:pPr>
+      <w:r>
+        <w:rPr>
+          <w:b/>
+          <w:color w:val="4B319B"/>
+          <w:sz w:val="20"/>
+        </w:rPr>
+        <w:t xml:space="preserve">Folie 10  </w:t>
+      </w:r>
+      <w:r>
+        <w:rPr>
+          <w:b/>
+          <w:color w:val="142233"/>
+          <w:sz w:val="20"/>
+        </w:rPr>
+        <w:t>— MOURNIVAL — UNSERE ROLLE</w:t>
       </w:r>
     </w:p>
     <w:p>
       <w:pPr>
-        <w:pStyle w:val="ListBullet"/>
         <w:spacing w:after="60"/>
       </w:pPr>
       <w:r>
         <w:rPr>
-          <w:rFonts w:ascii="Calibri" w:hAnsi="Calibri"/>
-          <w:b w:val="0"/>
-          <w:i w:val="0"/>
-          <w:color w:val="333333"/>
-          <w:sz w:val="21"/>
+          <w:i/>
+          <w:color w:val="888888"/>
+          <w:sz w:val="18"/>
         </w:rPr>
-        <w:t>+ Instagram: visueller Tierwohl-Content, Meta-Ads-Synergie</w:t>
+        <w:t>Diese Folie fehlt in klassischen Agenturdeck-Ansätzen. Sie gehört dazu.</w:t>
+      </w:r>
+    </w:p>
+    <w:tbl>
+      <w:tblPr>
+        <w:tblLook w:firstColumn="1" w:firstRow="1" w:lastColumn="0" w:lastRow="0" w:noHBand="0" w:noVBand="1" w:val="04A0"/>
+        <w:tblBorders>
+          <w:top w:val="none"/>
+          <w:left w:val="none"/>
+          <w:bottom w:val="none"/>
+          <w:right w:val="none"/>
+          <w:insideH w:val="none"/>
+          <w:insideV w:val="none"/>
+        </w:tblBorders>
+        <w:tblW w:w="5000" w:type="pct"/>
+      </w:tblPr>
+      <w:tblGrid>
+        <w:gridCol w:w="4306"/>
+        <w:gridCol w:w="4306"/>
+      </w:tblGrid>
+      <w:tr>
+        <w:tc>
+          <w:tcPr>
+            <w:tcW w:type="dxa" w:w="4306"/>
+            <w:shd w:val="clear" w:color="auto" w:fill="EEE8F7"/>
+            <w:tcMar>
+              <w:top w:w="70" w:type="dxa"/>
+              <w:bottom w:w="70" w:type="dxa"/>
+              <w:left w:w="120" w:type="dxa"/>
+              <w:right w:w="60" w:type="dxa"/>
+            </w:tcMar>
+            <w:tcW w:w="1440" w:type="dxa"/>
+          </w:tcPr>
+          <w:p>
+            <w:r>
+              <w:rPr>
+                <w:b/>
+                <w:color w:val="4B319B"/>
+                <w:sz w:val="18"/>
+              </w:rPr>
+              <w:t>Ziel</w:t>
+            </w:r>
+          </w:p>
+        </w:tc>
+        <w:tc>
+          <w:tcPr>
+            <w:tcW w:type="dxa" w:w="4306"/>
+            <w:shd w:val="clear" w:color="auto" w:fill="EEE8F7"/>
+            <w:tcMar>
+              <w:top w:w="70" w:type="dxa"/>
+              <w:bottom w:w="70" w:type="dxa"/>
+              <w:left w:w="60" w:type="dxa"/>
+              <w:right w:w="120" w:type="dxa"/>
+            </w:tcMar>
+            <w:tcW w:w="7920" w:type="dxa"/>
+          </w:tcPr>
+          <w:p>
+            <w:r>
+              <w:rPr>
+                <w:sz w:val="18"/>
+              </w:rPr>
+              <w:t>Kommunikationsstrategie in messbare Ergebnisse übersetzen — kontinuierlich</w:t>
+            </w:r>
+          </w:p>
+        </w:tc>
+      </w:tr>
+      <w:tr>
+        <w:tc>
+          <w:tcPr>
+            <w:tcW w:type="dxa" w:w="4306"/>
+            <w:shd w:val="clear" w:color="auto" w:fill="F5F0FC"/>
+            <w:tcMar>
+              <w:top w:w="70" w:type="dxa"/>
+              <w:bottom w:w="70" w:type="dxa"/>
+              <w:left w:w="120" w:type="dxa"/>
+              <w:right w:w="60" w:type="dxa"/>
+            </w:tcMar>
+            <w:tcW w:w="1440" w:type="dxa"/>
+          </w:tcPr>
+          <w:p>
+            <w:r>
+              <w:rPr>
+                <w:b/>
+                <w:color w:val="4B319B"/>
+                <w:sz w:val="18"/>
+              </w:rPr>
+              <w:t>Rolle</w:t>
+            </w:r>
+          </w:p>
+        </w:tc>
+        <w:tc>
+          <w:tcPr>
+            <w:tcW w:type="dxa" w:w="4306"/>
+            <w:shd w:val="clear" w:color="auto" w:fill="F5F0FC"/>
+            <w:tcMar>
+              <w:top w:w="70" w:type="dxa"/>
+              <w:bottom w:w="70" w:type="dxa"/>
+              <w:left w:w="60" w:type="dxa"/>
+              <w:right w:w="120" w:type="dxa"/>
+            </w:tcMar>
+            <w:tcW w:w="7920" w:type="dxa"/>
+          </w:tcPr>
+          <w:p>
+            <w:r>
+              <w:rPr>
+                <w:sz w:val="18"/>
+              </w:rPr>
+              <w:t>Strategie · Content-Direction · Qualitätskontrolle · Workflow-Optimierung · Messung</w:t>
+            </w:r>
+          </w:p>
+        </w:tc>
+      </w:tr>
+      <w:tr>
+        <w:tc>
+          <w:tcPr>
+            <w:tcW w:type="dxa" w:w="4306"/>
+            <w:shd w:val="clear" w:color="auto" w:fill="EEE8F7"/>
+            <w:tcMar>
+              <w:top w:w="70" w:type="dxa"/>
+              <w:bottom w:w="70" w:type="dxa"/>
+              <w:left w:w="120" w:type="dxa"/>
+              <w:right w:w="60" w:type="dxa"/>
+            </w:tcMar>
+            <w:tcW w:w="1440" w:type="dxa"/>
+          </w:tcPr>
+          <w:p>
+            <w:r>
+              <w:rPr>
+                <w:b/>
+                <w:color w:val="4B319B"/>
+                <w:sz w:val="18"/>
+              </w:rPr>
+              <w:t>Warum wichtig</w:t>
+            </w:r>
+          </w:p>
+        </w:tc>
+        <w:tc>
+          <w:tcPr>
+            <w:tcW w:type="dxa" w:w="4306"/>
+            <w:shd w:val="clear" w:color="auto" w:fill="EEE8F7"/>
+            <w:tcMar>
+              <w:top w:w="70" w:type="dxa"/>
+              <w:bottom w:w="70" w:type="dxa"/>
+              <w:left w:w="60" w:type="dxa"/>
+              <w:right w:w="120" w:type="dxa"/>
+            </w:tcMar>
+            <w:tcW w:w="7920" w:type="dxa"/>
+          </w:tcPr>
+          <w:p>
+            <w:r>
+              <w:rPr>
+                <w:sz w:val="18"/>
+              </w:rPr>
+              <w:t>Beastly braucht eine Agentur die die Marke versteht — nicht nur Kanäle bespielt</w:t>
+            </w:r>
+          </w:p>
+        </w:tc>
+      </w:tr>
+    </w:tbl>
+    <w:p/>
+    <w:p>
+      <w:pPr>
+        <w:spacing w:before="200" w:after="40"/>
+      </w:pPr>
+      <w:r>
+        <w:rPr>
+          <w:b/>
+          <w:color w:val="4B319B"/>
+          <w:sz w:val="20"/>
+        </w:rPr>
+        <w:t xml:space="preserve">Folie 11  </w:t>
+      </w:r>
+      <w:r>
+        <w:rPr>
+          <w:b/>
+          <w:color w:val="142233"/>
+          <w:sz w:val="20"/>
+        </w:rPr>
+        <w:t>— ROADMAP</w:t>
       </w:r>
     </w:p>
     <w:p>
       <w:pPr>
-        <w:pStyle w:val="ListBullet"/>
         <w:spacing w:after="60"/>
       </w:pPr>
       <w:r>
         <w:rPr>
-          <w:rFonts w:ascii="Calibri" w:hAnsi="Calibri"/>
-          <w:b w:val="0"/>
-          <w:i w:val="0"/>
-          <w:color w:val="333333"/>
-          <w:sz w:val="21"/>
+          <w:i/>
+          <w:color w:val="888888"/>
+          <w:sz w:val="18"/>
         </w:rPr>
-        <w:t>+ TikTok: Persönlichkeit, Gesichter, authentische Formate</w:t>
+        <w:t>Drei Phasen. Fundament vor Sichtbarkeit — Sichtbarkeit vor Skalierung.</w:t>
+      </w:r>
+    </w:p>
+    <w:tbl>
+      <w:tblPr>
+        <w:tblLook w:firstColumn="1" w:firstRow="1" w:lastColumn="0" w:lastRow="0" w:noHBand="0" w:noVBand="1" w:val="04A0"/>
+        <w:tblBorders>
+          <w:top w:val="none"/>
+          <w:left w:val="none"/>
+          <w:bottom w:val="none"/>
+          <w:right w:val="none"/>
+          <w:insideH w:val="none"/>
+          <w:insideV w:val="none"/>
+        </w:tblBorders>
+        <w:tblW w:w="5000" w:type="pct"/>
+      </w:tblPr>
+      <w:tblGrid>
+        <w:gridCol w:w="8612"/>
+      </w:tblGrid>
+      <w:tr>
+        <w:tc>
+          <w:tcPr>
+            <w:tcW w:type="dxa" w:w="8612"/>
+            <w:shd w:val="clear" w:color="auto" w:fill="4b319b"/>
+            <w:tcMar>
+              <w:top w:w="80" w:type="dxa"/>
+              <w:bottom w:w="80" w:type="dxa"/>
+              <w:left w:w="120" w:type="dxa"/>
+              <w:right w:w="120" w:type="dxa"/>
+            </w:tcMar>
+          </w:tcPr>
+          <w:p>
+            <w:r>
+              <w:rPr>
+                <w:b/>
+                <w:color w:val="FFFFFF"/>
+                <w:sz w:val="18"/>
+              </w:rPr>
+              <w:t>PHASE 1 — Fundament (Monate 0–3)</w:t>
+            </w:r>
+          </w:p>
+        </w:tc>
+      </w:tr>
+      <w:tr>
+        <w:tc>
+          <w:tcPr>
+            <w:tcW w:type="dxa" w:w="8612"/>
+            <w:shd w:val="clear" w:color="auto" w:fill="F5F0FC"/>
+            <w:tcMar>
+              <w:top w:w="60" w:type="dxa"/>
+              <w:bottom w:w="60" w:type="dxa"/>
+              <w:left w:w="120" w:type="dxa"/>
+              <w:right w:w="120" w:type="dxa"/>
+            </w:tcMar>
+          </w:tcPr>
+          <w:p>
+            <w:r>
+              <w:rPr>
+                <w:sz w:val="18"/>
+              </w:rPr>
+              <w:t>—  Website live + erstes Pitch Deck druckbereit</w:t>
+            </w:r>
+          </w:p>
+        </w:tc>
+      </w:tr>
+      <w:tr>
+        <w:tc>
+          <w:tcPr>
+            <w:tcW w:type="dxa" w:w="8612"/>
+            <w:shd w:val="clear" w:color="auto" w:fill="F5F0FC"/>
+            <w:tcMar>
+              <w:top w:w="60" w:type="dxa"/>
+              <w:bottom w:w="60" w:type="dxa"/>
+              <w:left w:w="120" w:type="dxa"/>
+              <w:right w:w="120" w:type="dxa"/>
+            </w:tcMar>
+          </w:tcPr>
+          <w:p>
+            <w:r>
+              <w:rPr>
+                <w:sz w:val="18"/>
+              </w:rPr>
+              <w:t>—  Viktor LinkedIn: aktiv, 2–3 Posts/Woche, Grundstimmung aufbauen</w:t>
+            </w:r>
+          </w:p>
+        </w:tc>
+      </w:tr>
+      <w:tr>
+        <w:tc>
+          <w:tcPr>
+            <w:tcW w:type="dxa" w:w="8612"/>
+            <w:shd w:val="clear" w:color="auto" w:fill="F5F0FC"/>
+            <w:tcMar>
+              <w:top w:w="60" w:type="dxa"/>
+              <w:bottom w:w="60" w:type="dxa"/>
+              <w:left w:w="120" w:type="dxa"/>
+              <w:right w:w="120" w:type="dxa"/>
+            </w:tcMar>
+          </w:tcPr>
+          <w:p>
+            <w:r>
+              <w:rPr>
+                <w:sz w:val="18"/>
+              </w:rPr>
+              <w:t>—  Beastly-Profil aufgesetzt, Brand-Design angewendet</w:t>
+            </w:r>
+          </w:p>
+        </w:tc>
+      </w:tr>
+    </w:tbl>
+    <w:p/>
+    <w:tbl>
+      <w:tblPr>
+        <w:tblLook w:firstColumn="1" w:firstRow="1" w:lastColumn="0" w:lastRow="0" w:noHBand="0" w:noVBand="1" w:val="04A0"/>
+        <w:tblBorders>
+          <w:top w:val="none"/>
+          <w:left w:val="none"/>
+          <w:bottom w:val="none"/>
+          <w:right w:val="none"/>
+          <w:insideH w:val="none"/>
+          <w:insideV w:val="none"/>
+        </w:tblBorders>
+        <w:tblW w:w="5000" w:type="pct"/>
+      </w:tblPr>
+      <w:tblGrid>
+        <w:gridCol w:w="8612"/>
+      </w:tblGrid>
+      <w:tr>
+        <w:tc>
+          <w:tcPr>
+            <w:tcW w:type="dxa" w:w="8612"/>
+            <w:shd w:val="clear" w:color="auto" w:fill="142233"/>
+            <w:tcMar>
+              <w:top w:w="80" w:type="dxa"/>
+              <w:bottom w:w="80" w:type="dxa"/>
+              <w:left w:w="120" w:type="dxa"/>
+              <w:right w:w="120" w:type="dxa"/>
+            </w:tcMar>
+          </w:tcPr>
+          <w:p>
+            <w:r>
+              <w:rPr>
+                <w:b/>
+                <w:color w:val="FFFFFF"/>
+                <w:sz w:val="18"/>
+              </w:rPr>
+              <w:t>PHASE 2 — Sichtbarkeit (Monate 3–6)</w:t>
+            </w:r>
+          </w:p>
+        </w:tc>
+      </w:tr>
+      <w:tr>
+        <w:tc>
+          <w:tcPr>
+            <w:tcW w:type="dxa" w:w="8612"/>
+            <w:shd w:val="clear" w:color="auto" w:fill="F5F0FC"/>
+            <w:tcMar>
+              <w:top w:w="60" w:type="dxa"/>
+              <w:bottom w:w="60" w:type="dxa"/>
+              <w:left w:w="120" w:type="dxa"/>
+              <w:right w:w="120" w:type="dxa"/>
+            </w:tcMar>
+          </w:tcPr>
+          <w:p>
+            <w:r>
+              <w:rPr>
+                <w:sz w:val="18"/>
+              </w:rPr>
+              <w:t>—  Organischer Content-Rhythmus etabliert, erste Insights auswerten</w:t>
+            </w:r>
+          </w:p>
+        </w:tc>
+      </w:tr>
+      <w:tr>
+        <w:tc>
+          <w:tcPr>
+            <w:tcW w:type="dxa" w:w="8612"/>
+            <w:shd w:val="clear" w:color="auto" w:fill="F5F0FC"/>
+            <w:tcMar>
+              <w:top w:w="60" w:type="dxa"/>
+              <w:bottom w:w="60" w:type="dxa"/>
+              <w:left w:w="120" w:type="dxa"/>
+              <w:right w:w="120" w:type="dxa"/>
+            </w:tcMar>
+          </w:tcPr>
+          <w:p>
+            <w:r>
+              <w:rPr>
+                <w:sz w:val="18"/>
+              </w:rPr>
+              <w:t>—  Awareness-Ads geschaltet (LinkedIn + Meta), Grundrauschen messbar</w:t>
+            </w:r>
+          </w:p>
+        </w:tc>
+      </w:tr>
+      <w:tr>
+        <w:tc>
+          <w:tcPr>
+            <w:tcW w:type="dxa" w:w="8612"/>
+            <w:shd w:val="clear" w:color="auto" w:fill="F5F0FC"/>
+            <w:tcMar>
+              <w:top w:w="60" w:type="dxa"/>
+              <w:bottom w:w="60" w:type="dxa"/>
+              <w:left w:w="120" w:type="dxa"/>
+              <w:right w:w="120" w:type="dxa"/>
+            </w:tcMar>
+          </w:tcPr>
+          <w:p>
+            <w:r>
+              <w:rPr>
+                <w:sz w:val="18"/>
+              </w:rPr>
+              <w:t>—  Newsletter-Setup: Technologie + erster Inhalt</w:t>
+            </w:r>
+          </w:p>
+        </w:tc>
+      </w:tr>
+    </w:tbl>
+    <w:p/>
+    <w:tbl>
+      <w:tblPr>
+        <w:tblLook w:firstColumn="1" w:firstRow="1" w:lastColumn="0" w:lastRow="0" w:noHBand="0" w:noVBand="1" w:val="04A0"/>
+        <w:tblBorders>
+          <w:top w:val="none"/>
+          <w:left w:val="none"/>
+          <w:bottom w:val="none"/>
+          <w:right w:val="none"/>
+          <w:insideH w:val="none"/>
+          <w:insideV w:val="none"/>
+        </w:tblBorders>
+        <w:tblW w:w="5000" w:type="pct"/>
+      </w:tblPr>
+      <w:tblGrid>
+        <w:gridCol w:w="8612"/>
+      </w:tblGrid>
+      <w:tr>
+        <w:tc>
+          <w:tcPr>
+            <w:tcW w:type="dxa" w:w="8612"/>
+            <w:shd w:val="clear" w:color="auto" w:fill="BD5435"/>
+            <w:tcMar>
+              <w:top w:w="80" w:type="dxa"/>
+              <w:bottom w:w="80" w:type="dxa"/>
+              <w:left w:w="120" w:type="dxa"/>
+              <w:right w:w="120" w:type="dxa"/>
+            </w:tcMar>
+          </w:tcPr>
+          <w:p>
+            <w:r>
+              <w:rPr>
+                <w:b/>
+                <w:color w:val="FFFFFF"/>
+                <w:sz w:val="18"/>
+              </w:rPr>
+              <w:t>PHASE 3 — Skalierung (ab Monat 6)</w:t>
+            </w:r>
+          </w:p>
+        </w:tc>
+      </w:tr>
+      <w:tr>
+        <w:tc>
+          <w:tcPr>
+            <w:tcW w:type="dxa" w:w="8612"/>
+            <w:shd w:val="clear" w:color="auto" w:fill="F5F0FC"/>
+            <w:tcMar>
+              <w:top w:w="60" w:type="dxa"/>
+              <w:bottom w:w="60" w:type="dxa"/>
+              <w:left w:w="120" w:type="dxa"/>
+              <w:right w:w="120" w:type="dxa"/>
+            </w:tcMar>
+          </w:tcPr>
+          <w:p>
+            <w:r>
+              <w:rPr>
+                <w:sz w:val="18"/>
+              </w:rPr>
+              <w:t>—  Conversion-Ads live basierend auf Awareness-Erkenntnissen</w:t>
+            </w:r>
+          </w:p>
+        </w:tc>
+      </w:tr>
+      <w:tr>
+        <w:tc>
+          <w:tcPr>
+            <w:tcW w:type="dxa" w:w="8612"/>
+            <w:shd w:val="clear" w:color="auto" w:fill="F5F0FC"/>
+            <w:tcMar>
+              <w:top w:w="60" w:type="dxa"/>
+              <w:bottom w:w="60" w:type="dxa"/>
+              <w:left w:w="120" w:type="dxa"/>
+              <w:right w:w="120" w:type="dxa"/>
+            </w:tcMar>
+          </w:tcPr>
+          <w:p>
+            <w:r>
+              <w:rPr>
+                <w:sz w:val="18"/>
+              </w:rPr>
+              <w:t>—  Analytics und fortlaufende Optimierung</w:t>
+            </w:r>
+          </w:p>
+        </w:tc>
+      </w:tr>
+      <w:tr>
+        <w:tc>
+          <w:tcPr>
+            <w:tcW w:type="dxa" w:w="8612"/>
+            <w:shd w:val="clear" w:color="auto" w:fill="F5F0FC"/>
+            <w:tcMar>
+              <w:top w:w="60" w:type="dxa"/>
+              <w:bottom w:w="60" w:type="dxa"/>
+              <w:left w:w="120" w:type="dxa"/>
+              <w:right w:w="120" w:type="dxa"/>
+            </w:tcMar>
+          </w:tcPr>
+          <w:p>
+            <w:r>
+              <w:rPr>
+                <w:sz w:val="18"/>
+              </w:rPr>
+              <w:t>—  Zweiter Kanal (Instagram oder TikTok) hinzunehmen, wenn Kapazität vorhanden</w:t>
+            </w:r>
+          </w:p>
+        </w:tc>
+      </w:tr>
+    </w:tbl>
+    <w:p/>
+    <w:p>
+      <w:pPr>
+        <w:spacing w:before="200" w:after="40"/>
+      </w:pPr>
+      <w:r>
+        <w:rPr>
+          <w:b/>
+          <w:color w:val="4B319B"/>
+          <w:sz w:val="20"/>
+        </w:rPr>
+        <w:t xml:space="preserve">Folie 12  </w:t>
+      </w:r>
+      <w:r>
+        <w:rPr>
+          <w:b/>
+          <w:color w:val="142233"/>
+          <w:sz w:val="20"/>
+        </w:rPr>
+        <w:t>— DISKUSSION — EURE GEDANKEN</w:t>
       </w:r>
     </w:p>
     <w:p>
       <w:pPr>
-        <w:pStyle w:val="ListBullet"/>
         <w:spacing w:after="60"/>
       </w:pPr>
       <w:r>
         <w:rPr>
-          <w:rFonts w:ascii="Calibri" w:hAnsi="Calibri"/>
-          <w:b w:val="0"/>
-          <w:i w:val="0"/>
-          <w:color w:val="333333"/>
-          <w:sz w:val="21"/>
+          <w:i/>
+          <w:color w:val="888888"/>
+          <w:sz w:val="18"/>
         </w:rPr>
-        <w:t>Kombination nach Ressourcen wählen — nicht alle Kanäle gleichzeitig</w:t>
+        <w:t>Keine «Danke»-Folie. Sondern eine Einladung. Das Gespräch ist das Ziel.</w:t>
       </w:r>
     </w:p>
     <w:p>
       <w:pPr>
-        <w:spacing w:after="40"/>
-      </w:pPr>
-    </w:p>
-    <w:p>
-      <w:pPr>
-        <w:spacing w:before="240" w:after="80"/>
+        <w:spacing w:after="20"/>
       </w:pPr>
       <w:r>
         <w:rPr>
-          <w:rFonts w:ascii="Calibri" w:hAnsi="Calibri"/>
-          <w:b/>
-          <w:i w:val="0"/>
-          <w:color w:val="1A1033"/>
-          <w:sz w:val="24"/>
+          <w:sz w:val="18"/>
         </w:rPr>
-        <w:t>Folie 6 — Persönliche Einschätzung</w:t>
+        <w:t>—  Welche Gedanken habt ihr?</w:t>
       </w:r>
     </w:p>
     <w:p>
       <w:pPr>
-        <w:pStyle w:val="ListBullet"/>
-        <w:spacing w:after="60"/>
+        <w:spacing w:after="20"/>
       </w:pPr>
       <w:r>
         <w:rPr>
-          <w:rFonts w:ascii="Calibri" w:hAnsi="Calibri"/>
-          <w:b w:val="0"/>
-          <w:i w:val="0"/>
-          <w:color w:val="333333"/>
-          <w:sz w:val="21"/>
+          <w:sz w:val="18"/>
         </w:rPr>
-        <w:t>Solider Startpunkt: starke Gründerüberzeugung, relevante Nische</w:t>
+        <w:t>—  Was ergänzt ihr?</w:t>
       </w:r>
     </w:p>
     <w:p>
       <w:pPr>
-        <w:pStyle w:val="ListBullet"/>
-        <w:spacing w:after="60"/>
+        <w:spacing w:after="20"/>
       </w:pPr>
       <w:r>
         <w:rPr>
-          <w:rFonts w:ascii="Calibri" w:hAnsi="Calibri"/>
-          <w:b w:val="0"/>
-          <w:i w:val="0"/>
-          <w:color w:val="333333"/>
-          <w:sz w:val="21"/>
+          <w:sz w:val="18"/>
         </w:rPr>
-        <w:t>Hohe Kommunikationskomplexität: 3 Ebenen, 2 Zielgruppen, 1 Missverständnis</w:t>
+        <w:t>—  Wo seht ihr Chancen?</w:t>
       </w:r>
-    </w:p>
-    <w:p>
-      <w:pPr>
-        <w:pStyle w:val="ListBullet"/>
-        <w:spacing w:after="60"/>
-      </w:pPr>
-      <w:r>
-        <w:rPr>
-          <w:rFonts w:ascii="Calibri" w:hAnsi="Calibri"/>
-          <w:b w:val="0"/>
-          <w:i w:val="0"/>
-          <w:color w:val="333333"/>
-          <w:sz w:val="21"/>
-        </w:rPr>
-        <w:t>«Die Idee ist stark — die Herausforderung ist Dosierung, Führung, Übersetzung»</w:t>
-      </w:r>
-    </w:p>
-    <w:p>
-      <w:pPr>
-        <w:pStyle w:val="ListBullet"/>
-        <w:spacing w:after="60"/>
-      </w:pPr>
-      <w:r>
-        <w:rPr>
-          <w:rFonts w:ascii="Calibri" w:hAnsi="Calibri"/>
-          <w:b w:val="0"/>
-          <w:i w:val="0"/>
-          <w:color w:val="333333"/>
-          <w:sz w:val="21"/>
-        </w:rPr>
-        <w:t>Transparent sein, ohne zu überladen. Emotion wecken, ohne aktivistisch zu wirken.</w:t>
-      </w:r>
-    </w:p>
-    <w:p>
-      <w:pPr>
-        <w:spacing w:after="40"/>
-      </w:pPr>
-    </w:p>
-    <w:p>
-      <w:pPr>
-        <w:spacing w:before="240" w:after="80"/>
-      </w:pPr>
-      <w:r>
-        <w:rPr>
-          <w:rFonts w:ascii="Calibri" w:hAnsi="Calibri"/>
-          <w:b/>
-          <w:i w:val="0"/>
-          <w:color w:val="1A1033"/>
-          <w:sz w:val="24"/>
-        </w:rPr>
-        <w:t>Folie 7 — Empfehlung</w:t>
-      </w:r>
-    </w:p>
-    <w:p>
-      <w:pPr>
-        <w:pStyle w:val="ListBullet"/>
-        <w:spacing w:after="60"/>
-      </w:pPr>
-      <w:r>
-        <w:rPr>
-          <w:rFonts w:ascii="Calibri" w:hAnsi="Calibri"/>
-          <w:b w:val="0"/>
-          <w:i w:val="0"/>
-          <w:color w:val="333333"/>
-          <w:sz w:val="21"/>
-        </w:rPr>
-        <w:t>Externe CMO-Funktion: führen, challengen, übersetzen, entlasten</w:t>
-      </w:r>
-    </w:p>
-    <w:p>
-      <w:pPr>
-        <w:pStyle w:val="ListBullet"/>
-        <w:spacing w:after="60"/>
-      </w:pPr>
-      <w:r>
-        <w:rPr>
-          <w:rFonts w:ascii="Calibri" w:hAnsi="Calibri"/>
-          <w:b w:val="0"/>
-          <w:i w:val="0"/>
-          <w:color w:val="333333"/>
-          <w:sz w:val="21"/>
-        </w:rPr>
-        <w:t>Voraussetzung: Rollen, Entscheidungswege, Zuständigkeiten klären</w:t>
-      </w:r>
-    </w:p>
-    <w:p>
-      <w:pPr>
-        <w:pStyle w:val="ListBullet"/>
-        <w:spacing w:after="60"/>
-      </w:pPr>
-      <w:r>
-        <w:rPr>
-          <w:rFonts w:ascii="Calibri" w:hAnsi="Calibri"/>
-          <w:b w:val="0"/>
-          <w:i w:val="0"/>
-          <w:color w:val="333333"/>
-          <w:sz w:val="21"/>
-        </w:rPr>
-        <w:t>1322 ist grundsätzlich interessiert, diesen Weg zu begleiten</w:t>
-      </w:r>
-    </w:p>
-    <w:p>
-      <w:pPr>
-        <w:pStyle w:val="ListBullet"/>
-        <w:spacing w:after="60"/>
-      </w:pPr>
-      <w:r>
-        <w:rPr>
-          <w:rFonts w:ascii="Calibri" w:hAnsi="Calibri"/>
-          <w:b w:val="0"/>
-          <w:i w:val="0"/>
-          <w:color w:val="333333"/>
-          <w:sz w:val="21"/>
-        </w:rPr>
-        <w:t>Die Vision braucht Nähe zum Gründer. Die Umsetzung braucht klare Entscheidungswege.</w:t>
-      </w:r>
-    </w:p>
-    <w:p>
-      <w:pPr>
-        <w:spacing w:after="40"/>
-      </w:pPr>
-    </w:p>
-    <w:p>
-      <w:pPr>
-        <w:spacing w:before="240" w:after="80"/>
-      </w:pPr>
-      <w:r>
-        <w:rPr>
-          <w:rFonts w:ascii="Calibri" w:hAnsi="Calibri"/>
-          <w:b/>
-          <w:i w:val="0"/>
-          <w:color w:val="1A1033"/>
-          <w:sz w:val="24"/>
-        </w:rPr>
-        <w:t>Folie 8 — Mögliche Einstiege</w:t>
-      </w:r>
-    </w:p>
-    <w:p>
-      <w:pPr>
-        <w:pStyle w:val="ListBullet"/>
-        <w:spacing w:after="60"/>
-      </w:pPr>
-      <w:r>
-        <w:rPr>
-          <w:rFonts w:ascii="Calibri" w:hAnsi="Calibri"/>
-          <w:b w:val="0"/>
-          <w:i w:val="0"/>
-          <w:color w:val="333333"/>
-          <w:sz w:val="21"/>
-        </w:rPr>
-        <w:t>Option A: Fundament zuerst (Markenarchitektur → Botschaften → Visuals → Kanäle)</w:t>
-      </w:r>
-    </w:p>
-    <w:p>
-      <w:pPr>
-        <w:pStyle w:val="ListBullet"/>
-        <w:spacing w:after="60"/>
-      </w:pPr>
-      <w:r>
-        <w:rPr>
-          <w:rFonts w:ascii="Calibri" w:hAnsi="Calibri"/>
-          <w:b w:val="0"/>
-          <w:i w:val="0"/>
-          <w:color w:val="333333"/>
-          <w:sz w:val="21"/>
-        </w:rPr>
-        <w:t>Option B: Persönlichkeit zuerst (Viktor LinkedIn sofort starten)</w:t>
-      </w:r>
-    </w:p>
-    <w:p>
-      <w:pPr>
-        <w:pStyle w:val="ListBullet"/>
-        <w:spacing w:after="60"/>
-      </w:pPr>
-      <w:r>
-        <w:rPr>
-          <w:rFonts w:ascii="Calibri" w:hAnsi="Calibri"/>
-          <w:b w:val="0"/>
-          <w:i w:val="0"/>
-          <w:color w:val="333333"/>
-          <w:sz w:val="21"/>
-        </w:rPr>
-        <w:t>Option C: Event-orientiert (September-Anlass als Ankerpunkt)</w:t>
-      </w:r>
-    </w:p>
-    <w:p>
-      <w:pPr>
-        <w:pStyle w:val="ListBullet"/>
-        <w:spacing w:after="60"/>
-      </w:pPr>
-      <w:r>
-        <w:rPr>
-          <w:rFonts w:ascii="Calibri" w:hAnsi="Calibri"/>
-          <w:b w:val="0"/>
-          <w:i w:val="0"/>
-          <w:color w:val="333333"/>
-          <w:sz w:val="21"/>
-        </w:rPr>
-        <w:t>Voraussetzung für alle: Organisatorische Klärung als allererster Schritt</w:t>
-      </w:r>
-    </w:p>
-    <w:p>
-      <w:pPr>
-        <w:spacing w:after="40"/>
-      </w:pPr>
     </w:p>
     <w:sectPr>
       <w:pgSz w:w="12240" w:h="15840"/>

</xml_diff>

<commit_message>
strategy: Folie 1 → VISION (nicht Ausgangslage) [DungeonMasterAlex]
</commit_message>
<xml_diff>
--- a/beastly-investments/strategies/2026-06-24_strategy_beastly-investments.docx
+++ b/beastly-investments/strategies/2026-06-24_strategy_beastly-investments.docx
@@ -6726,7 +6726,7 @@
           <w:color w:val="142233"/>
           <w:sz w:val="20"/>
         </w:rPr>
-        <w:t>— WARUM — Die Ausgangsfrage</w:t>
+        <w:t>— VISION</w:t>
       </w:r>
     </w:p>
     <w:p>
@@ -6739,7 +6739,7 @@
           <w:color w:val="888888"/>
           <w:sz w:val="18"/>
         </w:rPr>
-        <w:t>Nicht mit der Ausgangslage beginnen — sondern mit der Frage, die Beastly stellt.</w:t>
+        <w:t>Wo wollen wir hin? Was ist das Versprechen von Beastly?</w:t>
       </w:r>
     </w:p>
     <w:p>
@@ -6750,7 +6750,7 @@
         <w:rPr>
           <w:sz w:val="18"/>
         </w:rPr>
-        <w:t>—  Tierschutz ist eines der grössten gesellschaftlichen Anliegen. Kapital fliesst dorthin, wo Rendite lockt — aber nicht in Tierschutz. Beastly schafft diesen Kanal.</w:t>
+        <w:t>—  Tierschutz investierbar machen — für jeden, ab CHF 50, ohne Kompromiss bei der Rendite</w:t>
       </w:r>
     </w:p>
     <w:p>
@@ -6761,7 +6761,7 @@
         <w:rPr>
           <w:sz w:val="18"/>
         </w:rPr>
-        <w:t>—  Viktor und Lydia haben eine Tierklinik in Ägypten gebaut. Daraus wurde ein Investmentfonds.</w:t>
+        <w:t>—  Beweisen, dass eine Investition gleichzeitig das Leben von Tieren verbessern kann</w:t>
       </w:r>
     </w:p>
     <w:p>
@@ -6772,7 +6772,7 @@
         <w:rPr>
           <w:sz w:val="18"/>
         </w:rPr>
-        <w:t>—  Nicht nur ein Fonds. Eine Haltung.</w:t>
+        <w:t>—  Viktor und Lydia als Gründer: Haltung vor Karriere — und ein Fonds der das sichtbar macht</w:t>
       </w:r>
     </w:p>
     <w:p/>

</xml_diff>